<commit_message>
docs(activity): leisure/performance colloquial wording, re-ingest 6 chunks, 10 new questions Hit@3 8/10; report updated
Co-Authored-By: Claude Sonnet 5.5 <noreply@anthropic.com>
</commit_message>
<xml_diff>
--- a/docs/activity/산출물/벡터DB_GraphDB_구축결과서_활동에이전트_2026-10-14.docx
+++ b/docs/activity/산출물/벡터DB_GraphDB_구축결과서_활동에이전트_2026-10-14.docx
@@ -4112,7 +4112,7 @@
                 <w:szCs w:val="22"/>
                 <w:rtl w:val="0"/>
               </w:rPr>
-              <w:t xml:space="preserve">20문항 시험(공식 자료 추가 후): 절 단위 Hit@3 12/20 (60%), Hit@1 8/20 (40%), 문서 단위 Hit@3 16/20 (80%). 기본 코퍼스 7문항 시험은 5/6</w:t>
+              <w:t xml:space="preserve">20문항 시험(공식 자료 추가 후): 절 단위 Hit@3 12/20 (60%), Hit@1 8/20 (40%), 문서 단위 Hit@3 16/20 (80%). 레저·공연 문서에 구어체 표현을 반영한 뒤 새 질문 10문항: Hit@3 8/10, Hit@1 4/10. 기본 코퍼스 7문항 시험은 5/6</w:t>
             </w:r>
           </w:p>
         </w:tc>
@@ -4200,7 +4200,7 @@
                 <w:szCs w:val="22"/>
                 <w:rtl w:val="0"/>
               </w:rPr>
-              <w:t xml:space="preserve">질문 20건 수동 시험(정답 절을 결과 확인 전에 지정, 아래 4장 표). 표본이 작아 방향성만 본다</w:t>
+              <w:t xml:space="preserve">질문 20건 + 개선 후 새 질문 10건 수동 시험(정답 절을 결과 확인 전에 지정, 아래 4장 표). 표본이 작아 방향성만 본다</w:t>
             </w:r>
           </w:p>
         </w:tc>
@@ -17063,6 +17063,2580 @@
     </w:tbl>
     <w:p>
       <w:pPr>
+        <w:spacing w:after="240" w:before="240" w:lineRule="auto"/>
+        <w:ind w:left="720" w:firstLine="0"/>
+        <w:rPr>
+          <w:rFonts w:ascii="Malgun Gothic" w:cs="Malgun Gothic" w:eastAsia="Malgun Gothic" w:hAnsi="Malgun Gothic"/>
+          <w:b w:val="0"/>
+          <w:bCs w:val="0"/>
+        </w:rPr>
+      </w:pPr>
+      <w:r>
+        <w:rPr>
+          <w:rFonts w:ascii="Malgun Gothic" w:cs="Malgun Gothic" w:eastAsia="Malgun Gothic" w:hAnsi="Malgun Gothic"/>
+          <w:color w:val="0000ff"/>
+          <w:rtl w:val="0"/>
+        </w:rPr>
+        <w:t xml:space="preserve">개선 후 새 질문 10문항 — 레저·공연 문서(travel_ext 03)에 일상 표현(리프트, 수강권, 콘서트 등)을 반영하고 6청크를 재적재한 뒤, 이전 20문항과 겹치지 않는 새 질문으로 측정(2026-10-14). 절 단위 8/10, 1위 4/10. N01·N08은 정답이 3위, N03·N07은 미적중이다. 질문 구성이 달라(레저·공연 8, 대조 2) 20문항 결과와 직접 비교할 수 없다.</w:t>
+      </w:r>
+    </w:p>
+    <w:tbl>
+      <w:tblPr>
+        <w:tblStyle w:val="Table8"/>
+        <w:tblW w:w="9865.0" w:type="dxa"/>
+        <w:jc w:val="center"/>
+        <w:tblBorders>
+          <w:top w:color="808080" w:space="0" w:sz="7" w:val="single"/>
+          <w:left w:color="808080" w:space="0" w:sz="7" w:val="single"/>
+          <w:bottom w:color="808080" w:space="0" w:sz="7" w:val="single"/>
+          <w:right w:color="808080" w:space="0" w:sz="7" w:val="single"/>
+          <w:insideH w:color="808080" w:space="0" w:sz="7" w:val="single"/>
+          <w:insideV w:color="808080" w:space="0" w:sz="7" w:val="single"/>
+        </w:tblBorders>
+        <w:tblLayout w:type="fixed"/>
+        <w:tblLook w:val="0600"/>
+      </w:tblPr>
+      <w:tblGrid>
+        <w:gridCol w:w="1700"/>
+        <w:gridCol w:w="2570"/>
+        <w:gridCol w:w="1100"/>
+        <w:gridCol w:w="1070"/>
+        <w:gridCol w:w="3425"/>
+        <w:tblGridChange w:id="0">
+          <w:tblGrid>
+            <w:gridCol w:w="1700"/>
+            <w:gridCol w:w="2570"/>
+            <w:gridCol w:w="1100"/>
+            <w:gridCol w:w="1070"/>
+            <w:gridCol w:w="3425"/>
+          </w:tblGrid>
+        </w:tblGridChange>
+      </w:tblGrid>
+      <w:tr>
+        <w:trPr>
+          <w:cantSplit w:val="0"/>
+          <w:trHeight w:val="566.9291338582677" w:hRule="atLeast"/>
+          <w:tblHeader w:val="0"/>
+        </w:trPr>
+        <w:tc>
+          <w:tcPr>
+            <w:tcBorders>
+              <w:top w:color="808080" w:space="0" w:sz="7" w:val="single"/>
+              <w:left w:color="808080" w:space="0" w:sz="7" w:val="single"/>
+              <w:bottom w:color="808080" w:space="0" w:sz="7" w:val="single"/>
+              <w:right w:color="808080" w:space="0" w:sz="7" w:val="single"/>
+            </w:tcBorders>
+            <w:shd w:fill="cfe2f3" w:val="clear"/>
+            <w:tcMar>
+              <w:top w:w="0.0" w:type="dxa"/>
+              <w:left w:w="0.0" w:type="dxa"/>
+              <w:bottom w:w="0.0" w:type="dxa"/>
+              <w:right w:w="0.0" w:type="dxa"/>
+            </w:tcMar>
+            <w:vAlign w:val="center"/>
+          </w:tcPr>
+          <w:p>
+            <w:pPr>
+              <w:pStyle w:val="Heading3"/>
+              <w:keepNext w:val="0"/>
+              <w:keepLines w:val="0"/>
+              <w:spacing w:after="0" w:before="0" w:line="240" w:lineRule="auto"/>
+              <w:jc w:val="center"/>
+              <w:rPr>
+                <w:rFonts w:ascii="Malgun Gothic" w:cs="Malgun Gothic" w:eastAsia="Malgun Gothic" w:hAnsi="Malgun Gothic"/>
+                <w:b w:val="1"/>
+                <w:bCs w:val="1"/>
+                <w:color w:val="000000"/>
+                <w:sz w:val="22"/>
+                <w:szCs w:val="22"/>
+              </w:rPr>
+            </w:pPr>
+            <w:bookmarkStart w:colFirst="0" w:colLast="0" w:name="_d6fu8zjuee0s" w:id="1"/>
+            <w:bookmarkEnd w:id="1"/>
+            <w:r>
+              <w:rPr>
+                <w:rFonts w:ascii="Malgun Gothic" w:cs="Malgun Gothic" w:eastAsia="Malgun Gothic" w:hAnsi="Malgun Gothic"/>
+                <w:b w:val="1"/>
+                <w:bCs w:val="1"/>
+                <w:color w:val="000000"/>
+                <w:sz w:val="22"/>
+                <w:szCs w:val="22"/>
+                <w:rtl w:val="0"/>
+              </w:rPr>
+              <w:t xml:space="preserve">ID</w:t>
+            </w:r>
+          </w:p>
+        </w:tc>
+        <w:tc>
+          <w:tcPr>
+            <w:tcBorders>
+              <w:top w:color="808080" w:space="0" w:sz="7" w:val="single"/>
+              <w:left w:color="808080" w:space="0" w:sz="7" w:val="single"/>
+              <w:bottom w:color="808080" w:space="0" w:sz="7" w:val="single"/>
+              <w:right w:color="808080" w:space="0" w:sz="7" w:val="single"/>
+            </w:tcBorders>
+            <w:shd w:fill="cfe2f3" w:val="clear"/>
+            <w:tcMar>
+              <w:top w:w="0.0" w:type="dxa"/>
+              <w:left w:w="0.0" w:type="dxa"/>
+              <w:bottom w:w="0.0" w:type="dxa"/>
+              <w:right w:w="0.0" w:type="dxa"/>
+            </w:tcMar>
+            <w:vAlign w:val="center"/>
+          </w:tcPr>
+          <w:p>
+            <w:pPr>
+              <w:pStyle w:val="Heading3"/>
+              <w:keepNext w:val="0"/>
+              <w:keepLines w:val="0"/>
+              <w:spacing w:after="0" w:before="0" w:line="240" w:lineRule="auto"/>
+              <w:jc w:val="center"/>
+              <w:rPr>
+                <w:rFonts w:ascii="Malgun Gothic" w:cs="Malgun Gothic" w:eastAsia="Malgun Gothic" w:hAnsi="Malgun Gothic"/>
+                <w:b w:val="1"/>
+                <w:bCs w:val="1"/>
+                <w:color w:val="000000"/>
+                <w:sz w:val="22"/>
+                <w:szCs w:val="22"/>
+              </w:rPr>
+            </w:pPr>
+            <w:bookmarkStart w:colFirst="0" w:colLast="0" w:name="_d6fu8zjuee0s" w:id="1"/>
+            <w:bookmarkEnd w:id="1"/>
+            <w:r>
+              <w:rPr>
+                <w:rFonts w:ascii="Malgun Gothic" w:cs="Malgun Gothic" w:eastAsia="Malgun Gothic" w:hAnsi="Malgun Gothic"/>
+                <w:b w:val="1"/>
+                <w:bCs w:val="1"/>
+                <w:color w:val="000000"/>
+                <w:sz w:val="22"/>
+                <w:szCs w:val="22"/>
+                <w:rtl w:val="0"/>
+              </w:rPr>
+              <w:t xml:space="preserve">질문</w:t>
+            </w:r>
+          </w:p>
+        </w:tc>
+        <w:tc>
+          <w:tcPr>
+            <w:tcBorders>
+              <w:top w:color="808080" w:space="0" w:sz="7" w:val="single"/>
+              <w:left w:color="808080" w:space="0" w:sz="7" w:val="single"/>
+              <w:bottom w:color="808080" w:space="0" w:sz="7" w:val="single"/>
+              <w:right w:color="808080" w:space="0" w:sz="7" w:val="single"/>
+            </w:tcBorders>
+            <w:shd w:fill="cfe2f3" w:val="clear"/>
+            <w:tcMar>
+              <w:top w:w="0.0" w:type="dxa"/>
+              <w:left w:w="0.0" w:type="dxa"/>
+              <w:bottom w:w="0.0" w:type="dxa"/>
+              <w:right w:w="0.0" w:type="dxa"/>
+            </w:tcMar>
+            <w:vAlign w:val="center"/>
+          </w:tcPr>
+          <w:p>
+            <w:pPr>
+              <w:pStyle w:val="Heading3"/>
+              <w:keepNext w:val="0"/>
+              <w:keepLines w:val="0"/>
+              <w:spacing w:after="0" w:before="0" w:line="240" w:lineRule="auto"/>
+              <w:jc w:val="center"/>
+              <w:rPr>
+                <w:rFonts w:ascii="Malgun Gothic" w:cs="Malgun Gothic" w:eastAsia="Malgun Gothic" w:hAnsi="Malgun Gothic"/>
+                <w:b w:val="1"/>
+                <w:bCs w:val="1"/>
+                <w:color w:val="000000"/>
+                <w:sz w:val="22"/>
+                <w:szCs w:val="22"/>
+              </w:rPr>
+            </w:pPr>
+            <w:bookmarkStart w:colFirst="0" w:colLast="0" w:name="_d6fu8zjuee0s" w:id="1"/>
+            <w:bookmarkEnd w:id="1"/>
+            <w:r>
+              <w:rPr>
+                <w:rFonts w:ascii="Malgun Gothic" w:cs="Malgun Gothic" w:eastAsia="Malgun Gothic" w:hAnsi="Malgun Gothic"/>
+                <w:b w:val="1"/>
+                <w:bCs w:val="1"/>
+                <w:color w:val="000000"/>
+                <w:sz w:val="22"/>
+                <w:szCs w:val="22"/>
+                <w:rtl w:val="0"/>
+              </w:rPr>
+              <w:t xml:space="preserve">1위 문서 · 절</w:t>
+            </w:r>
+          </w:p>
+        </w:tc>
+        <w:tc>
+          <w:tcPr>
+            <w:tcBorders>
+              <w:top w:color="808080" w:space="0" w:sz="7" w:val="single"/>
+              <w:left w:color="808080" w:space="0" w:sz="7" w:val="single"/>
+              <w:bottom w:color="808080" w:space="0" w:sz="7" w:val="single"/>
+              <w:right w:color="808080" w:space="0" w:sz="7" w:val="single"/>
+            </w:tcBorders>
+            <w:shd w:fill="cfe2f3" w:val="clear"/>
+            <w:tcMar>
+              <w:top w:w="0.0" w:type="dxa"/>
+              <w:left w:w="0.0" w:type="dxa"/>
+              <w:bottom w:w="0.0" w:type="dxa"/>
+              <w:right w:w="0.0" w:type="dxa"/>
+            </w:tcMar>
+            <w:vAlign w:val="center"/>
+          </w:tcPr>
+          <w:p>
+            <w:pPr>
+              <w:pStyle w:val="Heading3"/>
+              <w:keepNext w:val="0"/>
+              <w:keepLines w:val="0"/>
+              <w:spacing w:after="0" w:before="0" w:line="240" w:lineRule="auto"/>
+              <w:jc w:val="center"/>
+              <w:rPr>
+                <w:rFonts w:ascii="Malgun Gothic" w:cs="Malgun Gothic" w:eastAsia="Malgun Gothic" w:hAnsi="Malgun Gothic"/>
+                <w:b w:val="1"/>
+                <w:bCs w:val="1"/>
+                <w:color w:val="000000"/>
+                <w:sz w:val="22"/>
+                <w:szCs w:val="22"/>
+              </w:rPr>
+            </w:pPr>
+            <w:bookmarkStart w:colFirst="0" w:colLast="0" w:name="_d6fu8zjuee0s" w:id="1"/>
+            <w:bookmarkEnd w:id="1"/>
+            <w:r>
+              <w:rPr>
+                <w:rFonts w:ascii="Malgun Gothic" w:cs="Malgun Gothic" w:eastAsia="Malgun Gothic" w:hAnsi="Malgun Gothic"/>
+                <w:b w:val="1"/>
+                <w:bCs w:val="1"/>
+                <w:color w:val="000000"/>
+                <w:sz w:val="22"/>
+                <w:szCs w:val="22"/>
+                <w:rtl w:val="0"/>
+              </w:rPr>
+              <w:t xml:space="preserve">1위 점수</w:t>
+            </w:r>
+          </w:p>
+        </w:tc>
+        <w:tc>
+          <w:tcPr>
+            <w:tcBorders>
+              <w:top w:color="808080" w:space="0" w:sz="7" w:val="single"/>
+              <w:left w:color="808080" w:space="0" w:sz="7" w:val="single"/>
+              <w:bottom w:color="808080" w:space="0" w:sz="7" w:val="single"/>
+              <w:right w:color="808080" w:space="0" w:sz="7" w:val="single"/>
+            </w:tcBorders>
+            <w:shd w:fill="cfe2f3" w:val="clear"/>
+            <w:tcMar>
+              <w:top w:w="0.0" w:type="dxa"/>
+              <w:left w:w="0.0" w:type="dxa"/>
+              <w:bottom w:w="0.0" w:type="dxa"/>
+              <w:right w:w="0.0" w:type="dxa"/>
+            </w:tcMar>
+            <w:vAlign w:val="center"/>
+          </w:tcPr>
+          <w:p>
+            <w:pPr>
+              <w:pStyle w:val="Heading3"/>
+              <w:keepNext w:val="0"/>
+              <w:keepLines w:val="0"/>
+              <w:spacing w:after="0" w:before="0" w:line="240" w:lineRule="auto"/>
+              <w:jc w:val="center"/>
+              <w:rPr>
+                <w:rFonts w:ascii="Malgun Gothic" w:cs="Malgun Gothic" w:eastAsia="Malgun Gothic" w:hAnsi="Malgun Gothic"/>
+                <w:b w:val="1"/>
+                <w:bCs w:val="1"/>
+                <w:color w:val="000000"/>
+                <w:sz w:val="22"/>
+                <w:szCs w:val="22"/>
+              </w:rPr>
+            </w:pPr>
+            <w:bookmarkStart w:colFirst="0" w:colLast="0" w:name="_d6fu8zjuee0s" w:id="1"/>
+            <w:bookmarkEnd w:id="1"/>
+            <w:r>
+              <w:rPr>
+                <w:rFonts w:ascii="Malgun Gothic" w:cs="Malgun Gothic" w:eastAsia="Malgun Gothic" w:hAnsi="Malgun Gothic"/>
+                <w:b w:val="1"/>
+                <w:bCs w:val="1"/>
+                <w:color w:val="000000"/>
+                <w:sz w:val="22"/>
+                <w:szCs w:val="22"/>
+                <w:rtl w:val="0"/>
+              </w:rPr>
+              <w:t xml:space="preserve">판정</w:t>
+            </w:r>
+          </w:p>
+        </w:tc>
+      </w:tr>
+      <w:tr>
+        <w:trPr>
+          <w:cantSplit w:val="0"/>
+          <w:trHeight w:val="566.9291338582677" w:hRule="atLeast"/>
+          <w:tblHeader w:val="0"/>
+        </w:trPr>
+        <w:tc>
+          <w:tcPr>
+            <w:tcBorders>
+              <w:top w:color="808080" w:space="0" w:sz="7" w:val="single"/>
+              <w:left w:color="808080" w:space="0" w:sz="7" w:val="single"/>
+              <w:bottom w:color="808080" w:space="0" w:sz="7" w:val="single"/>
+              <w:right w:color="808080" w:space="0" w:sz="7" w:val="single"/>
+            </w:tcBorders>
+            <w:tcMar>
+              <w:top w:w="0.0" w:type="dxa"/>
+              <w:left w:w="0.0" w:type="dxa"/>
+              <w:bottom w:w="0.0" w:type="dxa"/>
+              <w:right w:w="0.0" w:type="dxa"/>
+            </w:tcMar>
+            <w:vAlign w:val="center"/>
+          </w:tcPr>
+          <w:p>
+            <w:pPr>
+              <w:pStyle w:val="Heading3"/>
+              <w:keepNext w:val="0"/>
+              <w:keepLines w:val="0"/>
+              <w:spacing w:after="0" w:before="0" w:line="240" w:lineRule="auto"/>
+              <w:jc w:val="center"/>
+              <w:rPr>
+                <w:rFonts w:ascii="Malgun Gothic" w:cs="Malgun Gothic" w:eastAsia="Malgun Gothic" w:hAnsi="Malgun Gothic"/>
+                <w:color w:val="0000ff"/>
+                <w:sz w:val="22"/>
+                <w:szCs w:val="22"/>
+              </w:rPr>
+            </w:pPr>
+            <w:bookmarkStart w:colFirst="0" w:colLast="0" w:name="_d6fu8zjuee0s" w:id="1"/>
+            <w:bookmarkEnd w:id="1"/>
+            <w:r>
+              <w:rPr>
+                <w:rFonts w:ascii="Malgun Gothic" w:cs="Malgun Gothic" w:eastAsia="Malgun Gothic" w:hAnsi="Malgun Gothic"/>
+                <w:color w:val="0000ff"/>
+                <w:sz w:val="22"/>
+                <w:szCs w:val="22"/>
+                <w:rtl w:val="0"/>
+              </w:rPr>
+              <w:t xml:space="preserve">N01</w:t>
+            </w:r>
+          </w:p>
+        </w:tc>
+        <w:tc>
+          <w:tcPr>
+            <w:tcBorders>
+              <w:top w:color="808080" w:space="0" w:sz="7" w:val="single"/>
+              <w:left w:color="808080" w:space="0" w:sz="7" w:val="single"/>
+              <w:bottom w:color="808080" w:space="0" w:sz="7" w:val="single"/>
+              <w:right w:color="808080" w:space="0" w:sz="7" w:val="single"/>
+            </w:tcBorders>
+            <w:tcMar>
+              <w:top w:w="0.0" w:type="dxa"/>
+              <w:left w:w="0.0" w:type="dxa"/>
+              <w:bottom w:w="0.0" w:type="dxa"/>
+              <w:right w:w="0.0" w:type="dxa"/>
+            </w:tcMar>
+            <w:vAlign w:val="center"/>
+          </w:tcPr>
+          <w:p>
+            <w:pPr>
+              <w:pStyle w:val="Heading3"/>
+              <w:keepNext w:val="0"/>
+              <w:keepLines w:val="0"/>
+              <w:spacing w:after="0" w:before="0" w:line="240" w:lineRule="auto"/>
+              <w:jc w:val="center"/>
+              <w:rPr>
+                <w:rFonts w:ascii="Malgun Gothic" w:cs="Malgun Gothic" w:eastAsia="Malgun Gothic" w:hAnsi="Malgun Gothic"/>
+                <w:color w:val="0000ff"/>
+                <w:sz w:val="22"/>
+                <w:szCs w:val="22"/>
+              </w:rPr>
+            </w:pPr>
+            <w:bookmarkStart w:colFirst="0" w:colLast="0" w:name="_d6fu8zjuee0s" w:id="1"/>
+            <w:bookmarkEnd w:id="1"/>
+            <w:r>
+              <w:rPr>
+                <w:rFonts w:ascii="Malgun Gothic" w:cs="Malgun Gothic" w:eastAsia="Malgun Gothic" w:hAnsi="Malgun Gothic"/>
+                <w:color w:val="0000ff"/>
+                <w:sz w:val="22"/>
+                <w:szCs w:val="22"/>
+                <w:rtl w:val="0"/>
+              </w:rPr>
+              <w:t xml:space="preserve">리프트가 멈춰서 스키를 못 탔는데 이용권 환불이 되나요?</w:t>
+            </w:r>
+          </w:p>
+        </w:tc>
+        <w:tc>
+          <w:tcPr>
+            <w:tcBorders>
+              <w:top w:color="808080" w:space="0" w:sz="7" w:val="single"/>
+              <w:left w:color="808080" w:space="0" w:sz="7" w:val="single"/>
+              <w:bottom w:color="808080" w:space="0" w:sz="7" w:val="single"/>
+              <w:right w:color="808080" w:space="0" w:sz="7" w:val="single"/>
+            </w:tcBorders>
+            <w:tcMar>
+              <w:top w:w="0.0" w:type="dxa"/>
+              <w:left w:w="0.0" w:type="dxa"/>
+              <w:bottom w:w="0.0" w:type="dxa"/>
+              <w:right w:w="0.0" w:type="dxa"/>
+            </w:tcMar>
+            <w:vAlign w:val="center"/>
+          </w:tcPr>
+          <w:p>
+            <w:pPr>
+              <w:pStyle w:val="Heading3"/>
+              <w:keepNext w:val="0"/>
+              <w:keepLines w:val="0"/>
+              <w:spacing w:after="0" w:before="0" w:line="240" w:lineRule="auto"/>
+              <w:jc w:val="center"/>
+              <w:rPr>
+                <w:rFonts w:ascii="Malgun Gothic" w:cs="Malgun Gothic" w:eastAsia="Malgun Gothic" w:hAnsi="Malgun Gothic"/>
+                <w:color w:val="0000ff"/>
+                <w:sz w:val="22"/>
+                <w:szCs w:val="22"/>
+              </w:rPr>
+            </w:pPr>
+            <w:bookmarkStart w:colFirst="0" w:colLast="0" w:name="_d6fu8zjuee0s" w:id="1"/>
+            <w:bookmarkEnd w:id="1"/>
+            <w:r>
+              <w:rPr>
+                <w:rFonts w:ascii="Malgun Gothic" w:cs="Malgun Gothic" w:eastAsia="Malgun Gothic" w:hAnsi="Malgun Gothic"/>
+                <w:color w:val="0000ff"/>
+                <w:sz w:val="22"/>
+                <w:szCs w:val="22"/>
+                <w:rtl w:val="0"/>
+              </w:rPr>
+              <w:t xml:space="preserve">소비자분쟁해결기준 — 체육시설·레저·공연 · 소비자 책임으로 해제하는 경우의 반환 금액</w:t>
+            </w:r>
+          </w:p>
+        </w:tc>
+        <w:tc>
+          <w:tcPr>
+            <w:tcBorders>
+              <w:top w:color="808080" w:space="0" w:sz="7" w:val="single"/>
+              <w:left w:color="808080" w:space="0" w:sz="7" w:val="single"/>
+              <w:bottom w:color="808080" w:space="0" w:sz="7" w:val="single"/>
+              <w:right w:color="808080" w:space="0" w:sz="7" w:val="single"/>
+            </w:tcBorders>
+            <w:tcMar>
+              <w:top w:w="0.0" w:type="dxa"/>
+              <w:left w:w="0.0" w:type="dxa"/>
+              <w:bottom w:w="0.0" w:type="dxa"/>
+              <w:right w:w="0.0" w:type="dxa"/>
+            </w:tcMar>
+            <w:vAlign w:val="center"/>
+          </w:tcPr>
+          <w:p>
+            <w:pPr>
+              <w:pStyle w:val="Heading3"/>
+              <w:keepNext w:val="0"/>
+              <w:keepLines w:val="0"/>
+              <w:spacing w:after="0" w:before="0" w:line="240" w:lineRule="auto"/>
+              <w:jc w:val="center"/>
+              <w:rPr>
+                <w:rFonts w:ascii="Malgun Gothic" w:cs="Malgun Gothic" w:eastAsia="Malgun Gothic" w:hAnsi="Malgun Gothic"/>
+                <w:color w:val="0000ff"/>
+                <w:sz w:val="22"/>
+                <w:szCs w:val="22"/>
+              </w:rPr>
+            </w:pPr>
+            <w:bookmarkStart w:colFirst="0" w:colLast="0" w:name="_d6fu8zjuee0s" w:id="1"/>
+            <w:bookmarkEnd w:id="1"/>
+            <w:r>
+              <w:rPr>
+                <w:rFonts w:ascii="Malgun Gothic" w:cs="Malgun Gothic" w:eastAsia="Malgun Gothic" w:hAnsi="Malgun Gothic"/>
+                <w:color w:val="0000ff"/>
+                <w:sz w:val="22"/>
+                <w:szCs w:val="22"/>
+                <w:rtl w:val="0"/>
+              </w:rPr>
+              <w:t xml:space="preserve">0.387</w:t>
+            </w:r>
+          </w:p>
+        </w:tc>
+        <w:tc>
+          <w:tcPr>
+            <w:tcBorders>
+              <w:top w:color="808080" w:space="0" w:sz="7" w:val="single"/>
+              <w:left w:color="808080" w:space="0" w:sz="7" w:val="single"/>
+              <w:bottom w:color="808080" w:space="0" w:sz="7" w:val="single"/>
+              <w:right w:color="808080" w:space="0" w:sz="7" w:val="single"/>
+            </w:tcBorders>
+            <w:tcMar>
+              <w:top w:w="0.0" w:type="dxa"/>
+              <w:left w:w="0.0" w:type="dxa"/>
+              <w:bottom w:w="0.0" w:type="dxa"/>
+              <w:right w:w="0.0" w:type="dxa"/>
+            </w:tcMar>
+            <w:vAlign w:val="center"/>
+          </w:tcPr>
+          <w:p>
+            <w:pPr>
+              <w:pStyle w:val="Heading3"/>
+              <w:keepNext w:val="0"/>
+              <w:keepLines w:val="0"/>
+              <w:spacing w:after="0" w:before="0" w:line="240" w:lineRule="auto"/>
+              <w:jc w:val="center"/>
+              <w:rPr>
+                <w:rFonts w:ascii="Malgun Gothic" w:cs="Malgun Gothic" w:eastAsia="Malgun Gothic" w:hAnsi="Malgun Gothic"/>
+                <w:color w:val="0000ff"/>
+                <w:sz w:val="22"/>
+                <w:szCs w:val="22"/>
+              </w:rPr>
+            </w:pPr>
+            <w:bookmarkStart w:colFirst="0" w:colLast="0" w:name="_d6fu8zjuee0s" w:id="1"/>
+            <w:bookmarkEnd w:id="1"/>
+            <w:r>
+              <w:rPr>
+                <w:rFonts w:ascii="Malgun Gothic" w:cs="Malgun Gothic" w:eastAsia="Malgun Gothic" w:hAnsi="Malgun Gothic"/>
+                <w:color w:val="0000ff"/>
+                <w:sz w:val="22"/>
+                <w:szCs w:val="22"/>
+                <w:rtl w:val="0"/>
+              </w:rPr>
+              <w:t xml:space="preserve">적중(상위 3위)</w:t>
+            </w:r>
+          </w:p>
+        </w:tc>
+      </w:tr>
+      <w:tr>
+        <w:trPr>
+          <w:cantSplit w:val="0"/>
+          <w:trHeight w:val="566.9291338582677" w:hRule="atLeast"/>
+          <w:tblHeader w:val="0"/>
+        </w:trPr>
+        <w:tc>
+          <w:tcPr>
+            <w:tcBorders>
+              <w:top w:color="808080" w:space="0" w:sz="7" w:val="single"/>
+              <w:left w:color="808080" w:space="0" w:sz="7" w:val="single"/>
+              <w:bottom w:color="808080" w:space="0" w:sz="7" w:val="single"/>
+              <w:right w:color="808080" w:space="0" w:sz="7" w:val="single"/>
+            </w:tcBorders>
+            <w:tcMar>
+              <w:top w:w="0.0" w:type="dxa"/>
+              <w:left w:w="0.0" w:type="dxa"/>
+              <w:bottom w:w="0.0" w:type="dxa"/>
+              <w:right w:w="0.0" w:type="dxa"/>
+            </w:tcMar>
+            <w:vAlign w:val="center"/>
+          </w:tcPr>
+          <w:p>
+            <w:pPr>
+              <w:pStyle w:val="Heading3"/>
+              <w:keepNext w:val="0"/>
+              <w:keepLines w:val="0"/>
+              <w:spacing w:after="0" w:before="0" w:line="240" w:lineRule="auto"/>
+              <w:jc w:val="center"/>
+              <w:rPr>
+                <w:rFonts w:ascii="Malgun Gothic" w:cs="Malgun Gothic" w:eastAsia="Malgun Gothic" w:hAnsi="Malgun Gothic"/>
+                <w:color w:val="0000ff"/>
+                <w:sz w:val="22"/>
+                <w:szCs w:val="22"/>
+              </w:rPr>
+            </w:pPr>
+            <w:bookmarkStart w:colFirst="0" w:colLast="0" w:name="_d6fu8zjuee0s" w:id="1"/>
+            <w:bookmarkEnd w:id="1"/>
+            <w:r>
+              <w:rPr>
+                <w:rFonts w:ascii="Malgun Gothic" w:cs="Malgun Gothic" w:eastAsia="Malgun Gothic" w:hAnsi="Malgun Gothic"/>
+                <w:color w:val="0000ff"/>
+                <w:sz w:val="22"/>
+                <w:szCs w:val="22"/>
+                <w:rtl w:val="0"/>
+              </w:rPr>
+              <w:t xml:space="preserve">N02</w:t>
+            </w:r>
+          </w:p>
+        </w:tc>
+        <w:tc>
+          <w:tcPr>
+            <w:tcBorders>
+              <w:top w:color="808080" w:space="0" w:sz="7" w:val="single"/>
+              <w:left w:color="808080" w:space="0" w:sz="7" w:val="single"/>
+              <w:bottom w:color="808080" w:space="0" w:sz="7" w:val="single"/>
+              <w:right w:color="808080" w:space="0" w:sz="7" w:val="single"/>
+            </w:tcBorders>
+            <w:tcMar>
+              <w:top w:w="0.0" w:type="dxa"/>
+              <w:left w:w="0.0" w:type="dxa"/>
+              <w:bottom w:w="0.0" w:type="dxa"/>
+              <w:right w:w="0.0" w:type="dxa"/>
+            </w:tcMar>
+            <w:vAlign w:val="center"/>
+          </w:tcPr>
+          <w:p>
+            <w:pPr>
+              <w:pStyle w:val="Heading3"/>
+              <w:keepNext w:val="0"/>
+              <w:keepLines w:val="0"/>
+              <w:spacing w:after="0" w:before="0" w:line="240" w:lineRule="auto"/>
+              <w:jc w:val="center"/>
+              <w:rPr>
+                <w:rFonts w:ascii="Malgun Gothic" w:cs="Malgun Gothic" w:eastAsia="Malgun Gothic" w:hAnsi="Malgun Gothic"/>
+                <w:color w:val="0000ff"/>
+                <w:sz w:val="22"/>
+                <w:szCs w:val="22"/>
+              </w:rPr>
+            </w:pPr>
+            <w:bookmarkStart w:colFirst="0" w:colLast="0" w:name="_d6fu8zjuee0s" w:id="1"/>
+            <w:bookmarkEnd w:id="1"/>
+            <w:r>
+              <w:rPr>
+                <w:rFonts w:ascii="Malgun Gothic" w:cs="Malgun Gothic" w:eastAsia="Malgun Gothic" w:hAnsi="Malgun Gothic"/>
+                <w:color w:val="0000ff"/>
+                <w:sz w:val="22"/>
+                <w:szCs w:val="22"/>
+                <w:rtl w:val="0"/>
+              </w:rPr>
+              <w:t xml:space="preserve">헬스장 회원권을 이사 때문에 해지하려는데 얼마나 돌려받나요?</w:t>
+            </w:r>
+          </w:p>
+        </w:tc>
+        <w:tc>
+          <w:tcPr>
+            <w:tcBorders>
+              <w:top w:color="808080" w:space="0" w:sz="7" w:val="single"/>
+              <w:left w:color="808080" w:space="0" w:sz="7" w:val="single"/>
+              <w:bottom w:color="808080" w:space="0" w:sz="7" w:val="single"/>
+              <w:right w:color="808080" w:space="0" w:sz="7" w:val="single"/>
+            </w:tcBorders>
+            <w:tcMar>
+              <w:top w:w="0.0" w:type="dxa"/>
+              <w:left w:w="0.0" w:type="dxa"/>
+              <w:bottom w:w="0.0" w:type="dxa"/>
+              <w:right w:w="0.0" w:type="dxa"/>
+            </w:tcMar>
+            <w:vAlign w:val="center"/>
+          </w:tcPr>
+          <w:p>
+            <w:pPr>
+              <w:pStyle w:val="Heading3"/>
+              <w:keepNext w:val="0"/>
+              <w:keepLines w:val="0"/>
+              <w:spacing w:after="0" w:before="0" w:line="240" w:lineRule="auto"/>
+              <w:jc w:val="center"/>
+              <w:rPr>
+                <w:rFonts w:ascii="Malgun Gothic" w:cs="Malgun Gothic" w:eastAsia="Malgun Gothic" w:hAnsi="Malgun Gothic"/>
+                <w:color w:val="0000ff"/>
+                <w:sz w:val="22"/>
+                <w:szCs w:val="22"/>
+              </w:rPr>
+            </w:pPr>
+            <w:bookmarkStart w:colFirst="0" w:colLast="0" w:name="_d6fu8zjuee0s" w:id="1"/>
+            <w:bookmarkEnd w:id="1"/>
+            <w:r>
+              <w:rPr>
+                <w:rFonts w:ascii="Malgun Gothic" w:cs="Malgun Gothic" w:eastAsia="Malgun Gothic" w:hAnsi="Malgun Gothic"/>
+                <w:color w:val="0000ff"/>
+                <w:sz w:val="22"/>
+                <w:szCs w:val="22"/>
+                <w:rtl w:val="0"/>
+              </w:rPr>
+              <w:t xml:space="preserve">소비자분쟁해결기준 — 체육시설·레저·공연 · 소비자 책임으로 해제하는 경우의 반환 금액</w:t>
+            </w:r>
+          </w:p>
+        </w:tc>
+        <w:tc>
+          <w:tcPr>
+            <w:tcBorders>
+              <w:top w:color="808080" w:space="0" w:sz="7" w:val="single"/>
+              <w:left w:color="808080" w:space="0" w:sz="7" w:val="single"/>
+              <w:bottom w:color="808080" w:space="0" w:sz="7" w:val="single"/>
+              <w:right w:color="808080" w:space="0" w:sz="7" w:val="single"/>
+            </w:tcBorders>
+            <w:tcMar>
+              <w:top w:w="0.0" w:type="dxa"/>
+              <w:left w:w="0.0" w:type="dxa"/>
+              <w:bottom w:w="0.0" w:type="dxa"/>
+              <w:right w:w="0.0" w:type="dxa"/>
+            </w:tcMar>
+            <w:vAlign w:val="center"/>
+          </w:tcPr>
+          <w:p>
+            <w:pPr>
+              <w:pStyle w:val="Heading3"/>
+              <w:keepNext w:val="0"/>
+              <w:keepLines w:val="0"/>
+              <w:spacing w:after="0" w:before="0" w:line="240" w:lineRule="auto"/>
+              <w:jc w:val="center"/>
+              <w:rPr>
+                <w:rFonts w:ascii="Malgun Gothic" w:cs="Malgun Gothic" w:eastAsia="Malgun Gothic" w:hAnsi="Malgun Gothic"/>
+                <w:color w:val="0000ff"/>
+                <w:sz w:val="22"/>
+                <w:szCs w:val="22"/>
+              </w:rPr>
+            </w:pPr>
+            <w:bookmarkStart w:colFirst="0" w:colLast="0" w:name="_d6fu8zjuee0s" w:id="1"/>
+            <w:bookmarkEnd w:id="1"/>
+            <w:r>
+              <w:rPr>
+                <w:rFonts w:ascii="Malgun Gothic" w:cs="Malgun Gothic" w:eastAsia="Malgun Gothic" w:hAnsi="Malgun Gothic"/>
+                <w:color w:val="0000ff"/>
+                <w:sz w:val="22"/>
+                <w:szCs w:val="22"/>
+                <w:rtl w:val="0"/>
+              </w:rPr>
+              <w:t xml:space="preserve">0.330</w:t>
+            </w:r>
+          </w:p>
+        </w:tc>
+        <w:tc>
+          <w:tcPr>
+            <w:tcBorders>
+              <w:top w:color="808080" w:space="0" w:sz="7" w:val="single"/>
+              <w:left w:color="808080" w:space="0" w:sz="7" w:val="single"/>
+              <w:bottom w:color="808080" w:space="0" w:sz="7" w:val="single"/>
+              <w:right w:color="808080" w:space="0" w:sz="7" w:val="single"/>
+            </w:tcBorders>
+            <w:tcMar>
+              <w:top w:w="0.0" w:type="dxa"/>
+              <w:left w:w="0.0" w:type="dxa"/>
+              <w:bottom w:w="0.0" w:type="dxa"/>
+              <w:right w:w="0.0" w:type="dxa"/>
+            </w:tcMar>
+            <w:vAlign w:val="center"/>
+          </w:tcPr>
+          <w:p>
+            <w:pPr>
+              <w:pStyle w:val="Heading3"/>
+              <w:keepNext w:val="0"/>
+              <w:keepLines w:val="0"/>
+              <w:spacing w:after="0" w:before="0" w:line="240" w:lineRule="auto"/>
+              <w:jc w:val="center"/>
+              <w:rPr>
+                <w:rFonts w:ascii="Malgun Gothic" w:cs="Malgun Gothic" w:eastAsia="Malgun Gothic" w:hAnsi="Malgun Gothic"/>
+                <w:color w:val="0000ff"/>
+                <w:sz w:val="22"/>
+                <w:szCs w:val="22"/>
+              </w:rPr>
+            </w:pPr>
+            <w:bookmarkStart w:colFirst="0" w:colLast="0" w:name="_d6fu8zjuee0s" w:id="1"/>
+            <w:bookmarkEnd w:id="1"/>
+            <w:r>
+              <w:rPr>
+                <w:rFonts w:ascii="Malgun Gothic" w:cs="Malgun Gothic" w:eastAsia="Malgun Gothic" w:hAnsi="Malgun Gothic"/>
+                <w:color w:val="0000ff"/>
+                <w:sz w:val="22"/>
+                <w:szCs w:val="22"/>
+                <w:rtl w:val="0"/>
+              </w:rPr>
+              <w:t xml:space="preserve">적중(상위 1위)</w:t>
+            </w:r>
+          </w:p>
+        </w:tc>
+      </w:tr>
+      <w:tr>
+        <w:trPr>
+          <w:cantSplit w:val="0"/>
+          <w:trHeight w:val="566.9291338582677" w:hRule="atLeast"/>
+          <w:tblHeader w:val="0"/>
+        </w:trPr>
+        <w:tc>
+          <w:tcPr>
+            <w:tcBorders>
+              <w:top w:color="808080" w:space="0" w:sz="7" w:val="single"/>
+              <w:left w:color="808080" w:space="0" w:sz="7" w:val="single"/>
+              <w:bottom w:color="808080" w:space="0" w:sz="7" w:val="single"/>
+              <w:right w:color="808080" w:space="0" w:sz="7" w:val="single"/>
+            </w:tcBorders>
+            <w:tcMar>
+              <w:top w:w="0.0" w:type="dxa"/>
+              <w:left w:w="0.0" w:type="dxa"/>
+              <w:bottom w:w="0.0" w:type="dxa"/>
+              <w:right w:w="0.0" w:type="dxa"/>
+            </w:tcMar>
+            <w:vAlign w:val="center"/>
+          </w:tcPr>
+          <w:p>
+            <w:pPr>
+              <w:pStyle w:val="Heading3"/>
+              <w:keepNext w:val="0"/>
+              <w:keepLines w:val="0"/>
+              <w:spacing w:after="0" w:before="0" w:line="240" w:lineRule="auto"/>
+              <w:jc w:val="center"/>
+              <w:rPr>
+                <w:rFonts w:ascii="Malgun Gothic" w:cs="Malgun Gothic" w:eastAsia="Malgun Gothic" w:hAnsi="Malgun Gothic"/>
+                <w:color w:val="0000ff"/>
+                <w:sz w:val="22"/>
+                <w:szCs w:val="22"/>
+              </w:rPr>
+            </w:pPr>
+            <w:bookmarkStart w:colFirst="0" w:colLast="0" w:name="_d6fu8zjuee0s" w:id="1"/>
+            <w:bookmarkEnd w:id="1"/>
+            <w:r>
+              <w:rPr>
+                <w:rFonts w:ascii="Malgun Gothic" w:cs="Malgun Gothic" w:eastAsia="Malgun Gothic" w:hAnsi="Malgun Gothic"/>
+                <w:color w:val="0000ff"/>
+                <w:sz w:val="22"/>
+                <w:szCs w:val="22"/>
+                <w:rtl w:val="0"/>
+              </w:rPr>
+              <w:t xml:space="preserve">N03</w:t>
+            </w:r>
+          </w:p>
+        </w:tc>
+        <w:tc>
+          <w:tcPr>
+            <w:tcBorders>
+              <w:top w:color="808080" w:space="0" w:sz="7" w:val="single"/>
+              <w:left w:color="808080" w:space="0" w:sz="7" w:val="single"/>
+              <w:bottom w:color="808080" w:space="0" w:sz="7" w:val="single"/>
+              <w:right w:color="808080" w:space="0" w:sz="7" w:val="single"/>
+            </w:tcBorders>
+            <w:tcMar>
+              <w:top w:w="0.0" w:type="dxa"/>
+              <w:left w:w="0.0" w:type="dxa"/>
+              <w:bottom w:w="0.0" w:type="dxa"/>
+              <w:right w:w="0.0" w:type="dxa"/>
+            </w:tcMar>
+            <w:vAlign w:val="center"/>
+          </w:tcPr>
+          <w:p>
+            <w:pPr>
+              <w:pStyle w:val="Heading3"/>
+              <w:keepNext w:val="0"/>
+              <w:keepLines w:val="0"/>
+              <w:spacing w:after="0" w:before="0" w:line="240" w:lineRule="auto"/>
+              <w:jc w:val="center"/>
+              <w:rPr>
+                <w:rFonts w:ascii="Malgun Gothic" w:cs="Malgun Gothic" w:eastAsia="Malgun Gothic" w:hAnsi="Malgun Gothic"/>
+                <w:color w:val="0000ff"/>
+                <w:sz w:val="22"/>
+                <w:szCs w:val="22"/>
+              </w:rPr>
+            </w:pPr>
+            <w:bookmarkStart w:colFirst="0" w:colLast="0" w:name="_d6fu8zjuee0s" w:id="1"/>
+            <w:bookmarkEnd w:id="1"/>
+            <w:r>
+              <w:rPr>
+                <w:rFonts w:ascii="Malgun Gothic" w:cs="Malgun Gothic" w:eastAsia="Malgun Gothic" w:hAnsi="Malgun Gothic"/>
+                <w:color w:val="0000ff"/>
+                <w:sz w:val="22"/>
+                <w:szCs w:val="22"/>
+                <w:rtl w:val="0"/>
+              </w:rPr>
+              <w:t xml:space="preserve">예약한 패러글라이딩 체험이 광고 영상과 완전히 달랐어요</w:t>
+            </w:r>
+          </w:p>
+        </w:tc>
+        <w:tc>
+          <w:tcPr>
+            <w:tcBorders>
+              <w:top w:color="808080" w:space="0" w:sz="7" w:val="single"/>
+              <w:left w:color="808080" w:space="0" w:sz="7" w:val="single"/>
+              <w:bottom w:color="808080" w:space="0" w:sz="7" w:val="single"/>
+              <w:right w:color="808080" w:space="0" w:sz="7" w:val="single"/>
+            </w:tcBorders>
+            <w:tcMar>
+              <w:top w:w="0.0" w:type="dxa"/>
+              <w:left w:w="0.0" w:type="dxa"/>
+              <w:bottom w:w="0.0" w:type="dxa"/>
+              <w:right w:w="0.0" w:type="dxa"/>
+            </w:tcMar>
+            <w:vAlign w:val="center"/>
+          </w:tcPr>
+          <w:p>
+            <w:pPr>
+              <w:pStyle w:val="Heading3"/>
+              <w:keepNext w:val="0"/>
+              <w:keepLines w:val="0"/>
+              <w:spacing w:after="0" w:before="0" w:line="240" w:lineRule="auto"/>
+              <w:jc w:val="center"/>
+              <w:rPr>
+                <w:rFonts w:ascii="Malgun Gothic" w:cs="Malgun Gothic" w:eastAsia="Malgun Gothic" w:hAnsi="Malgun Gothic"/>
+                <w:color w:val="0000ff"/>
+                <w:sz w:val="22"/>
+                <w:szCs w:val="22"/>
+              </w:rPr>
+            </w:pPr>
+            <w:bookmarkStart w:colFirst="0" w:colLast="0" w:name="_d6fu8zjuee0s" w:id="1"/>
+            <w:bookmarkEnd w:id="1"/>
+            <w:r>
+              <w:rPr>
+                <w:rFonts w:ascii="Malgun Gothic" w:cs="Malgun Gothic" w:eastAsia="Malgun Gothic" w:hAnsi="Malgun Gothic"/>
+                <w:color w:val="0000ff"/>
+                <w:sz w:val="22"/>
+                <w:szCs w:val="22"/>
+                <w:rtl w:val="0"/>
+              </w:rPr>
+              <w:t xml:space="preserve">무료·무예약 활동을 무엇으로 판정하나 · 예약이 없다는 것과 모른다는 것</w:t>
+            </w:r>
+          </w:p>
+        </w:tc>
+        <w:tc>
+          <w:tcPr>
+            <w:tcBorders>
+              <w:top w:color="808080" w:space="0" w:sz="7" w:val="single"/>
+              <w:left w:color="808080" w:space="0" w:sz="7" w:val="single"/>
+              <w:bottom w:color="808080" w:space="0" w:sz="7" w:val="single"/>
+              <w:right w:color="808080" w:space="0" w:sz="7" w:val="single"/>
+            </w:tcBorders>
+            <w:tcMar>
+              <w:top w:w="0.0" w:type="dxa"/>
+              <w:left w:w="0.0" w:type="dxa"/>
+              <w:bottom w:w="0.0" w:type="dxa"/>
+              <w:right w:w="0.0" w:type="dxa"/>
+            </w:tcMar>
+            <w:vAlign w:val="center"/>
+          </w:tcPr>
+          <w:p>
+            <w:pPr>
+              <w:pStyle w:val="Heading3"/>
+              <w:keepNext w:val="0"/>
+              <w:keepLines w:val="0"/>
+              <w:spacing w:after="0" w:before="0" w:line="240" w:lineRule="auto"/>
+              <w:jc w:val="center"/>
+              <w:rPr>
+                <w:rFonts w:ascii="Malgun Gothic" w:cs="Malgun Gothic" w:eastAsia="Malgun Gothic" w:hAnsi="Malgun Gothic"/>
+                <w:color w:val="0000ff"/>
+                <w:sz w:val="22"/>
+                <w:szCs w:val="22"/>
+              </w:rPr>
+            </w:pPr>
+            <w:bookmarkStart w:colFirst="0" w:colLast="0" w:name="_d6fu8zjuee0s" w:id="1"/>
+            <w:bookmarkEnd w:id="1"/>
+            <w:r>
+              <w:rPr>
+                <w:rFonts w:ascii="Malgun Gothic" w:cs="Malgun Gothic" w:eastAsia="Malgun Gothic" w:hAnsi="Malgun Gothic"/>
+                <w:color w:val="0000ff"/>
+                <w:sz w:val="22"/>
+                <w:szCs w:val="22"/>
+                <w:rtl w:val="0"/>
+              </w:rPr>
+              <w:t xml:space="preserve">0.329</w:t>
+            </w:r>
+          </w:p>
+        </w:tc>
+        <w:tc>
+          <w:tcPr>
+            <w:tcBorders>
+              <w:top w:color="808080" w:space="0" w:sz="7" w:val="single"/>
+              <w:left w:color="808080" w:space="0" w:sz="7" w:val="single"/>
+              <w:bottom w:color="808080" w:space="0" w:sz="7" w:val="single"/>
+              <w:right w:color="808080" w:space="0" w:sz="7" w:val="single"/>
+            </w:tcBorders>
+            <w:tcMar>
+              <w:top w:w="0.0" w:type="dxa"/>
+              <w:left w:w="0.0" w:type="dxa"/>
+              <w:bottom w:w="0.0" w:type="dxa"/>
+              <w:right w:w="0.0" w:type="dxa"/>
+            </w:tcMar>
+            <w:vAlign w:val="center"/>
+          </w:tcPr>
+          <w:p>
+            <w:pPr>
+              <w:pStyle w:val="Heading3"/>
+              <w:keepNext w:val="0"/>
+              <w:keepLines w:val="0"/>
+              <w:spacing w:after="0" w:before="0" w:line="240" w:lineRule="auto"/>
+              <w:jc w:val="center"/>
+              <w:rPr>
+                <w:rFonts w:ascii="Malgun Gothic" w:cs="Malgun Gothic" w:eastAsia="Malgun Gothic" w:hAnsi="Malgun Gothic"/>
+                <w:color w:val="0000ff"/>
+                <w:sz w:val="22"/>
+                <w:szCs w:val="22"/>
+              </w:rPr>
+            </w:pPr>
+            <w:bookmarkStart w:colFirst="0" w:colLast="0" w:name="_d6fu8zjuee0s" w:id="1"/>
+            <w:bookmarkEnd w:id="1"/>
+            <w:r>
+              <w:rPr>
+                <w:rFonts w:ascii="Malgun Gothic" w:cs="Malgun Gothic" w:eastAsia="Malgun Gothic" w:hAnsi="Malgun Gothic"/>
+                <w:color w:val="0000ff"/>
+                <w:sz w:val="22"/>
+                <w:szCs w:val="22"/>
+                <w:rtl w:val="0"/>
+              </w:rPr>
+              <w:t xml:space="preserve">미적중(관련 문서 없음)</w:t>
+            </w:r>
+          </w:p>
+        </w:tc>
+      </w:tr>
+      <w:tr>
+        <w:trPr>
+          <w:cantSplit w:val="0"/>
+          <w:trHeight w:val="566.9291338582677" w:hRule="atLeast"/>
+          <w:tblHeader w:val="0"/>
+        </w:trPr>
+        <w:tc>
+          <w:tcPr>
+            <w:tcBorders>
+              <w:top w:color="808080" w:space="0" w:sz="7" w:val="single"/>
+              <w:left w:color="808080" w:space="0" w:sz="7" w:val="single"/>
+              <w:bottom w:color="808080" w:space="0" w:sz="7" w:val="single"/>
+              <w:right w:color="808080" w:space="0" w:sz="7" w:val="single"/>
+            </w:tcBorders>
+            <w:tcMar>
+              <w:top w:w="0.0" w:type="dxa"/>
+              <w:left w:w="0.0" w:type="dxa"/>
+              <w:bottom w:w="0.0" w:type="dxa"/>
+              <w:right w:w="0.0" w:type="dxa"/>
+            </w:tcMar>
+            <w:vAlign w:val="center"/>
+          </w:tcPr>
+          <w:p>
+            <w:pPr>
+              <w:pStyle w:val="Heading3"/>
+              <w:keepNext w:val="0"/>
+              <w:keepLines w:val="0"/>
+              <w:spacing w:after="0" w:before="0" w:line="240" w:lineRule="auto"/>
+              <w:jc w:val="center"/>
+              <w:rPr>
+                <w:rFonts w:ascii="Malgun Gothic" w:cs="Malgun Gothic" w:eastAsia="Malgun Gothic" w:hAnsi="Malgun Gothic"/>
+                <w:color w:val="0000ff"/>
+                <w:sz w:val="22"/>
+                <w:szCs w:val="22"/>
+              </w:rPr>
+            </w:pPr>
+            <w:bookmarkStart w:colFirst="0" w:colLast="0" w:name="_d6fu8zjuee0s" w:id="1"/>
+            <w:bookmarkEnd w:id="1"/>
+            <w:r>
+              <w:rPr>
+                <w:rFonts w:ascii="Malgun Gothic" w:cs="Malgun Gothic" w:eastAsia="Malgun Gothic" w:hAnsi="Malgun Gothic"/>
+                <w:color w:val="0000ff"/>
+                <w:sz w:val="22"/>
+                <w:szCs w:val="22"/>
+                <w:rtl w:val="0"/>
+              </w:rPr>
+              <w:t xml:space="preserve">N04</w:t>
+            </w:r>
+          </w:p>
+        </w:tc>
+        <w:tc>
+          <w:tcPr>
+            <w:tcBorders>
+              <w:top w:color="808080" w:space="0" w:sz="7" w:val="single"/>
+              <w:left w:color="808080" w:space="0" w:sz="7" w:val="single"/>
+              <w:bottom w:color="808080" w:space="0" w:sz="7" w:val="single"/>
+              <w:right w:color="808080" w:space="0" w:sz="7" w:val="single"/>
+            </w:tcBorders>
+            <w:tcMar>
+              <w:top w:w="0.0" w:type="dxa"/>
+              <w:left w:w="0.0" w:type="dxa"/>
+              <w:bottom w:w="0.0" w:type="dxa"/>
+              <w:right w:w="0.0" w:type="dxa"/>
+            </w:tcMar>
+            <w:vAlign w:val="center"/>
+          </w:tcPr>
+          <w:p>
+            <w:pPr>
+              <w:pStyle w:val="Heading3"/>
+              <w:keepNext w:val="0"/>
+              <w:keepLines w:val="0"/>
+              <w:spacing w:after="0" w:before="0" w:line="240" w:lineRule="auto"/>
+              <w:jc w:val="center"/>
+              <w:rPr>
+                <w:rFonts w:ascii="Malgun Gothic" w:cs="Malgun Gothic" w:eastAsia="Malgun Gothic" w:hAnsi="Malgun Gothic"/>
+                <w:color w:val="0000ff"/>
+                <w:sz w:val="22"/>
+                <w:szCs w:val="22"/>
+              </w:rPr>
+            </w:pPr>
+            <w:bookmarkStart w:colFirst="0" w:colLast="0" w:name="_d6fu8zjuee0s" w:id="1"/>
+            <w:bookmarkEnd w:id="1"/>
+            <w:r>
+              <w:rPr>
+                <w:rFonts w:ascii="Malgun Gothic" w:cs="Malgun Gothic" w:eastAsia="Malgun Gothic" w:hAnsi="Malgun Gothic"/>
+                <w:color w:val="0000ff"/>
+                <w:sz w:val="22"/>
+                <w:szCs w:val="22"/>
+                <w:rtl w:val="0"/>
+              </w:rPr>
+              <w:t xml:space="preserve">뮤지컬 일주일 전에 예매를 취소하면 수수료가 얼마예요?</w:t>
+            </w:r>
+          </w:p>
+        </w:tc>
+        <w:tc>
+          <w:tcPr>
+            <w:tcBorders>
+              <w:top w:color="808080" w:space="0" w:sz="7" w:val="single"/>
+              <w:left w:color="808080" w:space="0" w:sz="7" w:val="single"/>
+              <w:bottom w:color="808080" w:space="0" w:sz="7" w:val="single"/>
+              <w:right w:color="808080" w:space="0" w:sz="7" w:val="single"/>
+            </w:tcBorders>
+            <w:tcMar>
+              <w:top w:w="0.0" w:type="dxa"/>
+              <w:left w:w="0.0" w:type="dxa"/>
+              <w:bottom w:w="0.0" w:type="dxa"/>
+              <w:right w:w="0.0" w:type="dxa"/>
+            </w:tcMar>
+            <w:vAlign w:val="center"/>
+          </w:tcPr>
+          <w:p>
+            <w:pPr>
+              <w:pStyle w:val="Heading3"/>
+              <w:keepNext w:val="0"/>
+              <w:keepLines w:val="0"/>
+              <w:spacing w:after="0" w:before="0" w:line="240" w:lineRule="auto"/>
+              <w:jc w:val="center"/>
+              <w:rPr>
+                <w:rFonts w:ascii="Malgun Gothic" w:cs="Malgun Gothic" w:eastAsia="Malgun Gothic" w:hAnsi="Malgun Gothic"/>
+                <w:color w:val="0000ff"/>
+                <w:sz w:val="22"/>
+                <w:szCs w:val="22"/>
+              </w:rPr>
+            </w:pPr>
+            <w:bookmarkStart w:colFirst="0" w:colLast="0" w:name="_d6fu8zjuee0s" w:id="1"/>
+            <w:bookmarkEnd w:id="1"/>
+            <w:r>
+              <w:rPr>
+                <w:rFonts w:ascii="Malgun Gothic" w:cs="Malgun Gothic" w:eastAsia="Malgun Gothic" w:hAnsi="Malgun Gothic"/>
+                <w:color w:val="0000ff"/>
+                <w:sz w:val="22"/>
+                <w:szCs w:val="22"/>
+                <w:rtl w:val="0"/>
+              </w:rPr>
+              <w:t xml:space="preserve">소비자분쟁해결기준 — 체육시설·레저·공연 · 공연이 취소되거나 연기된 경우</w:t>
+            </w:r>
+          </w:p>
+        </w:tc>
+        <w:tc>
+          <w:tcPr>
+            <w:tcBorders>
+              <w:top w:color="808080" w:space="0" w:sz="7" w:val="single"/>
+              <w:left w:color="808080" w:space="0" w:sz="7" w:val="single"/>
+              <w:bottom w:color="808080" w:space="0" w:sz="7" w:val="single"/>
+              <w:right w:color="808080" w:space="0" w:sz="7" w:val="single"/>
+            </w:tcBorders>
+            <w:tcMar>
+              <w:top w:w="0.0" w:type="dxa"/>
+              <w:left w:w="0.0" w:type="dxa"/>
+              <w:bottom w:w="0.0" w:type="dxa"/>
+              <w:right w:w="0.0" w:type="dxa"/>
+            </w:tcMar>
+            <w:vAlign w:val="center"/>
+          </w:tcPr>
+          <w:p>
+            <w:pPr>
+              <w:pStyle w:val="Heading3"/>
+              <w:keepNext w:val="0"/>
+              <w:keepLines w:val="0"/>
+              <w:spacing w:after="0" w:before="0" w:line="240" w:lineRule="auto"/>
+              <w:jc w:val="center"/>
+              <w:rPr>
+                <w:rFonts w:ascii="Malgun Gothic" w:cs="Malgun Gothic" w:eastAsia="Malgun Gothic" w:hAnsi="Malgun Gothic"/>
+                <w:color w:val="0000ff"/>
+                <w:sz w:val="22"/>
+                <w:szCs w:val="22"/>
+              </w:rPr>
+            </w:pPr>
+            <w:bookmarkStart w:colFirst="0" w:colLast="0" w:name="_d6fu8zjuee0s" w:id="1"/>
+            <w:bookmarkEnd w:id="1"/>
+            <w:r>
+              <w:rPr>
+                <w:rFonts w:ascii="Malgun Gothic" w:cs="Malgun Gothic" w:eastAsia="Malgun Gothic" w:hAnsi="Malgun Gothic"/>
+                <w:color w:val="0000ff"/>
+                <w:sz w:val="22"/>
+                <w:szCs w:val="22"/>
+                <w:rtl w:val="0"/>
+              </w:rPr>
+              <w:t xml:space="preserve">0.514</w:t>
+            </w:r>
+          </w:p>
+        </w:tc>
+        <w:tc>
+          <w:tcPr>
+            <w:tcBorders>
+              <w:top w:color="808080" w:space="0" w:sz="7" w:val="single"/>
+              <w:left w:color="808080" w:space="0" w:sz="7" w:val="single"/>
+              <w:bottom w:color="808080" w:space="0" w:sz="7" w:val="single"/>
+              <w:right w:color="808080" w:space="0" w:sz="7" w:val="single"/>
+            </w:tcBorders>
+            <w:tcMar>
+              <w:top w:w="0.0" w:type="dxa"/>
+              <w:left w:w="0.0" w:type="dxa"/>
+              <w:bottom w:w="0.0" w:type="dxa"/>
+              <w:right w:w="0.0" w:type="dxa"/>
+            </w:tcMar>
+            <w:vAlign w:val="center"/>
+          </w:tcPr>
+          <w:p>
+            <w:pPr>
+              <w:pStyle w:val="Heading3"/>
+              <w:keepNext w:val="0"/>
+              <w:keepLines w:val="0"/>
+              <w:spacing w:after="0" w:before="0" w:line="240" w:lineRule="auto"/>
+              <w:jc w:val="center"/>
+              <w:rPr>
+                <w:rFonts w:ascii="Malgun Gothic" w:cs="Malgun Gothic" w:eastAsia="Malgun Gothic" w:hAnsi="Malgun Gothic"/>
+                <w:color w:val="0000ff"/>
+                <w:sz w:val="22"/>
+                <w:szCs w:val="22"/>
+              </w:rPr>
+            </w:pPr>
+            <w:bookmarkStart w:colFirst="0" w:colLast="0" w:name="_d6fu8zjuee0s" w:id="1"/>
+            <w:bookmarkEnd w:id="1"/>
+            <w:r>
+              <w:rPr>
+                <w:rFonts w:ascii="Malgun Gothic" w:cs="Malgun Gothic" w:eastAsia="Malgun Gothic" w:hAnsi="Malgun Gothic"/>
+                <w:color w:val="0000ff"/>
+                <w:sz w:val="22"/>
+                <w:szCs w:val="22"/>
+                <w:rtl w:val="0"/>
+              </w:rPr>
+              <w:t xml:space="preserve">적중(상위 2위)</w:t>
+            </w:r>
+          </w:p>
+        </w:tc>
+      </w:tr>
+      <w:tr>
+        <w:trPr>
+          <w:cantSplit w:val="0"/>
+          <w:trHeight w:val="566.9291338582677" w:hRule="atLeast"/>
+          <w:tblHeader w:val="0"/>
+        </w:trPr>
+        <w:tc>
+          <w:tcPr>
+            <w:tcBorders>
+              <w:top w:color="808080" w:space="0" w:sz="7" w:val="single"/>
+              <w:left w:color="808080" w:space="0" w:sz="7" w:val="single"/>
+              <w:bottom w:color="808080" w:space="0" w:sz="7" w:val="single"/>
+              <w:right w:color="808080" w:space="0" w:sz="7" w:val="single"/>
+            </w:tcBorders>
+            <w:tcMar>
+              <w:top w:w="0.0" w:type="dxa"/>
+              <w:left w:w="0.0" w:type="dxa"/>
+              <w:bottom w:w="0.0" w:type="dxa"/>
+              <w:right w:w="0.0" w:type="dxa"/>
+            </w:tcMar>
+            <w:vAlign w:val="center"/>
+          </w:tcPr>
+          <w:p>
+            <w:pPr>
+              <w:pStyle w:val="Heading3"/>
+              <w:keepNext w:val="0"/>
+              <w:keepLines w:val="0"/>
+              <w:spacing w:after="0" w:before="0" w:line="240" w:lineRule="auto"/>
+              <w:jc w:val="center"/>
+              <w:rPr>
+                <w:rFonts w:ascii="Malgun Gothic" w:cs="Malgun Gothic" w:eastAsia="Malgun Gothic" w:hAnsi="Malgun Gothic"/>
+                <w:color w:val="0000ff"/>
+                <w:sz w:val="22"/>
+                <w:szCs w:val="22"/>
+              </w:rPr>
+            </w:pPr>
+            <w:bookmarkStart w:colFirst="0" w:colLast="0" w:name="_d6fu8zjuee0s" w:id="1"/>
+            <w:bookmarkEnd w:id="1"/>
+            <w:r>
+              <w:rPr>
+                <w:rFonts w:ascii="Malgun Gothic" w:cs="Malgun Gothic" w:eastAsia="Malgun Gothic" w:hAnsi="Malgun Gothic"/>
+                <w:color w:val="0000ff"/>
+                <w:sz w:val="22"/>
+                <w:szCs w:val="22"/>
+                <w:rtl w:val="0"/>
+              </w:rPr>
+              <w:t xml:space="preserve">N05</w:t>
+            </w:r>
+          </w:p>
+        </w:tc>
+        <w:tc>
+          <w:tcPr>
+            <w:tcBorders>
+              <w:top w:color="808080" w:space="0" w:sz="7" w:val="single"/>
+              <w:left w:color="808080" w:space="0" w:sz="7" w:val="single"/>
+              <w:bottom w:color="808080" w:space="0" w:sz="7" w:val="single"/>
+              <w:right w:color="808080" w:space="0" w:sz="7" w:val="single"/>
+            </w:tcBorders>
+            <w:tcMar>
+              <w:top w:w="0.0" w:type="dxa"/>
+              <w:left w:w="0.0" w:type="dxa"/>
+              <w:bottom w:w="0.0" w:type="dxa"/>
+              <w:right w:w="0.0" w:type="dxa"/>
+            </w:tcMar>
+            <w:vAlign w:val="center"/>
+          </w:tcPr>
+          <w:p>
+            <w:pPr>
+              <w:pStyle w:val="Heading3"/>
+              <w:keepNext w:val="0"/>
+              <w:keepLines w:val="0"/>
+              <w:spacing w:after="0" w:before="0" w:line="240" w:lineRule="auto"/>
+              <w:jc w:val="center"/>
+              <w:rPr>
+                <w:rFonts w:ascii="Malgun Gothic" w:cs="Malgun Gothic" w:eastAsia="Malgun Gothic" w:hAnsi="Malgun Gothic"/>
+                <w:color w:val="0000ff"/>
+                <w:sz w:val="22"/>
+                <w:szCs w:val="22"/>
+              </w:rPr>
+            </w:pPr>
+            <w:bookmarkStart w:colFirst="0" w:colLast="0" w:name="_d6fu8zjuee0s" w:id="1"/>
+            <w:bookmarkEnd w:id="1"/>
+            <w:r>
+              <w:rPr>
+                <w:rFonts w:ascii="Malgun Gothic" w:cs="Malgun Gothic" w:eastAsia="Malgun Gothic" w:hAnsi="Malgun Gothic"/>
+                <w:color w:val="0000ff"/>
+                <w:sz w:val="22"/>
+                <w:szCs w:val="22"/>
+                <w:rtl w:val="0"/>
+              </w:rPr>
+              <w:t xml:space="preserve">비 때문에 야외 공연이 취소됐어요. 표값은 어떻게 되나요?</w:t>
+            </w:r>
+          </w:p>
+        </w:tc>
+        <w:tc>
+          <w:tcPr>
+            <w:tcBorders>
+              <w:top w:color="808080" w:space="0" w:sz="7" w:val="single"/>
+              <w:left w:color="808080" w:space="0" w:sz="7" w:val="single"/>
+              <w:bottom w:color="808080" w:space="0" w:sz="7" w:val="single"/>
+              <w:right w:color="808080" w:space="0" w:sz="7" w:val="single"/>
+            </w:tcBorders>
+            <w:tcMar>
+              <w:top w:w="0.0" w:type="dxa"/>
+              <w:left w:w="0.0" w:type="dxa"/>
+              <w:bottom w:w="0.0" w:type="dxa"/>
+              <w:right w:w="0.0" w:type="dxa"/>
+            </w:tcMar>
+            <w:vAlign w:val="center"/>
+          </w:tcPr>
+          <w:p>
+            <w:pPr>
+              <w:pStyle w:val="Heading3"/>
+              <w:keepNext w:val="0"/>
+              <w:keepLines w:val="0"/>
+              <w:spacing w:after="0" w:before="0" w:line="240" w:lineRule="auto"/>
+              <w:jc w:val="center"/>
+              <w:rPr>
+                <w:rFonts w:ascii="Malgun Gothic" w:cs="Malgun Gothic" w:eastAsia="Malgun Gothic" w:hAnsi="Malgun Gothic"/>
+                <w:color w:val="0000ff"/>
+                <w:sz w:val="22"/>
+                <w:szCs w:val="22"/>
+              </w:rPr>
+            </w:pPr>
+            <w:bookmarkStart w:colFirst="0" w:colLast="0" w:name="_d6fu8zjuee0s" w:id="1"/>
+            <w:bookmarkEnd w:id="1"/>
+            <w:r>
+              <w:rPr>
+                <w:rFonts w:ascii="Malgun Gothic" w:cs="Malgun Gothic" w:eastAsia="Malgun Gothic" w:hAnsi="Malgun Gothic"/>
+                <w:color w:val="0000ff"/>
+                <w:sz w:val="22"/>
+                <w:szCs w:val="22"/>
+                <w:rtl w:val="0"/>
+              </w:rPr>
+              <w:t xml:space="preserve">날씨로 활동을 바꾸는 경우 · 날씨로 활동을 바꾸는 경우</w:t>
+            </w:r>
+          </w:p>
+        </w:tc>
+        <w:tc>
+          <w:tcPr>
+            <w:tcBorders>
+              <w:top w:color="808080" w:space="0" w:sz="7" w:val="single"/>
+              <w:left w:color="808080" w:space="0" w:sz="7" w:val="single"/>
+              <w:bottom w:color="808080" w:space="0" w:sz="7" w:val="single"/>
+              <w:right w:color="808080" w:space="0" w:sz="7" w:val="single"/>
+            </w:tcBorders>
+            <w:tcMar>
+              <w:top w:w="0.0" w:type="dxa"/>
+              <w:left w:w="0.0" w:type="dxa"/>
+              <w:bottom w:w="0.0" w:type="dxa"/>
+              <w:right w:w="0.0" w:type="dxa"/>
+            </w:tcMar>
+            <w:vAlign w:val="center"/>
+          </w:tcPr>
+          <w:p>
+            <w:pPr>
+              <w:pStyle w:val="Heading3"/>
+              <w:keepNext w:val="0"/>
+              <w:keepLines w:val="0"/>
+              <w:spacing w:after="0" w:before="0" w:line="240" w:lineRule="auto"/>
+              <w:jc w:val="center"/>
+              <w:rPr>
+                <w:rFonts w:ascii="Malgun Gothic" w:cs="Malgun Gothic" w:eastAsia="Malgun Gothic" w:hAnsi="Malgun Gothic"/>
+                <w:color w:val="0000ff"/>
+                <w:sz w:val="22"/>
+                <w:szCs w:val="22"/>
+              </w:rPr>
+            </w:pPr>
+            <w:bookmarkStart w:colFirst="0" w:colLast="0" w:name="_d6fu8zjuee0s" w:id="1"/>
+            <w:bookmarkEnd w:id="1"/>
+            <w:r>
+              <w:rPr>
+                <w:rFonts w:ascii="Malgun Gothic" w:cs="Malgun Gothic" w:eastAsia="Malgun Gothic" w:hAnsi="Malgun Gothic"/>
+                <w:color w:val="0000ff"/>
+                <w:sz w:val="22"/>
+                <w:szCs w:val="22"/>
+                <w:rtl w:val="0"/>
+              </w:rPr>
+              <w:t xml:space="preserve">0.531</w:t>
+            </w:r>
+          </w:p>
+        </w:tc>
+        <w:tc>
+          <w:tcPr>
+            <w:tcBorders>
+              <w:top w:color="808080" w:space="0" w:sz="7" w:val="single"/>
+              <w:left w:color="808080" w:space="0" w:sz="7" w:val="single"/>
+              <w:bottom w:color="808080" w:space="0" w:sz="7" w:val="single"/>
+              <w:right w:color="808080" w:space="0" w:sz="7" w:val="single"/>
+            </w:tcBorders>
+            <w:tcMar>
+              <w:top w:w="0.0" w:type="dxa"/>
+              <w:left w:w="0.0" w:type="dxa"/>
+              <w:bottom w:w="0.0" w:type="dxa"/>
+              <w:right w:w="0.0" w:type="dxa"/>
+            </w:tcMar>
+            <w:vAlign w:val="center"/>
+          </w:tcPr>
+          <w:p>
+            <w:pPr>
+              <w:pStyle w:val="Heading3"/>
+              <w:keepNext w:val="0"/>
+              <w:keepLines w:val="0"/>
+              <w:spacing w:after="0" w:before="0" w:line="240" w:lineRule="auto"/>
+              <w:jc w:val="center"/>
+              <w:rPr>
+                <w:rFonts w:ascii="Malgun Gothic" w:cs="Malgun Gothic" w:eastAsia="Malgun Gothic" w:hAnsi="Malgun Gothic"/>
+                <w:color w:val="0000ff"/>
+                <w:sz w:val="22"/>
+                <w:szCs w:val="22"/>
+              </w:rPr>
+            </w:pPr>
+            <w:bookmarkStart w:colFirst="0" w:colLast="0" w:name="_d6fu8zjuee0s" w:id="1"/>
+            <w:bookmarkEnd w:id="1"/>
+            <w:r>
+              <w:rPr>
+                <w:rFonts w:ascii="Malgun Gothic" w:cs="Malgun Gothic" w:eastAsia="Malgun Gothic" w:hAnsi="Malgun Gothic"/>
+                <w:color w:val="0000ff"/>
+                <w:sz w:val="22"/>
+                <w:szCs w:val="22"/>
+                <w:rtl w:val="0"/>
+              </w:rPr>
+              <w:t xml:space="preserve">적중(상위 2위)</w:t>
+            </w:r>
+          </w:p>
+        </w:tc>
+      </w:tr>
+      <w:tr>
+        <w:trPr>
+          <w:cantSplit w:val="0"/>
+          <w:trHeight w:val="566.9291338582677" w:hRule="atLeast"/>
+          <w:tblHeader w:val="0"/>
+        </w:trPr>
+        <w:tc>
+          <w:tcPr>
+            <w:tcBorders>
+              <w:top w:color="808080" w:space="0" w:sz="7" w:val="single"/>
+              <w:left w:color="808080" w:space="0" w:sz="7" w:val="single"/>
+              <w:bottom w:color="808080" w:space="0" w:sz="7" w:val="single"/>
+              <w:right w:color="808080" w:space="0" w:sz="7" w:val="single"/>
+            </w:tcBorders>
+            <w:tcMar>
+              <w:top w:w="0.0" w:type="dxa"/>
+              <w:left w:w="0.0" w:type="dxa"/>
+              <w:bottom w:w="0.0" w:type="dxa"/>
+              <w:right w:w="0.0" w:type="dxa"/>
+            </w:tcMar>
+            <w:vAlign w:val="center"/>
+          </w:tcPr>
+          <w:p>
+            <w:pPr>
+              <w:pStyle w:val="Heading3"/>
+              <w:keepNext w:val="0"/>
+              <w:keepLines w:val="0"/>
+              <w:spacing w:after="0" w:before="0" w:line="240" w:lineRule="auto"/>
+              <w:jc w:val="center"/>
+              <w:rPr>
+                <w:rFonts w:ascii="Malgun Gothic" w:cs="Malgun Gothic" w:eastAsia="Malgun Gothic" w:hAnsi="Malgun Gothic"/>
+                <w:color w:val="0000ff"/>
+                <w:sz w:val="22"/>
+                <w:szCs w:val="22"/>
+              </w:rPr>
+            </w:pPr>
+            <w:bookmarkStart w:colFirst="0" w:colLast="0" w:name="_d6fu8zjuee0s" w:id="1"/>
+            <w:bookmarkEnd w:id="1"/>
+            <w:r>
+              <w:rPr>
+                <w:rFonts w:ascii="Malgun Gothic" w:cs="Malgun Gothic" w:eastAsia="Malgun Gothic" w:hAnsi="Malgun Gothic"/>
+                <w:color w:val="0000ff"/>
+                <w:sz w:val="22"/>
+                <w:szCs w:val="22"/>
+                <w:rtl w:val="0"/>
+              </w:rPr>
+              <w:t xml:space="preserve">N06</w:t>
+            </w:r>
+          </w:p>
+        </w:tc>
+        <w:tc>
+          <w:tcPr>
+            <w:tcBorders>
+              <w:top w:color="808080" w:space="0" w:sz="7" w:val="single"/>
+              <w:left w:color="808080" w:space="0" w:sz="7" w:val="single"/>
+              <w:bottom w:color="808080" w:space="0" w:sz="7" w:val="single"/>
+              <w:right w:color="808080" w:space="0" w:sz="7" w:val="single"/>
+            </w:tcBorders>
+            <w:tcMar>
+              <w:top w:w="0.0" w:type="dxa"/>
+              <w:left w:w="0.0" w:type="dxa"/>
+              <w:bottom w:w="0.0" w:type="dxa"/>
+              <w:right w:w="0.0" w:type="dxa"/>
+            </w:tcMar>
+            <w:vAlign w:val="center"/>
+          </w:tcPr>
+          <w:p>
+            <w:pPr>
+              <w:pStyle w:val="Heading3"/>
+              <w:keepNext w:val="0"/>
+              <w:keepLines w:val="0"/>
+              <w:spacing w:after="0" w:before="0" w:line="240" w:lineRule="auto"/>
+              <w:jc w:val="center"/>
+              <w:rPr>
+                <w:rFonts w:ascii="Malgun Gothic" w:cs="Malgun Gothic" w:eastAsia="Malgun Gothic" w:hAnsi="Malgun Gothic"/>
+                <w:color w:val="0000ff"/>
+                <w:sz w:val="22"/>
+                <w:szCs w:val="22"/>
+              </w:rPr>
+            </w:pPr>
+            <w:bookmarkStart w:colFirst="0" w:colLast="0" w:name="_d6fu8zjuee0s" w:id="1"/>
+            <w:bookmarkEnd w:id="1"/>
+            <w:r>
+              <w:rPr>
+                <w:rFonts w:ascii="Malgun Gothic" w:cs="Malgun Gothic" w:eastAsia="Malgun Gothic" w:hAnsi="Malgun Gothic"/>
+                <w:color w:val="0000ff"/>
+                <w:sz w:val="22"/>
+                <w:szCs w:val="22"/>
+                <w:rtl w:val="0"/>
+              </w:rPr>
+              <w:t xml:space="preserve">주연 배우가 바뀌었는데 환불받을 수 있나요?</w:t>
+            </w:r>
+          </w:p>
+        </w:tc>
+        <w:tc>
+          <w:tcPr>
+            <w:tcBorders>
+              <w:top w:color="808080" w:space="0" w:sz="7" w:val="single"/>
+              <w:left w:color="808080" w:space="0" w:sz="7" w:val="single"/>
+              <w:bottom w:color="808080" w:space="0" w:sz="7" w:val="single"/>
+              <w:right w:color="808080" w:space="0" w:sz="7" w:val="single"/>
+            </w:tcBorders>
+            <w:tcMar>
+              <w:top w:w="0.0" w:type="dxa"/>
+              <w:left w:w="0.0" w:type="dxa"/>
+              <w:bottom w:w="0.0" w:type="dxa"/>
+              <w:right w:w="0.0" w:type="dxa"/>
+            </w:tcMar>
+            <w:vAlign w:val="center"/>
+          </w:tcPr>
+          <w:p>
+            <w:pPr>
+              <w:pStyle w:val="Heading3"/>
+              <w:keepNext w:val="0"/>
+              <w:keepLines w:val="0"/>
+              <w:spacing w:after="0" w:before="0" w:line="240" w:lineRule="auto"/>
+              <w:jc w:val="center"/>
+              <w:rPr>
+                <w:rFonts w:ascii="Malgun Gothic" w:cs="Malgun Gothic" w:eastAsia="Malgun Gothic" w:hAnsi="Malgun Gothic"/>
+                <w:color w:val="0000ff"/>
+                <w:sz w:val="22"/>
+                <w:szCs w:val="22"/>
+              </w:rPr>
+            </w:pPr>
+            <w:bookmarkStart w:colFirst="0" w:colLast="0" w:name="_d6fu8zjuee0s" w:id="1"/>
+            <w:bookmarkEnd w:id="1"/>
+            <w:r>
+              <w:rPr>
+                <w:rFonts w:ascii="Malgun Gothic" w:cs="Malgun Gothic" w:eastAsia="Malgun Gothic" w:hAnsi="Malgun Gothic"/>
+                <w:color w:val="0000ff"/>
+                <w:sz w:val="22"/>
+                <w:szCs w:val="22"/>
+                <w:rtl w:val="0"/>
+              </w:rPr>
+              <w:t xml:space="preserve">소비자분쟁해결기준 — 체육시설·레저·공연 · 공연이 취소되거나 연기된 경우</w:t>
+            </w:r>
+          </w:p>
+        </w:tc>
+        <w:tc>
+          <w:tcPr>
+            <w:tcBorders>
+              <w:top w:color="808080" w:space="0" w:sz="7" w:val="single"/>
+              <w:left w:color="808080" w:space="0" w:sz="7" w:val="single"/>
+              <w:bottom w:color="808080" w:space="0" w:sz="7" w:val="single"/>
+              <w:right w:color="808080" w:space="0" w:sz="7" w:val="single"/>
+            </w:tcBorders>
+            <w:tcMar>
+              <w:top w:w="0.0" w:type="dxa"/>
+              <w:left w:w="0.0" w:type="dxa"/>
+              <w:bottom w:w="0.0" w:type="dxa"/>
+              <w:right w:w="0.0" w:type="dxa"/>
+            </w:tcMar>
+            <w:vAlign w:val="center"/>
+          </w:tcPr>
+          <w:p>
+            <w:pPr>
+              <w:pStyle w:val="Heading3"/>
+              <w:keepNext w:val="0"/>
+              <w:keepLines w:val="0"/>
+              <w:spacing w:after="0" w:before="0" w:line="240" w:lineRule="auto"/>
+              <w:jc w:val="center"/>
+              <w:rPr>
+                <w:rFonts w:ascii="Malgun Gothic" w:cs="Malgun Gothic" w:eastAsia="Malgun Gothic" w:hAnsi="Malgun Gothic"/>
+                <w:color w:val="0000ff"/>
+                <w:sz w:val="22"/>
+                <w:szCs w:val="22"/>
+              </w:rPr>
+            </w:pPr>
+            <w:bookmarkStart w:colFirst="0" w:colLast="0" w:name="_d6fu8zjuee0s" w:id="1"/>
+            <w:bookmarkEnd w:id="1"/>
+            <w:r>
+              <w:rPr>
+                <w:rFonts w:ascii="Malgun Gothic" w:cs="Malgun Gothic" w:eastAsia="Malgun Gothic" w:hAnsi="Malgun Gothic"/>
+                <w:color w:val="0000ff"/>
+                <w:sz w:val="22"/>
+                <w:szCs w:val="22"/>
+                <w:rtl w:val="0"/>
+              </w:rPr>
+              <w:t xml:space="preserve">0.428</w:t>
+            </w:r>
+          </w:p>
+        </w:tc>
+        <w:tc>
+          <w:tcPr>
+            <w:tcBorders>
+              <w:top w:color="808080" w:space="0" w:sz="7" w:val="single"/>
+              <w:left w:color="808080" w:space="0" w:sz="7" w:val="single"/>
+              <w:bottom w:color="808080" w:space="0" w:sz="7" w:val="single"/>
+              <w:right w:color="808080" w:space="0" w:sz="7" w:val="single"/>
+            </w:tcBorders>
+            <w:tcMar>
+              <w:top w:w="0.0" w:type="dxa"/>
+              <w:left w:w="0.0" w:type="dxa"/>
+              <w:bottom w:w="0.0" w:type="dxa"/>
+              <w:right w:w="0.0" w:type="dxa"/>
+            </w:tcMar>
+            <w:vAlign w:val="center"/>
+          </w:tcPr>
+          <w:p>
+            <w:pPr>
+              <w:pStyle w:val="Heading3"/>
+              <w:keepNext w:val="0"/>
+              <w:keepLines w:val="0"/>
+              <w:spacing w:after="0" w:before="0" w:line="240" w:lineRule="auto"/>
+              <w:jc w:val="center"/>
+              <w:rPr>
+                <w:rFonts w:ascii="Malgun Gothic" w:cs="Malgun Gothic" w:eastAsia="Malgun Gothic" w:hAnsi="Malgun Gothic"/>
+                <w:color w:val="0000ff"/>
+                <w:sz w:val="22"/>
+                <w:szCs w:val="22"/>
+              </w:rPr>
+            </w:pPr>
+            <w:bookmarkStart w:colFirst="0" w:colLast="0" w:name="_d6fu8zjuee0s" w:id="1"/>
+            <w:bookmarkEnd w:id="1"/>
+            <w:r>
+              <w:rPr>
+                <w:rFonts w:ascii="Malgun Gothic" w:cs="Malgun Gothic" w:eastAsia="Malgun Gothic" w:hAnsi="Malgun Gothic"/>
+                <w:color w:val="0000ff"/>
+                <w:sz w:val="22"/>
+                <w:szCs w:val="22"/>
+                <w:rtl w:val="0"/>
+              </w:rPr>
+              <w:t xml:space="preserve">적중(상위 1위)</w:t>
+            </w:r>
+          </w:p>
+        </w:tc>
+      </w:tr>
+      <w:tr>
+        <w:trPr>
+          <w:cantSplit w:val="0"/>
+          <w:trHeight w:val="566.9291338582677" w:hRule="atLeast"/>
+          <w:tblHeader w:val="0"/>
+        </w:trPr>
+        <w:tc>
+          <w:tcPr>
+            <w:tcBorders>
+              <w:top w:color="808080" w:space="0" w:sz="7" w:val="single"/>
+              <w:left w:color="808080" w:space="0" w:sz="7" w:val="single"/>
+              <w:bottom w:color="808080" w:space="0" w:sz="7" w:val="single"/>
+              <w:right w:color="808080" w:space="0" w:sz="7" w:val="single"/>
+            </w:tcBorders>
+            <w:tcMar>
+              <w:top w:w="0.0" w:type="dxa"/>
+              <w:left w:w="0.0" w:type="dxa"/>
+              <w:bottom w:w="0.0" w:type="dxa"/>
+              <w:right w:w="0.0" w:type="dxa"/>
+            </w:tcMar>
+            <w:vAlign w:val="center"/>
+          </w:tcPr>
+          <w:p>
+            <w:pPr>
+              <w:pStyle w:val="Heading3"/>
+              <w:keepNext w:val="0"/>
+              <w:keepLines w:val="0"/>
+              <w:spacing w:after="0" w:before="0" w:line="240" w:lineRule="auto"/>
+              <w:jc w:val="center"/>
+              <w:rPr>
+                <w:rFonts w:ascii="Malgun Gothic" w:cs="Malgun Gothic" w:eastAsia="Malgun Gothic" w:hAnsi="Malgun Gothic"/>
+                <w:color w:val="0000ff"/>
+                <w:sz w:val="22"/>
+                <w:szCs w:val="22"/>
+              </w:rPr>
+            </w:pPr>
+            <w:bookmarkStart w:colFirst="0" w:colLast="0" w:name="_d6fu8zjuee0s" w:id="1"/>
+            <w:bookmarkEnd w:id="1"/>
+            <w:r>
+              <w:rPr>
+                <w:rFonts w:ascii="Malgun Gothic" w:cs="Malgun Gothic" w:eastAsia="Malgun Gothic" w:hAnsi="Malgun Gothic"/>
+                <w:color w:val="0000ff"/>
+                <w:sz w:val="22"/>
+                <w:szCs w:val="22"/>
+                <w:rtl w:val="0"/>
+              </w:rPr>
+              <w:t xml:space="preserve">N07</w:t>
+            </w:r>
+          </w:p>
+        </w:tc>
+        <w:tc>
+          <w:tcPr>
+            <w:tcBorders>
+              <w:top w:color="808080" w:space="0" w:sz="7" w:val="single"/>
+              <w:left w:color="808080" w:space="0" w:sz="7" w:val="single"/>
+              <w:bottom w:color="808080" w:space="0" w:sz="7" w:val="single"/>
+              <w:right w:color="808080" w:space="0" w:sz="7" w:val="single"/>
+            </w:tcBorders>
+            <w:tcMar>
+              <w:top w:w="0.0" w:type="dxa"/>
+              <w:left w:w="0.0" w:type="dxa"/>
+              <w:bottom w:w="0.0" w:type="dxa"/>
+              <w:right w:w="0.0" w:type="dxa"/>
+            </w:tcMar>
+            <w:vAlign w:val="center"/>
+          </w:tcPr>
+          <w:p>
+            <w:pPr>
+              <w:pStyle w:val="Heading3"/>
+              <w:keepNext w:val="0"/>
+              <w:keepLines w:val="0"/>
+              <w:spacing w:after="0" w:before="0" w:line="240" w:lineRule="auto"/>
+              <w:jc w:val="center"/>
+              <w:rPr>
+                <w:rFonts w:ascii="Malgun Gothic" w:cs="Malgun Gothic" w:eastAsia="Malgun Gothic" w:hAnsi="Malgun Gothic"/>
+                <w:color w:val="0000ff"/>
+                <w:sz w:val="22"/>
+                <w:szCs w:val="22"/>
+              </w:rPr>
+            </w:pPr>
+            <w:bookmarkStart w:colFirst="0" w:colLast="0" w:name="_d6fu8zjuee0s" w:id="1"/>
+            <w:bookmarkEnd w:id="1"/>
+            <w:r>
+              <w:rPr>
+                <w:rFonts w:ascii="Malgun Gothic" w:cs="Malgun Gothic" w:eastAsia="Malgun Gothic" w:hAnsi="Malgun Gothic"/>
+                <w:color w:val="0000ff"/>
+                <w:sz w:val="22"/>
+                <w:szCs w:val="22"/>
+                <w:rtl w:val="0"/>
+              </w:rPr>
+              <w:t xml:space="preserve">수영장에 갔더니 정원이 꽉 차서 못 들어갔어요</w:t>
+            </w:r>
+          </w:p>
+        </w:tc>
+        <w:tc>
+          <w:tcPr>
+            <w:tcBorders>
+              <w:top w:color="808080" w:space="0" w:sz="7" w:val="single"/>
+              <w:left w:color="808080" w:space="0" w:sz="7" w:val="single"/>
+              <w:bottom w:color="808080" w:space="0" w:sz="7" w:val="single"/>
+              <w:right w:color="808080" w:space="0" w:sz="7" w:val="single"/>
+            </w:tcBorders>
+            <w:tcMar>
+              <w:top w:w="0.0" w:type="dxa"/>
+              <w:left w:w="0.0" w:type="dxa"/>
+              <w:bottom w:w="0.0" w:type="dxa"/>
+              <w:right w:w="0.0" w:type="dxa"/>
+            </w:tcMar>
+            <w:vAlign w:val="center"/>
+          </w:tcPr>
+          <w:p>
+            <w:pPr>
+              <w:pStyle w:val="Heading3"/>
+              <w:keepNext w:val="0"/>
+              <w:keepLines w:val="0"/>
+              <w:spacing w:after="0" w:before="0" w:line="240" w:lineRule="auto"/>
+              <w:jc w:val="center"/>
+              <w:rPr>
+                <w:rFonts w:ascii="Malgun Gothic" w:cs="Malgun Gothic" w:eastAsia="Malgun Gothic" w:hAnsi="Malgun Gothic"/>
+                <w:color w:val="0000ff"/>
+                <w:sz w:val="22"/>
+                <w:szCs w:val="22"/>
+              </w:rPr>
+            </w:pPr>
+            <w:bookmarkStart w:colFirst="0" w:colLast="0" w:name="_d6fu8zjuee0s" w:id="1"/>
+            <w:bookmarkEnd w:id="1"/>
+            <w:r>
+              <w:rPr>
+                <w:rFonts w:ascii="Malgun Gothic" w:cs="Malgun Gothic" w:eastAsia="Malgun Gothic" w:hAnsi="Malgun Gothic"/>
+                <w:color w:val="0000ff"/>
+                <w:sz w:val="22"/>
+                <w:szCs w:val="22"/>
+                <w:rtl w:val="0"/>
+              </w:rPr>
+              <w:t xml:space="preserve">활동 취소·변경 접수와 시점 구간 · 인원이 정원을 넘을 때</w:t>
+            </w:r>
+          </w:p>
+        </w:tc>
+        <w:tc>
+          <w:tcPr>
+            <w:tcBorders>
+              <w:top w:color="808080" w:space="0" w:sz="7" w:val="single"/>
+              <w:left w:color="808080" w:space="0" w:sz="7" w:val="single"/>
+              <w:bottom w:color="808080" w:space="0" w:sz="7" w:val="single"/>
+              <w:right w:color="808080" w:space="0" w:sz="7" w:val="single"/>
+            </w:tcBorders>
+            <w:tcMar>
+              <w:top w:w="0.0" w:type="dxa"/>
+              <w:left w:w="0.0" w:type="dxa"/>
+              <w:bottom w:w="0.0" w:type="dxa"/>
+              <w:right w:w="0.0" w:type="dxa"/>
+            </w:tcMar>
+            <w:vAlign w:val="center"/>
+          </w:tcPr>
+          <w:p>
+            <w:pPr>
+              <w:pStyle w:val="Heading3"/>
+              <w:keepNext w:val="0"/>
+              <w:keepLines w:val="0"/>
+              <w:spacing w:after="0" w:before="0" w:line="240" w:lineRule="auto"/>
+              <w:jc w:val="center"/>
+              <w:rPr>
+                <w:rFonts w:ascii="Malgun Gothic" w:cs="Malgun Gothic" w:eastAsia="Malgun Gothic" w:hAnsi="Malgun Gothic"/>
+                <w:color w:val="0000ff"/>
+                <w:sz w:val="22"/>
+                <w:szCs w:val="22"/>
+              </w:rPr>
+            </w:pPr>
+            <w:bookmarkStart w:colFirst="0" w:colLast="0" w:name="_d6fu8zjuee0s" w:id="1"/>
+            <w:bookmarkEnd w:id="1"/>
+            <w:r>
+              <w:rPr>
+                <w:rFonts w:ascii="Malgun Gothic" w:cs="Malgun Gothic" w:eastAsia="Malgun Gothic" w:hAnsi="Malgun Gothic"/>
+                <w:color w:val="0000ff"/>
+                <w:sz w:val="22"/>
+                <w:szCs w:val="22"/>
+                <w:rtl w:val="0"/>
+              </w:rPr>
+              <w:t xml:space="preserve">0.351</w:t>
+            </w:r>
+          </w:p>
+        </w:tc>
+        <w:tc>
+          <w:tcPr>
+            <w:tcBorders>
+              <w:top w:color="808080" w:space="0" w:sz="7" w:val="single"/>
+              <w:left w:color="808080" w:space="0" w:sz="7" w:val="single"/>
+              <w:bottom w:color="808080" w:space="0" w:sz="7" w:val="single"/>
+              <w:right w:color="808080" w:space="0" w:sz="7" w:val="single"/>
+            </w:tcBorders>
+            <w:tcMar>
+              <w:top w:w="0.0" w:type="dxa"/>
+              <w:left w:w="0.0" w:type="dxa"/>
+              <w:bottom w:w="0.0" w:type="dxa"/>
+              <w:right w:w="0.0" w:type="dxa"/>
+            </w:tcMar>
+            <w:vAlign w:val="center"/>
+          </w:tcPr>
+          <w:p>
+            <w:pPr>
+              <w:pStyle w:val="Heading3"/>
+              <w:keepNext w:val="0"/>
+              <w:keepLines w:val="0"/>
+              <w:spacing w:after="0" w:before="0" w:line="240" w:lineRule="auto"/>
+              <w:jc w:val="center"/>
+              <w:rPr>
+                <w:rFonts w:ascii="Malgun Gothic" w:cs="Malgun Gothic" w:eastAsia="Malgun Gothic" w:hAnsi="Malgun Gothic"/>
+                <w:color w:val="0000ff"/>
+                <w:sz w:val="22"/>
+                <w:szCs w:val="22"/>
+              </w:rPr>
+            </w:pPr>
+            <w:bookmarkStart w:colFirst="0" w:colLast="0" w:name="_d6fu8zjuee0s" w:id="1"/>
+            <w:bookmarkEnd w:id="1"/>
+            <w:r>
+              <w:rPr>
+                <w:rFonts w:ascii="Malgun Gothic" w:cs="Malgun Gothic" w:eastAsia="Malgun Gothic" w:hAnsi="Malgun Gothic"/>
+                <w:color w:val="0000ff"/>
+                <w:sz w:val="22"/>
+                <w:szCs w:val="22"/>
+                <w:rtl w:val="0"/>
+              </w:rPr>
+              <w:t xml:space="preserve">미적중(관련 문서 없음)</w:t>
+            </w:r>
+          </w:p>
+        </w:tc>
+      </w:tr>
+      <w:tr>
+        <w:trPr>
+          <w:cantSplit w:val="0"/>
+          <w:trHeight w:val="566.9291338582677" w:hRule="atLeast"/>
+          <w:tblHeader w:val="0"/>
+        </w:trPr>
+        <w:tc>
+          <w:tcPr>
+            <w:tcBorders>
+              <w:top w:color="808080" w:space="0" w:sz="7" w:val="single"/>
+              <w:left w:color="808080" w:space="0" w:sz="7" w:val="single"/>
+              <w:bottom w:color="808080" w:space="0" w:sz="7" w:val="single"/>
+              <w:right w:color="808080" w:space="0" w:sz="7" w:val="single"/>
+            </w:tcBorders>
+            <w:tcMar>
+              <w:top w:w="0.0" w:type="dxa"/>
+              <w:left w:w="0.0" w:type="dxa"/>
+              <w:bottom w:w="0.0" w:type="dxa"/>
+              <w:right w:w="0.0" w:type="dxa"/>
+            </w:tcMar>
+            <w:vAlign w:val="center"/>
+          </w:tcPr>
+          <w:p>
+            <w:pPr>
+              <w:pStyle w:val="Heading3"/>
+              <w:keepNext w:val="0"/>
+              <w:keepLines w:val="0"/>
+              <w:spacing w:after="0" w:before="0" w:line="240" w:lineRule="auto"/>
+              <w:jc w:val="center"/>
+              <w:rPr>
+                <w:rFonts w:ascii="Malgun Gothic" w:cs="Malgun Gothic" w:eastAsia="Malgun Gothic" w:hAnsi="Malgun Gothic"/>
+                <w:color w:val="0000ff"/>
+                <w:sz w:val="22"/>
+                <w:szCs w:val="22"/>
+              </w:rPr>
+            </w:pPr>
+            <w:bookmarkStart w:colFirst="0" w:colLast="0" w:name="_d6fu8zjuee0s" w:id="1"/>
+            <w:bookmarkEnd w:id="1"/>
+            <w:r>
+              <w:rPr>
+                <w:rFonts w:ascii="Malgun Gothic" w:cs="Malgun Gothic" w:eastAsia="Malgun Gothic" w:hAnsi="Malgun Gothic"/>
+                <w:color w:val="0000ff"/>
+                <w:sz w:val="22"/>
+                <w:szCs w:val="22"/>
+                <w:rtl w:val="0"/>
+              </w:rPr>
+              <w:t xml:space="preserve">N08</w:t>
+            </w:r>
+          </w:p>
+        </w:tc>
+        <w:tc>
+          <w:tcPr>
+            <w:tcBorders>
+              <w:top w:color="808080" w:space="0" w:sz="7" w:val="single"/>
+              <w:left w:color="808080" w:space="0" w:sz="7" w:val="single"/>
+              <w:bottom w:color="808080" w:space="0" w:sz="7" w:val="single"/>
+              <w:right w:color="808080" w:space="0" w:sz="7" w:val="single"/>
+            </w:tcBorders>
+            <w:tcMar>
+              <w:top w:w="0.0" w:type="dxa"/>
+              <w:left w:w="0.0" w:type="dxa"/>
+              <w:bottom w:w="0.0" w:type="dxa"/>
+              <w:right w:w="0.0" w:type="dxa"/>
+            </w:tcMar>
+            <w:vAlign w:val="center"/>
+          </w:tcPr>
+          <w:p>
+            <w:pPr>
+              <w:pStyle w:val="Heading3"/>
+              <w:keepNext w:val="0"/>
+              <w:keepLines w:val="0"/>
+              <w:spacing w:after="0" w:before="0" w:line="240" w:lineRule="auto"/>
+              <w:jc w:val="center"/>
+              <w:rPr>
+                <w:rFonts w:ascii="Malgun Gothic" w:cs="Malgun Gothic" w:eastAsia="Malgun Gothic" w:hAnsi="Malgun Gothic"/>
+                <w:color w:val="0000ff"/>
+                <w:sz w:val="22"/>
+                <w:szCs w:val="22"/>
+              </w:rPr>
+            </w:pPr>
+            <w:bookmarkStart w:colFirst="0" w:colLast="0" w:name="_d6fu8zjuee0s" w:id="1"/>
+            <w:bookmarkEnd w:id="1"/>
+            <w:r>
+              <w:rPr>
+                <w:rFonts w:ascii="Malgun Gothic" w:cs="Malgun Gothic" w:eastAsia="Malgun Gothic" w:hAnsi="Malgun Gothic"/>
+                <w:color w:val="0000ff"/>
+                <w:sz w:val="22"/>
+                <w:szCs w:val="22"/>
+                <w:rtl w:val="0"/>
+              </w:rPr>
+              <w:t xml:space="preserve">시설 사정으로 이용권을 해지하면 남은 기간만큼 돌려주나요?</w:t>
+            </w:r>
+          </w:p>
+        </w:tc>
+        <w:tc>
+          <w:tcPr>
+            <w:tcBorders>
+              <w:top w:color="808080" w:space="0" w:sz="7" w:val="single"/>
+              <w:left w:color="808080" w:space="0" w:sz="7" w:val="single"/>
+              <w:bottom w:color="808080" w:space="0" w:sz="7" w:val="single"/>
+              <w:right w:color="808080" w:space="0" w:sz="7" w:val="single"/>
+            </w:tcBorders>
+            <w:tcMar>
+              <w:top w:w="0.0" w:type="dxa"/>
+              <w:left w:w="0.0" w:type="dxa"/>
+              <w:bottom w:w="0.0" w:type="dxa"/>
+              <w:right w:w="0.0" w:type="dxa"/>
+            </w:tcMar>
+            <w:vAlign w:val="center"/>
+          </w:tcPr>
+          <w:p>
+            <w:pPr>
+              <w:pStyle w:val="Heading3"/>
+              <w:keepNext w:val="0"/>
+              <w:keepLines w:val="0"/>
+              <w:spacing w:after="0" w:before="0" w:line="240" w:lineRule="auto"/>
+              <w:jc w:val="center"/>
+              <w:rPr>
+                <w:rFonts w:ascii="Malgun Gothic" w:cs="Malgun Gothic" w:eastAsia="Malgun Gothic" w:hAnsi="Malgun Gothic"/>
+                <w:color w:val="0000ff"/>
+                <w:sz w:val="22"/>
+                <w:szCs w:val="22"/>
+              </w:rPr>
+            </w:pPr>
+            <w:bookmarkStart w:colFirst="0" w:colLast="0" w:name="_d6fu8zjuee0s" w:id="1"/>
+            <w:bookmarkEnd w:id="1"/>
+            <w:r>
+              <w:rPr>
+                <w:rFonts w:ascii="Malgun Gothic" w:cs="Malgun Gothic" w:eastAsia="Malgun Gothic" w:hAnsi="Malgun Gothic"/>
+                <w:color w:val="0000ff"/>
+                <w:sz w:val="22"/>
+                <w:szCs w:val="22"/>
+                <w:rtl w:val="0"/>
+              </w:rPr>
+              <w:t xml:space="preserve">활동 취소·변경 접수와 시점 구간 · 무료 구간은 72시간이다</w:t>
+            </w:r>
+          </w:p>
+        </w:tc>
+        <w:tc>
+          <w:tcPr>
+            <w:tcBorders>
+              <w:top w:color="808080" w:space="0" w:sz="7" w:val="single"/>
+              <w:left w:color="808080" w:space="0" w:sz="7" w:val="single"/>
+              <w:bottom w:color="808080" w:space="0" w:sz="7" w:val="single"/>
+              <w:right w:color="808080" w:space="0" w:sz="7" w:val="single"/>
+            </w:tcBorders>
+            <w:tcMar>
+              <w:top w:w="0.0" w:type="dxa"/>
+              <w:left w:w="0.0" w:type="dxa"/>
+              <w:bottom w:w="0.0" w:type="dxa"/>
+              <w:right w:w="0.0" w:type="dxa"/>
+            </w:tcMar>
+            <w:vAlign w:val="center"/>
+          </w:tcPr>
+          <w:p>
+            <w:pPr>
+              <w:pStyle w:val="Heading3"/>
+              <w:keepNext w:val="0"/>
+              <w:keepLines w:val="0"/>
+              <w:spacing w:after="0" w:before="0" w:line="240" w:lineRule="auto"/>
+              <w:jc w:val="center"/>
+              <w:rPr>
+                <w:rFonts w:ascii="Malgun Gothic" w:cs="Malgun Gothic" w:eastAsia="Malgun Gothic" w:hAnsi="Malgun Gothic"/>
+                <w:color w:val="0000ff"/>
+                <w:sz w:val="22"/>
+                <w:szCs w:val="22"/>
+              </w:rPr>
+            </w:pPr>
+            <w:bookmarkStart w:colFirst="0" w:colLast="0" w:name="_d6fu8zjuee0s" w:id="1"/>
+            <w:bookmarkEnd w:id="1"/>
+            <w:r>
+              <w:rPr>
+                <w:rFonts w:ascii="Malgun Gothic" w:cs="Malgun Gothic" w:eastAsia="Malgun Gothic" w:hAnsi="Malgun Gothic"/>
+                <w:color w:val="0000ff"/>
+                <w:sz w:val="22"/>
+                <w:szCs w:val="22"/>
+                <w:rtl w:val="0"/>
+              </w:rPr>
+              <w:t xml:space="preserve">0.439</w:t>
+            </w:r>
+          </w:p>
+        </w:tc>
+        <w:tc>
+          <w:tcPr>
+            <w:tcBorders>
+              <w:top w:color="808080" w:space="0" w:sz="7" w:val="single"/>
+              <w:left w:color="808080" w:space="0" w:sz="7" w:val="single"/>
+              <w:bottom w:color="808080" w:space="0" w:sz="7" w:val="single"/>
+              <w:right w:color="808080" w:space="0" w:sz="7" w:val="single"/>
+            </w:tcBorders>
+            <w:tcMar>
+              <w:top w:w="0.0" w:type="dxa"/>
+              <w:left w:w="0.0" w:type="dxa"/>
+              <w:bottom w:w="0.0" w:type="dxa"/>
+              <w:right w:w="0.0" w:type="dxa"/>
+            </w:tcMar>
+            <w:vAlign w:val="center"/>
+          </w:tcPr>
+          <w:p>
+            <w:pPr>
+              <w:pStyle w:val="Heading3"/>
+              <w:keepNext w:val="0"/>
+              <w:keepLines w:val="0"/>
+              <w:spacing w:after="0" w:before="0" w:line="240" w:lineRule="auto"/>
+              <w:jc w:val="center"/>
+              <w:rPr>
+                <w:rFonts w:ascii="Malgun Gothic" w:cs="Malgun Gothic" w:eastAsia="Malgun Gothic" w:hAnsi="Malgun Gothic"/>
+                <w:color w:val="0000ff"/>
+                <w:sz w:val="22"/>
+                <w:szCs w:val="22"/>
+              </w:rPr>
+            </w:pPr>
+            <w:bookmarkStart w:colFirst="0" w:colLast="0" w:name="_d6fu8zjuee0s" w:id="1"/>
+            <w:bookmarkEnd w:id="1"/>
+            <w:r>
+              <w:rPr>
+                <w:rFonts w:ascii="Malgun Gothic" w:cs="Malgun Gothic" w:eastAsia="Malgun Gothic" w:hAnsi="Malgun Gothic"/>
+                <w:color w:val="0000ff"/>
+                <w:sz w:val="22"/>
+                <w:szCs w:val="22"/>
+                <w:rtl w:val="0"/>
+              </w:rPr>
+              <w:t xml:space="preserve">적중(상위 3위)</w:t>
+            </w:r>
+          </w:p>
+        </w:tc>
+      </w:tr>
+      <w:tr>
+        <w:trPr>
+          <w:cantSplit w:val="0"/>
+          <w:trHeight w:val="566.9291338582677" w:hRule="atLeast"/>
+          <w:tblHeader w:val="0"/>
+        </w:trPr>
+        <w:tc>
+          <w:tcPr>
+            <w:tcBorders>
+              <w:top w:color="808080" w:space="0" w:sz="7" w:val="single"/>
+              <w:left w:color="808080" w:space="0" w:sz="7" w:val="single"/>
+              <w:bottom w:color="808080" w:space="0" w:sz="7" w:val="single"/>
+              <w:right w:color="808080" w:space="0" w:sz="7" w:val="single"/>
+            </w:tcBorders>
+            <w:tcMar>
+              <w:top w:w="0.0" w:type="dxa"/>
+              <w:left w:w="0.0" w:type="dxa"/>
+              <w:bottom w:w="0.0" w:type="dxa"/>
+              <w:right w:w="0.0" w:type="dxa"/>
+            </w:tcMar>
+            <w:vAlign w:val="center"/>
+          </w:tcPr>
+          <w:p>
+            <w:pPr>
+              <w:pStyle w:val="Heading3"/>
+              <w:keepNext w:val="0"/>
+              <w:keepLines w:val="0"/>
+              <w:spacing w:after="0" w:before="0" w:line="240" w:lineRule="auto"/>
+              <w:jc w:val="center"/>
+              <w:rPr>
+                <w:rFonts w:ascii="Malgun Gothic" w:cs="Malgun Gothic" w:eastAsia="Malgun Gothic" w:hAnsi="Malgun Gothic"/>
+                <w:color w:val="0000ff"/>
+                <w:sz w:val="22"/>
+                <w:szCs w:val="22"/>
+              </w:rPr>
+            </w:pPr>
+            <w:bookmarkStart w:colFirst="0" w:colLast="0" w:name="_d6fu8zjuee0s" w:id="1"/>
+            <w:bookmarkEnd w:id="1"/>
+            <w:r>
+              <w:rPr>
+                <w:rFonts w:ascii="Malgun Gothic" w:cs="Malgun Gothic" w:eastAsia="Malgun Gothic" w:hAnsi="Malgun Gothic"/>
+                <w:color w:val="0000ff"/>
+                <w:sz w:val="22"/>
+                <w:szCs w:val="22"/>
+                <w:rtl w:val="0"/>
+              </w:rPr>
+              <w:t xml:space="preserve">N09</w:t>
+            </w:r>
+          </w:p>
+        </w:tc>
+        <w:tc>
+          <w:tcPr>
+            <w:tcBorders>
+              <w:top w:color="808080" w:space="0" w:sz="7" w:val="single"/>
+              <w:left w:color="808080" w:space="0" w:sz="7" w:val="single"/>
+              <w:bottom w:color="808080" w:space="0" w:sz="7" w:val="single"/>
+              <w:right w:color="808080" w:space="0" w:sz="7" w:val="single"/>
+            </w:tcBorders>
+            <w:tcMar>
+              <w:top w:w="0.0" w:type="dxa"/>
+              <w:left w:w="0.0" w:type="dxa"/>
+              <w:bottom w:w="0.0" w:type="dxa"/>
+              <w:right w:w="0.0" w:type="dxa"/>
+            </w:tcMar>
+            <w:vAlign w:val="center"/>
+          </w:tcPr>
+          <w:p>
+            <w:pPr>
+              <w:pStyle w:val="Heading3"/>
+              <w:keepNext w:val="0"/>
+              <w:keepLines w:val="0"/>
+              <w:spacing w:after="0" w:before="0" w:line="240" w:lineRule="auto"/>
+              <w:jc w:val="center"/>
+              <w:rPr>
+                <w:rFonts w:ascii="Malgun Gothic" w:cs="Malgun Gothic" w:eastAsia="Malgun Gothic" w:hAnsi="Malgun Gothic"/>
+                <w:color w:val="0000ff"/>
+                <w:sz w:val="22"/>
+                <w:szCs w:val="22"/>
+              </w:rPr>
+            </w:pPr>
+            <w:bookmarkStart w:colFirst="0" w:colLast="0" w:name="_d6fu8zjuee0s" w:id="1"/>
+            <w:bookmarkEnd w:id="1"/>
+            <w:r>
+              <w:rPr>
+                <w:rFonts w:ascii="Malgun Gothic" w:cs="Malgun Gothic" w:eastAsia="Malgun Gothic" w:hAnsi="Malgun Gothic"/>
+                <w:color w:val="0000ff"/>
+                <w:sz w:val="22"/>
+                <w:szCs w:val="22"/>
+                <w:rtl w:val="0"/>
+              </w:rPr>
+              <w:t xml:space="preserve">여행사가 최소 인원 미달로 취소하면서 늦게 알려줬어요. 배상은요?</w:t>
+            </w:r>
+          </w:p>
+        </w:tc>
+        <w:tc>
+          <w:tcPr>
+            <w:tcBorders>
+              <w:top w:color="808080" w:space="0" w:sz="7" w:val="single"/>
+              <w:left w:color="808080" w:space="0" w:sz="7" w:val="single"/>
+              <w:bottom w:color="808080" w:space="0" w:sz="7" w:val="single"/>
+              <w:right w:color="808080" w:space="0" w:sz="7" w:val="single"/>
+            </w:tcBorders>
+            <w:tcMar>
+              <w:top w:w="0.0" w:type="dxa"/>
+              <w:left w:w="0.0" w:type="dxa"/>
+              <w:bottom w:w="0.0" w:type="dxa"/>
+              <w:right w:w="0.0" w:type="dxa"/>
+            </w:tcMar>
+            <w:vAlign w:val="center"/>
+          </w:tcPr>
+          <w:p>
+            <w:pPr>
+              <w:pStyle w:val="Heading3"/>
+              <w:keepNext w:val="0"/>
+              <w:keepLines w:val="0"/>
+              <w:spacing w:after="0" w:before="0" w:line="240" w:lineRule="auto"/>
+              <w:jc w:val="center"/>
+              <w:rPr>
+                <w:rFonts w:ascii="Malgun Gothic" w:cs="Malgun Gothic" w:eastAsia="Malgun Gothic" w:hAnsi="Malgun Gothic"/>
+                <w:color w:val="0000ff"/>
+                <w:sz w:val="22"/>
+                <w:szCs w:val="22"/>
+              </w:rPr>
+            </w:pPr>
+            <w:bookmarkStart w:colFirst="0" w:colLast="0" w:name="_d6fu8zjuee0s" w:id="1"/>
+            <w:bookmarkEnd w:id="1"/>
+            <w:r>
+              <w:rPr>
+                <w:rFonts w:ascii="Malgun Gothic" w:cs="Malgun Gothic" w:eastAsia="Malgun Gothic" w:hAnsi="Malgun Gothic"/>
+                <w:color w:val="0000ff"/>
+                <w:sz w:val="22"/>
+                <w:szCs w:val="22"/>
+                <w:rtl w:val="0"/>
+              </w:rPr>
+              <w:t xml:space="preserve">소비자분쟁해결기준 — 국내여행 · 인원 미달과 불가항력으로 취소하는 경우</w:t>
+            </w:r>
+          </w:p>
+        </w:tc>
+        <w:tc>
+          <w:tcPr>
+            <w:tcBorders>
+              <w:top w:color="808080" w:space="0" w:sz="7" w:val="single"/>
+              <w:left w:color="808080" w:space="0" w:sz="7" w:val="single"/>
+              <w:bottom w:color="808080" w:space="0" w:sz="7" w:val="single"/>
+              <w:right w:color="808080" w:space="0" w:sz="7" w:val="single"/>
+            </w:tcBorders>
+            <w:tcMar>
+              <w:top w:w="0.0" w:type="dxa"/>
+              <w:left w:w="0.0" w:type="dxa"/>
+              <w:bottom w:w="0.0" w:type="dxa"/>
+              <w:right w:w="0.0" w:type="dxa"/>
+            </w:tcMar>
+            <w:vAlign w:val="center"/>
+          </w:tcPr>
+          <w:p>
+            <w:pPr>
+              <w:pStyle w:val="Heading3"/>
+              <w:keepNext w:val="0"/>
+              <w:keepLines w:val="0"/>
+              <w:spacing w:after="0" w:before="0" w:line="240" w:lineRule="auto"/>
+              <w:jc w:val="center"/>
+              <w:rPr>
+                <w:rFonts w:ascii="Malgun Gothic" w:cs="Malgun Gothic" w:eastAsia="Malgun Gothic" w:hAnsi="Malgun Gothic"/>
+                <w:color w:val="0000ff"/>
+                <w:sz w:val="22"/>
+                <w:szCs w:val="22"/>
+              </w:rPr>
+            </w:pPr>
+            <w:bookmarkStart w:colFirst="0" w:colLast="0" w:name="_d6fu8zjuee0s" w:id="1"/>
+            <w:bookmarkEnd w:id="1"/>
+            <w:r>
+              <w:rPr>
+                <w:rFonts w:ascii="Malgun Gothic" w:cs="Malgun Gothic" w:eastAsia="Malgun Gothic" w:hAnsi="Malgun Gothic"/>
+                <w:color w:val="0000ff"/>
+                <w:sz w:val="22"/>
+                <w:szCs w:val="22"/>
+                <w:rtl w:val="0"/>
+              </w:rPr>
+              <w:t xml:space="preserve">0.548</w:t>
+            </w:r>
+          </w:p>
+        </w:tc>
+        <w:tc>
+          <w:tcPr>
+            <w:tcBorders>
+              <w:top w:color="808080" w:space="0" w:sz="7" w:val="single"/>
+              <w:left w:color="808080" w:space="0" w:sz="7" w:val="single"/>
+              <w:bottom w:color="808080" w:space="0" w:sz="7" w:val="single"/>
+              <w:right w:color="808080" w:space="0" w:sz="7" w:val="single"/>
+            </w:tcBorders>
+            <w:tcMar>
+              <w:top w:w="0.0" w:type="dxa"/>
+              <w:left w:w="0.0" w:type="dxa"/>
+              <w:bottom w:w="0.0" w:type="dxa"/>
+              <w:right w:w="0.0" w:type="dxa"/>
+            </w:tcMar>
+            <w:vAlign w:val="center"/>
+          </w:tcPr>
+          <w:p>
+            <w:pPr>
+              <w:pStyle w:val="Heading3"/>
+              <w:keepNext w:val="0"/>
+              <w:keepLines w:val="0"/>
+              <w:spacing w:after="0" w:before="0" w:line="240" w:lineRule="auto"/>
+              <w:jc w:val="center"/>
+              <w:rPr>
+                <w:rFonts w:ascii="Malgun Gothic" w:cs="Malgun Gothic" w:eastAsia="Malgun Gothic" w:hAnsi="Malgun Gothic"/>
+                <w:color w:val="0000ff"/>
+                <w:sz w:val="22"/>
+                <w:szCs w:val="22"/>
+              </w:rPr>
+            </w:pPr>
+            <w:bookmarkStart w:colFirst="0" w:colLast="0" w:name="_d6fu8zjuee0s" w:id="1"/>
+            <w:bookmarkEnd w:id="1"/>
+            <w:r>
+              <w:rPr>
+                <w:rFonts w:ascii="Malgun Gothic" w:cs="Malgun Gothic" w:eastAsia="Malgun Gothic" w:hAnsi="Malgun Gothic"/>
+                <w:color w:val="0000ff"/>
+                <w:sz w:val="22"/>
+                <w:szCs w:val="22"/>
+                <w:rtl w:val="0"/>
+              </w:rPr>
+              <w:t xml:space="preserve">적중(상위 1위)</w:t>
+            </w:r>
+          </w:p>
+        </w:tc>
+      </w:tr>
+      <w:tr>
+        <w:trPr>
+          <w:cantSplit w:val="0"/>
+          <w:trHeight w:val="566.9291338582677" w:hRule="atLeast"/>
+          <w:tblHeader w:val="0"/>
+        </w:trPr>
+        <w:tc>
+          <w:tcPr>
+            <w:tcBorders>
+              <w:top w:color="808080" w:space="0" w:sz="7" w:val="single"/>
+              <w:left w:color="808080" w:space="0" w:sz="7" w:val="single"/>
+              <w:bottom w:color="808080" w:space="0" w:sz="7" w:val="single"/>
+              <w:right w:color="808080" w:space="0" w:sz="7" w:val="single"/>
+            </w:tcBorders>
+            <w:tcMar>
+              <w:top w:w="0.0" w:type="dxa"/>
+              <w:left w:w="0.0" w:type="dxa"/>
+              <w:bottom w:w="0.0" w:type="dxa"/>
+              <w:right w:w="0.0" w:type="dxa"/>
+            </w:tcMar>
+            <w:vAlign w:val="center"/>
+          </w:tcPr>
+          <w:p>
+            <w:pPr>
+              <w:pStyle w:val="Heading3"/>
+              <w:keepNext w:val="0"/>
+              <w:keepLines w:val="0"/>
+              <w:spacing w:after="0" w:before="0" w:line="240" w:lineRule="auto"/>
+              <w:jc w:val="center"/>
+              <w:rPr>
+                <w:rFonts w:ascii="Malgun Gothic" w:cs="Malgun Gothic" w:eastAsia="Malgun Gothic" w:hAnsi="Malgun Gothic"/>
+                <w:color w:val="0000ff"/>
+                <w:sz w:val="22"/>
+                <w:szCs w:val="22"/>
+              </w:rPr>
+            </w:pPr>
+            <w:bookmarkStart w:colFirst="0" w:colLast="0" w:name="_d6fu8zjuee0s" w:id="1"/>
+            <w:bookmarkEnd w:id="1"/>
+            <w:r>
+              <w:rPr>
+                <w:rFonts w:ascii="Malgun Gothic" w:cs="Malgun Gothic" w:eastAsia="Malgun Gothic" w:hAnsi="Malgun Gothic"/>
+                <w:color w:val="0000ff"/>
+                <w:sz w:val="22"/>
+                <w:szCs w:val="22"/>
+                <w:rtl w:val="0"/>
+              </w:rPr>
+              <w:t xml:space="preserve">N10</w:t>
+            </w:r>
+          </w:p>
+        </w:tc>
+        <w:tc>
+          <w:tcPr>
+            <w:tcBorders>
+              <w:top w:color="808080" w:space="0" w:sz="7" w:val="single"/>
+              <w:left w:color="808080" w:space="0" w:sz="7" w:val="single"/>
+              <w:bottom w:color="808080" w:space="0" w:sz="7" w:val="single"/>
+              <w:right w:color="808080" w:space="0" w:sz="7" w:val="single"/>
+            </w:tcBorders>
+            <w:tcMar>
+              <w:top w:w="0.0" w:type="dxa"/>
+              <w:left w:w="0.0" w:type="dxa"/>
+              <w:bottom w:w="0.0" w:type="dxa"/>
+              <w:right w:w="0.0" w:type="dxa"/>
+            </w:tcMar>
+            <w:vAlign w:val="center"/>
+          </w:tcPr>
+          <w:p>
+            <w:pPr>
+              <w:pStyle w:val="Heading3"/>
+              <w:keepNext w:val="0"/>
+              <w:keepLines w:val="0"/>
+              <w:spacing w:after="0" w:before="0" w:line="240" w:lineRule="auto"/>
+              <w:jc w:val="center"/>
+              <w:rPr>
+                <w:rFonts w:ascii="Malgun Gothic" w:cs="Malgun Gothic" w:eastAsia="Malgun Gothic" w:hAnsi="Malgun Gothic"/>
+                <w:color w:val="0000ff"/>
+                <w:sz w:val="22"/>
+                <w:szCs w:val="22"/>
+              </w:rPr>
+            </w:pPr>
+            <w:bookmarkStart w:colFirst="0" w:colLast="0" w:name="_d6fu8zjuee0s" w:id="1"/>
+            <w:bookmarkEnd w:id="1"/>
+            <w:r>
+              <w:rPr>
+                <w:rFonts w:ascii="Malgun Gothic" w:cs="Malgun Gothic" w:eastAsia="Malgun Gothic" w:hAnsi="Malgun Gothic"/>
+                <w:color w:val="0000ff"/>
+                <w:sz w:val="22"/>
+                <w:szCs w:val="22"/>
+                <w:rtl w:val="0"/>
+              </w:rPr>
+              <w:t xml:space="preserve">공기가 나쁜 날에는 야외 체험 일정을 바꿔 주나요?</w:t>
+            </w:r>
+          </w:p>
+        </w:tc>
+        <w:tc>
+          <w:tcPr>
+            <w:tcBorders>
+              <w:top w:color="808080" w:space="0" w:sz="7" w:val="single"/>
+              <w:left w:color="808080" w:space="0" w:sz="7" w:val="single"/>
+              <w:bottom w:color="808080" w:space="0" w:sz="7" w:val="single"/>
+              <w:right w:color="808080" w:space="0" w:sz="7" w:val="single"/>
+            </w:tcBorders>
+            <w:tcMar>
+              <w:top w:w="0.0" w:type="dxa"/>
+              <w:left w:w="0.0" w:type="dxa"/>
+              <w:bottom w:w="0.0" w:type="dxa"/>
+              <w:right w:w="0.0" w:type="dxa"/>
+            </w:tcMar>
+            <w:vAlign w:val="center"/>
+          </w:tcPr>
+          <w:p>
+            <w:pPr>
+              <w:pStyle w:val="Heading3"/>
+              <w:keepNext w:val="0"/>
+              <w:keepLines w:val="0"/>
+              <w:spacing w:after="0" w:before="0" w:line="240" w:lineRule="auto"/>
+              <w:jc w:val="center"/>
+              <w:rPr>
+                <w:rFonts w:ascii="Malgun Gothic" w:cs="Malgun Gothic" w:eastAsia="Malgun Gothic" w:hAnsi="Malgun Gothic"/>
+                <w:color w:val="0000ff"/>
+                <w:sz w:val="22"/>
+                <w:szCs w:val="22"/>
+              </w:rPr>
+            </w:pPr>
+            <w:bookmarkStart w:colFirst="0" w:colLast="0" w:name="_d6fu8zjuee0s" w:id="1"/>
+            <w:bookmarkEnd w:id="1"/>
+            <w:r>
+              <w:rPr>
+                <w:rFonts w:ascii="Malgun Gothic" w:cs="Malgun Gothic" w:eastAsia="Malgun Gothic" w:hAnsi="Malgun Gothic"/>
+                <w:color w:val="0000ff"/>
+                <w:sz w:val="22"/>
+                <w:szCs w:val="22"/>
+                <w:rtl w:val="0"/>
+              </w:rPr>
+              <w:t xml:space="preserve">날씨로 활동을 바꾸는 경우 · 날씨로 활동을 바꾸는 경우</w:t>
+            </w:r>
+          </w:p>
+        </w:tc>
+        <w:tc>
+          <w:tcPr>
+            <w:tcBorders>
+              <w:top w:color="808080" w:space="0" w:sz="7" w:val="single"/>
+              <w:left w:color="808080" w:space="0" w:sz="7" w:val="single"/>
+              <w:bottom w:color="808080" w:space="0" w:sz="7" w:val="single"/>
+              <w:right w:color="808080" w:space="0" w:sz="7" w:val="single"/>
+            </w:tcBorders>
+            <w:tcMar>
+              <w:top w:w="0.0" w:type="dxa"/>
+              <w:left w:w="0.0" w:type="dxa"/>
+              <w:bottom w:w="0.0" w:type="dxa"/>
+              <w:right w:w="0.0" w:type="dxa"/>
+            </w:tcMar>
+            <w:vAlign w:val="center"/>
+          </w:tcPr>
+          <w:p>
+            <w:pPr>
+              <w:pStyle w:val="Heading3"/>
+              <w:keepNext w:val="0"/>
+              <w:keepLines w:val="0"/>
+              <w:spacing w:after="0" w:before="0" w:line="240" w:lineRule="auto"/>
+              <w:jc w:val="center"/>
+              <w:rPr>
+                <w:rFonts w:ascii="Malgun Gothic" w:cs="Malgun Gothic" w:eastAsia="Malgun Gothic" w:hAnsi="Malgun Gothic"/>
+                <w:color w:val="0000ff"/>
+                <w:sz w:val="22"/>
+                <w:szCs w:val="22"/>
+              </w:rPr>
+            </w:pPr>
+            <w:bookmarkStart w:colFirst="0" w:colLast="0" w:name="_d6fu8zjuee0s" w:id="1"/>
+            <w:bookmarkEnd w:id="1"/>
+            <w:r>
+              <w:rPr>
+                <w:rFonts w:ascii="Malgun Gothic" w:cs="Malgun Gothic" w:eastAsia="Malgun Gothic" w:hAnsi="Malgun Gothic"/>
+                <w:color w:val="0000ff"/>
+                <w:sz w:val="22"/>
+                <w:szCs w:val="22"/>
+                <w:rtl w:val="0"/>
+              </w:rPr>
+              <w:t xml:space="preserve">0.525</w:t>
+            </w:r>
+          </w:p>
+        </w:tc>
+        <w:tc>
+          <w:tcPr>
+            <w:tcBorders>
+              <w:top w:color="808080" w:space="0" w:sz="7" w:val="single"/>
+              <w:left w:color="808080" w:space="0" w:sz="7" w:val="single"/>
+              <w:bottom w:color="808080" w:space="0" w:sz="7" w:val="single"/>
+              <w:right w:color="808080" w:space="0" w:sz="7" w:val="single"/>
+            </w:tcBorders>
+            <w:tcMar>
+              <w:top w:w="0.0" w:type="dxa"/>
+              <w:left w:w="0.0" w:type="dxa"/>
+              <w:bottom w:w="0.0" w:type="dxa"/>
+              <w:right w:w="0.0" w:type="dxa"/>
+            </w:tcMar>
+            <w:vAlign w:val="center"/>
+          </w:tcPr>
+          <w:p>
+            <w:pPr>
+              <w:pStyle w:val="Heading3"/>
+              <w:keepNext w:val="0"/>
+              <w:keepLines w:val="0"/>
+              <w:spacing w:after="0" w:before="0" w:line="240" w:lineRule="auto"/>
+              <w:jc w:val="center"/>
+              <w:rPr>
+                <w:rFonts w:ascii="Malgun Gothic" w:cs="Malgun Gothic" w:eastAsia="Malgun Gothic" w:hAnsi="Malgun Gothic"/>
+                <w:color w:val="0000ff"/>
+                <w:sz w:val="22"/>
+                <w:szCs w:val="22"/>
+              </w:rPr>
+            </w:pPr>
+            <w:bookmarkStart w:colFirst="0" w:colLast="0" w:name="_d6fu8zjuee0s" w:id="1"/>
+            <w:bookmarkEnd w:id="1"/>
+            <w:r>
+              <w:rPr>
+                <w:rFonts w:ascii="Malgun Gothic" w:cs="Malgun Gothic" w:eastAsia="Malgun Gothic" w:hAnsi="Malgun Gothic"/>
+                <w:color w:val="0000ff"/>
+                <w:sz w:val="22"/>
+                <w:szCs w:val="22"/>
+                <w:rtl w:val="0"/>
+              </w:rPr>
+              <w:t xml:space="preserve">적중(상위 1위)</w:t>
+            </w:r>
+          </w:p>
+        </w:tc>
+      </w:tr>
+    </w:tbl>
+    <w:p>
+      <w:pPr>
         <w:numPr>
           <w:ilvl w:val="0"/>
           <w:numId w:val="6"/>
@@ -18623,6 +21197,286 @@
           <w:sz w:val="17"/>
         </w:rPr>
         <w:t xml:space="preserve">Hit@3 12/20 · Hit@1 8/20 · 문서 단위 16/20</w:t>
+      </w:r>
+    </w:p>
+    <w:p>
+      <w:pPr>
+        <w:spacing w:after="240" w:before="240" w:lineRule="auto"/>
+        <w:ind w:left="720" w:firstLine="0"/>
+        <w:rPr>
+          <w:rFonts w:ascii="Malgun Gothic" w:cs="Malgun Gothic" w:eastAsia="Malgun Gothic" w:hAnsi="Malgun Gothic"/>
+          <w:b w:val="0"/>
+          <w:bCs w:val="0"/>
+        </w:rPr>
+      </w:pPr>
+      <w:r>
+        <w:rPr>
+          <w:color w:val="0000ff"/>
+          <w:rtl w:val="0"/>
+          <w:rFonts w:ascii="Consolas" w:hAnsi="Consolas"/>
+          <w:sz w:val="17"/>
+        </w:rPr>
+        <w:t xml:space="preserve"/>
+      </w:r>
+    </w:p>
+    <w:p>
+      <w:pPr>
+        <w:spacing w:after="240" w:before="240" w:lineRule="auto"/>
+        <w:ind w:left="720" w:firstLine="0"/>
+        <w:rPr>
+          <w:rFonts w:ascii="Malgun Gothic" w:cs="Malgun Gothic" w:eastAsia="Malgun Gothic" w:hAnsi="Malgun Gothic"/>
+          <w:b w:val="0"/>
+          <w:bCs w:val="0"/>
+        </w:rPr>
+      </w:pPr>
+      <w:r>
+        <w:rPr>
+          <w:color w:val="0000ff"/>
+          <w:rtl w:val="0"/>
+          <w:rFonts w:ascii="Consolas" w:hAnsi="Consolas"/>
+          <w:sz w:val="17"/>
+        </w:rPr>
+        <w:t xml:space="preserve">$ python retrieval_test_10q.py   # 구어체 반영 후 새 질문 10문항</w:t>
+      </w:r>
+    </w:p>
+    <w:p>
+      <w:pPr>
+        <w:spacing w:after="240" w:before="240" w:lineRule="auto"/>
+        <w:ind w:left="720" w:firstLine="0"/>
+        <w:rPr>
+          <w:rFonts w:ascii="Malgun Gothic" w:cs="Malgun Gothic" w:eastAsia="Malgun Gothic" w:hAnsi="Malgun Gothic"/>
+          <w:b w:val="0"/>
+          <w:bCs w:val="0"/>
+        </w:rPr>
+      </w:pPr>
+      <w:r>
+        <w:rPr>
+          <w:color w:val="0000ff"/>
+          <w:rtl w:val="0"/>
+          <w:rFonts w:ascii="Consolas" w:hAnsi="Consolas"/>
+          <w:sz w:val="17"/>
+        </w:rPr>
+        <w:t xml:space="preserve"/>
+      </w:r>
+    </w:p>
+    <w:p>
+      <w:pPr>
+        <w:spacing w:after="240" w:before="240" w:lineRule="auto"/>
+        <w:ind w:left="720" w:firstLine="0"/>
+        <w:rPr>
+          <w:rFonts w:ascii="Malgun Gothic" w:cs="Malgun Gothic" w:eastAsia="Malgun Gothic" w:hAnsi="Malgun Gothic"/>
+          <w:b w:val="0"/>
+          <w:bCs w:val="0"/>
+        </w:rPr>
+      </w:pPr>
+      <w:r>
+        <w:rPr>
+          <w:color w:val="0000ff"/>
+          <w:rtl w:val="0"/>
+          <w:rFonts w:ascii="Consolas" w:hAnsi="Consolas"/>
+          <w:sz w:val="17"/>
+        </w:rPr>
+        <w:t xml:space="preserve">N01 적중 rank=3 [1283ms] 리프트가 멈춰서 스키를 못 탔는데 이용권 환불이 되나요?</w:t>
+      </w:r>
+    </w:p>
+    <w:p>
+      <w:pPr>
+        <w:spacing w:after="240" w:before="240" w:lineRule="auto"/>
+        <w:ind w:left="720" w:firstLine="0"/>
+        <w:rPr>
+          <w:rFonts w:ascii="Malgun Gothic" w:cs="Malgun Gothic" w:eastAsia="Malgun Gothic" w:hAnsi="Malgun Gothic"/>
+          <w:b w:val="0"/>
+          <w:bCs w:val="0"/>
+        </w:rPr>
+      </w:pPr>
+      <w:r>
+        <w:rPr>
+          <w:color w:val="0000ff"/>
+          <w:rtl w:val="0"/>
+          <w:rFonts w:ascii="Consolas" w:hAnsi="Consolas"/>
+          <w:sz w:val="17"/>
+        </w:rPr>
+        <w:t xml:space="preserve">N02 적중 rank=1 [958ms] 헬스장 회원권을 이사 때문에 해지하려는데 얼마나 돌려받나요?</w:t>
+      </w:r>
+    </w:p>
+    <w:p>
+      <w:pPr>
+        <w:spacing w:after="240" w:before="240" w:lineRule="auto"/>
+        <w:ind w:left="720" w:firstLine="0"/>
+        <w:rPr>
+          <w:rFonts w:ascii="Malgun Gothic" w:cs="Malgun Gothic" w:eastAsia="Malgun Gothic" w:hAnsi="Malgun Gothic"/>
+          <w:b w:val="0"/>
+          <w:bCs w:val="0"/>
+        </w:rPr>
+      </w:pPr>
+      <w:r>
+        <w:rPr>
+          <w:color w:val="0000ff"/>
+          <w:rtl w:val="0"/>
+          <w:rFonts w:ascii="Consolas" w:hAnsi="Consolas"/>
+          <w:sz w:val="17"/>
+        </w:rPr>
+        <w:t xml:space="preserve">N03 미적중 rank=None [368ms] 예약한 패러글라이딩 체험이 광고 영상과 완전히 달랐어요</w:t>
+      </w:r>
+    </w:p>
+    <w:p>
+      <w:pPr>
+        <w:spacing w:after="240" w:before="240" w:lineRule="auto"/>
+        <w:ind w:left="720" w:firstLine="0"/>
+        <w:rPr>
+          <w:rFonts w:ascii="Malgun Gothic" w:cs="Malgun Gothic" w:eastAsia="Malgun Gothic" w:hAnsi="Malgun Gothic"/>
+          <w:b w:val="0"/>
+          <w:bCs w:val="0"/>
+        </w:rPr>
+      </w:pPr>
+      <w:r>
+        <w:rPr>
+          <w:color w:val="0000ff"/>
+          <w:rtl w:val="0"/>
+          <w:rFonts w:ascii="Consolas" w:hAnsi="Consolas"/>
+          <w:sz w:val="17"/>
+        </w:rPr>
+        <w:t xml:space="preserve">N04 적중 rank=2 [351ms] 뮤지컬 일주일 전에 예매를 취소하면 수수료가 얼마예요?</w:t>
+      </w:r>
+    </w:p>
+    <w:p>
+      <w:pPr>
+        <w:spacing w:after="240" w:before="240" w:lineRule="auto"/>
+        <w:ind w:left="720" w:firstLine="0"/>
+        <w:rPr>
+          <w:rFonts w:ascii="Malgun Gothic" w:cs="Malgun Gothic" w:eastAsia="Malgun Gothic" w:hAnsi="Malgun Gothic"/>
+          <w:b w:val="0"/>
+          <w:bCs w:val="0"/>
+        </w:rPr>
+      </w:pPr>
+      <w:r>
+        <w:rPr>
+          <w:color w:val="0000ff"/>
+          <w:rtl w:val="0"/>
+          <w:rFonts w:ascii="Consolas" w:hAnsi="Consolas"/>
+          <w:sz w:val="17"/>
+        </w:rPr>
+        <w:t xml:space="preserve">N05 적중 rank=2 [292ms] 비 때문에 야외 공연이 취소됐어요. 표값은 어떻게 되나요?</w:t>
+      </w:r>
+    </w:p>
+    <w:p>
+      <w:pPr>
+        <w:spacing w:after="240" w:before="240" w:lineRule="auto"/>
+        <w:ind w:left="720" w:firstLine="0"/>
+        <w:rPr>
+          <w:rFonts w:ascii="Malgun Gothic" w:cs="Malgun Gothic" w:eastAsia="Malgun Gothic" w:hAnsi="Malgun Gothic"/>
+          <w:b w:val="0"/>
+          <w:bCs w:val="0"/>
+        </w:rPr>
+      </w:pPr>
+      <w:r>
+        <w:rPr>
+          <w:color w:val="0000ff"/>
+          <w:rtl w:val="0"/>
+          <w:rFonts w:ascii="Consolas" w:hAnsi="Consolas"/>
+          <w:sz w:val="17"/>
+        </w:rPr>
+        <w:t xml:space="preserve">N06 적중 rank=1 [266ms] 주연 배우가 바뀌었는데 환불받을 수 있나요?</w:t>
+      </w:r>
+    </w:p>
+    <w:p>
+      <w:pPr>
+        <w:spacing w:after="240" w:before="240" w:lineRule="auto"/>
+        <w:ind w:left="720" w:firstLine="0"/>
+        <w:rPr>
+          <w:rFonts w:ascii="Malgun Gothic" w:cs="Malgun Gothic" w:eastAsia="Malgun Gothic" w:hAnsi="Malgun Gothic"/>
+          <w:b w:val="0"/>
+          <w:bCs w:val="0"/>
+        </w:rPr>
+      </w:pPr>
+      <w:r>
+        <w:rPr>
+          <w:color w:val="0000ff"/>
+          <w:rtl w:val="0"/>
+          <w:rFonts w:ascii="Consolas" w:hAnsi="Consolas"/>
+          <w:sz w:val="17"/>
+        </w:rPr>
+        <w:t xml:space="preserve">N07 미적중 rank=None [249ms] 수영장에 갔더니 정원이 꽉 차서 못 들어갔어요</w:t>
+      </w:r>
+    </w:p>
+    <w:p>
+      <w:pPr>
+        <w:spacing w:after="240" w:before="240" w:lineRule="auto"/>
+        <w:ind w:left="720" w:firstLine="0"/>
+        <w:rPr>
+          <w:rFonts w:ascii="Malgun Gothic" w:cs="Malgun Gothic" w:eastAsia="Malgun Gothic" w:hAnsi="Malgun Gothic"/>
+          <w:b w:val="0"/>
+          <w:bCs w:val="0"/>
+        </w:rPr>
+      </w:pPr>
+      <w:r>
+        <w:rPr>
+          <w:color w:val="0000ff"/>
+          <w:rtl w:val="0"/>
+          <w:rFonts w:ascii="Consolas" w:hAnsi="Consolas"/>
+          <w:sz w:val="17"/>
+        </w:rPr>
+        <w:t xml:space="preserve">N08 적중 rank=3 [286ms] 시설 사정으로 이용권을 해지하면 남은 기간만큼 돌려주나요?</w:t>
+      </w:r>
+    </w:p>
+    <w:p>
+      <w:pPr>
+        <w:spacing w:after="240" w:before="240" w:lineRule="auto"/>
+        <w:ind w:left="720" w:firstLine="0"/>
+        <w:rPr>
+          <w:rFonts w:ascii="Malgun Gothic" w:cs="Malgun Gothic" w:eastAsia="Malgun Gothic" w:hAnsi="Malgun Gothic"/>
+          <w:b w:val="0"/>
+          <w:bCs w:val="0"/>
+        </w:rPr>
+      </w:pPr>
+      <w:r>
+        <w:rPr>
+          <w:color w:val="0000ff"/>
+          <w:rtl w:val="0"/>
+          <w:rFonts w:ascii="Consolas" w:hAnsi="Consolas"/>
+          <w:sz w:val="17"/>
+        </w:rPr>
+        <w:t xml:space="preserve">N09 적중 rank=1 [242ms] 여행사가 최소 인원 미달로 취소하면서 늦게 알려줬어요. 배상은요?</w:t>
+      </w:r>
+    </w:p>
+    <w:p>
+      <w:pPr>
+        <w:spacing w:after="240" w:before="240" w:lineRule="auto"/>
+        <w:ind w:left="720" w:firstLine="0"/>
+        <w:rPr>
+          <w:rFonts w:ascii="Malgun Gothic" w:cs="Malgun Gothic" w:eastAsia="Malgun Gothic" w:hAnsi="Malgun Gothic"/>
+          <w:b w:val="0"/>
+          <w:bCs w:val="0"/>
+        </w:rPr>
+      </w:pPr>
+      <w:r>
+        <w:rPr>
+          <w:color w:val="0000ff"/>
+          <w:rtl w:val="0"/>
+          <w:rFonts w:ascii="Consolas" w:hAnsi="Consolas"/>
+          <w:sz w:val="17"/>
+        </w:rPr>
+        <w:t xml:space="preserve">N10 적중 rank=1 [242ms] 공기가 나쁜 날에는 야외 체험 일정을 바꿔 주나요?</w:t>
+      </w:r>
+    </w:p>
+    <w:p>
+      <w:pPr>
+        <w:spacing w:after="240" w:before="240" w:lineRule="auto"/>
+        <w:ind w:left="720" w:firstLine="0"/>
+        <w:rPr>
+          <w:rFonts w:ascii="Malgun Gothic" w:cs="Malgun Gothic" w:eastAsia="Malgun Gothic" w:hAnsi="Malgun Gothic"/>
+          <w:b w:val="0"/>
+          <w:bCs w:val="0"/>
+        </w:rPr>
+      </w:pPr>
+      <w:r>
+        <w:rPr>
+          <w:color w:val="0000ff"/>
+          <w:rtl w:val="0"/>
+          <w:rFonts w:ascii="Consolas" w:hAnsi="Consolas"/>
+          <w:sz w:val="17"/>
+        </w:rPr>
+        <w:t xml:space="preserve">Hit@3 8/10 · Hit@1 4/10</w:t>
       </w:r>
     </w:p>
     <w:p>

</xml_diff>

<commit_message>
docs(activity): reinforce 3 sections with customer wording, re-ingest 3 chunks, new 10 questions Hit@3 6/10; report updated
Co-Authored-By: Claude Sonnet 5.5 <noreply@anthropic.com>
</commit_message>
<xml_diff>
--- a/docs/activity/산출물/벡터DB_GraphDB_구축결과서_활동에이전트_2026-10-14.docx
+++ b/docs/activity/산출물/벡터DB_GraphDB_구축결과서_활동에이전트_2026-10-14.docx
@@ -4112,7 +4112,7 @@
                 <w:szCs w:val="22"/>
                 <w:rtl w:val="0"/>
               </w:rPr>
-              <w:t xml:space="preserve">20문항 시험(공식 자료 추가 후): 절 단위 Hit@3 12/20 (60%), Hit@1 8/20 (40%), 문서 단위 Hit@3 16/20 (80%). 레저·공연 문서에 구어체 표현을 반영한 뒤 새 질문 10문항: Hit@3 8/10, Hit@1 4/10. 기본 코퍼스 7문항 시험은 5/6</w:t>
+              <w:t xml:space="preserve">20문항 시험(공식 자료 추가 후): 절 단위 Hit@3 12/20 (60%), Hit@1 8/20 (40%), 문서 단위 Hit@3 16/20 (80%). 레저·공연 문서에 구어체 표현을 반영한 뒤 새 질문 10문항: Hit@3 8/10, Hit@1 4/10. 실패 절(고객 표현 불일치)을 보강하고 재적재한 뒤 다시 새 질문 10문항: Hit@3 6/10, Hit@1 4/10. 기본 코퍼스 7문항 시험은 5/6</w:t>
             </w:r>
           </w:p>
         </w:tc>
@@ -19637,6 +19637,2580 @@
     </w:tbl>
     <w:p>
       <w:pPr>
+        <w:spacing w:after="240" w:before="240" w:lineRule="auto"/>
+        <w:ind w:left="720" w:firstLine="0"/>
+        <w:rPr>
+          <w:rFonts w:ascii="Malgun Gothic" w:cs="Malgun Gothic" w:eastAsia="Malgun Gothic" w:hAnsi="Malgun Gothic"/>
+          <w:b w:val="0"/>
+          <w:bCs w:val="0"/>
+        </w:rPr>
+      </w:pPr>
+      <w:r>
+        <w:rPr>
+          <w:rFonts w:ascii="Malgun Gothic" w:cs="Malgun Gothic" w:eastAsia="Malgun Gothic" w:hAnsi="Malgun Gothic"/>
+          <w:color w:val="0000ff"/>
+          <w:rtl w:val="0"/>
+        </w:rPr>
+        <w:t xml:space="preserve">2차 보강 후 새 질문 10문항 — 앞선 실패 유형(광고와 다름, 정원 초과, 가족 사망)의 3개 절에 고객 표현을 보강하고 3청크를 재적재한 뒤 새 질문으로 측정(2026-10-14). 절 단위 6/10, 1위 4/10. 보강이 질병·가족 사망 질문(M05~M07)과 체험 광고 질문(M01)에서는 뚜렷한 개선으로 이어지지 않았고, 질문 수가 적어 효과를 단정할 수 없다. 표현 보강만으로는 한계가 있으며 질문을 문서 용어로 바꿔 검색하는 방식이 다음 후보다.</w:t>
+      </w:r>
+    </w:p>
+    <w:tbl>
+      <w:tblPr>
+        <w:tblStyle w:val="Table8"/>
+        <w:tblW w:w="9865.0" w:type="dxa"/>
+        <w:jc w:val="center"/>
+        <w:tblBorders>
+          <w:top w:color="808080" w:space="0" w:sz="7" w:val="single"/>
+          <w:left w:color="808080" w:space="0" w:sz="7" w:val="single"/>
+          <w:bottom w:color="808080" w:space="0" w:sz="7" w:val="single"/>
+          <w:right w:color="808080" w:space="0" w:sz="7" w:val="single"/>
+          <w:insideH w:color="808080" w:space="0" w:sz="7" w:val="single"/>
+          <w:insideV w:color="808080" w:space="0" w:sz="7" w:val="single"/>
+        </w:tblBorders>
+        <w:tblLayout w:type="fixed"/>
+        <w:tblLook w:val="0600"/>
+      </w:tblPr>
+      <w:tblGrid>
+        <w:gridCol w:w="1700"/>
+        <w:gridCol w:w="2570"/>
+        <w:gridCol w:w="1100"/>
+        <w:gridCol w:w="1070"/>
+        <w:gridCol w:w="3425"/>
+        <w:tblGridChange w:id="0">
+          <w:tblGrid>
+            <w:gridCol w:w="1700"/>
+            <w:gridCol w:w="2570"/>
+            <w:gridCol w:w="1100"/>
+            <w:gridCol w:w="1070"/>
+            <w:gridCol w:w="3425"/>
+          </w:tblGrid>
+        </w:tblGridChange>
+      </w:tblGrid>
+      <w:tr>
+        <w:trPr>
+          <w:cantSplit w:val="0"/>
+          <w:trHeight w:val="566.9291338582677" w:hRule="atLeast"/>
+          <w:tblHeader w:val="0"/>
+        </w:trPr>
+        <w:tc>
+          <w:tcPr>
+            <w:tcBorders>
+              <w:top w:color="808080" w:space="0" w:sz="7" w:val="single"/>
+              <w:left w:color="808080" w:space="0" w:sz="7" w:val="single"/>
+              <w:bottom w:color="808080" w:space="0" w:sz="7" w:val="single"/>
+              <w:right w:color="808080" w:space="0" w:sz="7" w:val="single"/>
+            </w:tcBorders>
+            <w:shd w:fill="cfe2f3" w:val="clear"/>
+            <w:tcMar>
+              <w:top w:w="0.0" w:type="dxa"/>
+              <w:left w:w="0.0" w:type="dxa"/>
+              <w:bottom w:w="0.0" w:type="dxa"/>
+              <w:right w:w="0.0" w:type="dxa"/>
+            </w:tcMar>
+            <w:vAlign w:val="center"/>
+          </w:tcPr>
+          <w:p>
+            <w:pPr>
+              <w:pStyle w:val="Heading3"/>
+              <w:keepNext w:val="0"/>
+              <w:keepLines w:val="0"/>
+              <w:spacing w:after="0" w:before="0" w:line="240" w:lineRule="auto"/>
+              <w:jc w:val="center"/>
+              <w:rPr>
+                <w:rFonts w:ascii="Malgun Gothic" w:cs="Malgun Gothic" w:eastAsia="Malgun Gothic" w:hAnsi="Malgun Gothic"/>
+                <w:b w:val="1"/>
+                <w:bCs w:val="1"/>
+                <w:color w:val="000000"/>
+                <w:sz w:val="22"/>
+                <w:szCs w:val="22"/>
+              </w:rPr>
+            </w:pPr>
+            <w:bookmarkStart w:colFirst="0" w:colLast="0" w:name="_d6fu8zjuee0s" w:id="1"/>
+            <w:bookmarkEnd w:id="1"/>
+            <w:r>
+              <w:rPr>
+                <w:rFonts w:ascii="Malgun Gothic" w:cs="Malgun Gothic" w:eastAsia="Malgun Gothic" w:hAnsi="Malgun Gothic"/>
+                <w:b w:val="1"/>
+                <w:bCs w:val="1"/>
+                <w:color w:val="000000"/>
+                <w:sz w:val="22"/>
+                <w:szCs w:val="22"/>
+                <w:rtl w:val="0"/>
+              </w:rPr>
+              <w:t xml:space="preserve">ID</w:t>
+            </w:r>
+          </w:p>
+        </w:tc>
+        <w:tc>
+          <w:tcPr>
+            <w:tcBorders>
+              <w:top w:color="808080" w:space="0" w:sz="7" w:val="single"/>
+              <w:left w:color="808080" w:space="0" w:sz="7" w:val="single"/>
+              <w:bottom w:color="808080" w:space="0" w:sz="7" w:val="single"/>
+              <w:right w:color="808080" w:space="0" w:sz="7" w:val="single"/>
+            </w:tcBorders>
+            <w:shd w:fill="cfe2f3" w:val="clear"/>
+            <w:tcMar>
+              <w:top w:w="0.0" w:type="dxa"/>
+              <w:left w:w="0.0" w:type="dxa"/>
+              <w:bottom w:w="0.0" w:type="dxa"/>
+              <w:right w:w="0.0" w:type="dxa"/>
+            </w:tcMar>
+            <w:vAlign w:val="center"/>
+          </w:tcPr>
+          <w:p>
+            <w:pPr>
+              <w:pStyle w:val="Heading3"/>
+              <w:keepNext w:val="0"/>
+              <w:keepLines w:val="0"/>
+              <w:spacing w:after="0" w:before="0" w:line="240" w:lineRule="auto"/>
+              <w:jc w:val="center"/>
+              <w:rPr>
+                <w:rFonts w:ascii="Malgun Gothic" w:cs="Malgun Gothic" w:eastAsia="Malgun Gothic" w:hAnsi="Malgun Gothic"/>
+                <w:b w:val="1"/>
+                <w:bCs w:val="1"/>
+                <w:color w:val="000000"/>
+                <w:sz w:val="22"/>
+                <w:szCs w:val="22"/>
+              </w:rPr>
+            </w:pPr>
+            <w:bookmarkStart w:colFirst="0" w:colLast="0" w:name="_d6fu8zjuee0s" w:id="1"/>
+            <w:bookmarkEnd w:id="1"/>
+            <w:r>
+              <w:rPr>
+                <w:rFonts w:ascii="Malgun Gothic" w:cs="Malgun Gothic" w:eastAsia="Malgun Gothic" w:hAnsi="Malgun Gothic"/>
+                <w:b w:val="1"/>
+                <w:bCs w:val="1"/>
+                <w:color w:val="000000"/>
+                <w:sz w:val="22"/>
+                <w:szCs w:val="22"/>
+                <w:rtl w:val="0"/>
+              </w:rPr>
+              <w:t xml:space="preserve">질문</w:t>
+            </w:r>
+          </w:p>
+        </w:tc>
+        <w:tc>
+          <w:tcPr>
+            <w:tcBorders>
+              <w:top w:color="808080" w:space="0" w:sz="7" w:val="single"/>
+              <w:left w:color="808080" w:space="0" w:sz="7" w:val="single"/>
+              <w:bottom w:color="808080" w:space="0" w:sz="7" w:val="single"/>
+              <w:right w:color="808080" w:space="0" w:sz="7" w:val="single"/>
+            </w:tcBorders>
+            <w:shd w:fill="cfe2f3" w:val="clear"/>
+            <w:tcMar>
+              <w:top w:w="0.0" w:type="dxa"/>
+              <w:left w:w="0.0" w:type="dxa"/>
+              <w:bottom w:w="0.0" w:type="dxa"/>
+              <w:right w:w="0.0" w:type="dxa"/>
+            </w:tcMar>
+            <w:vAlign w:val="center"/>
+          </w:tcPr>
+          <w:p>
+            <w:pPr>
+              <w:pStyle w:val="Heading3"/>
+              <w:keepNext w:val="0"/>
+              <w:keepLines w:val="0"/>
+              <w:spacing w:after="0" w:before="0" w:line="240" w:lineRule="auto"/>
+              <w:jc w:val="center"/>
+              <w:rPr>
+                <w:rFonts w:ascii="Malgun Gothic" w:cs="Malgun Gothic" w:eastAsia="Malgun Gothic" w:hAnsi="Malgun Gothic"/>
+                <w:b w:val="1"/>
+                <w:bCs w:val="1"/>
+                <w:color w:val="000000"/>
+                <w:sz w:val="22"/>
+                <w:szCs w:val="22"/>
+              </w:rPr>
+            </w:pPr>
+            <w:bookmarkStart w:colFirst="0" w:colLast="0" w:name="_d6fu8zjuee0s" w:id="1"/>
+            <w:bookmarkEnd w:id="1"/>
+            <w:r>
+              <w:rPr>
+                <w:rFonts w:ascii="Malgun Gothic" w:cs="Malgun Gothic" w:eastAsia="Malgun Gothic" w:hAnsi="Malgun Gothic"/>
+                <w:b w:val="1"/>
+                <w:bCs w:val="1"/>
+                <w:color w:val="000000"/>
+                <w:sz w:val="22"/>
+                <w:szCs w:val="22"/>
+                <w:rtl w:val="0"/>
+              </w:rPr>
+              <w:t xml:space="preserve">1위 문서 · 절</w:t>
+            </w:r>
+          </w:p>
+        </w:tc>
+        <w:tc>
+          <w:tcPr>
+            <w:tcBorders>
+              <w:top w:color="808080" w:space="0" w:sz="7" w:val="single"/>
+              <w:left w:color="808080" w:space="0" w:sz="7" w:val="single"/>
+              <w:bottom w:color="808080" w:space="0" w:sz="7" w:val="single"/>
+              <w:right w:color="808080" w:space="0" w:sz="7" w:val="single"/>
+            </w:tcBorders>
+            <w:shd w:fill="cfe2f3" w:val="clear"/>
+            <w:tcMar>
+              <w:top w:w="0.0" w:type="dxa"/>
+              <w:left w:w="0.0" w:type="dxa"/>
+              <w:bottom w:w="0.0" w:type="dxa"/>
+              <w:right w:w="0.0" w:type="dxa"/>
+            </w:tcMar>
+            <w:vAlign w:val="center"/>
+          </w:tcPr>
+          <w:p>
+            <w:pPr>
+              <w:pStyle w:val="Heading3"/>
+              <w:keepNext w:val="0"/>
+              <w:keepLines w:val="0"/>
+              <w:spacing w:after="0" w:before="0" w:line="240" w:lineRule="auto"/>
+              <w:jc w:val="center"/>
+              <w:rPr>
+                <w:rFonts w:ascii="Malgun Gothic" w:cs="Malgun Gothic" w:eastAsia="Malgun Gothic" w:hAnsi="Malgun Gothic"/>
+                <w:b w:val="1"/>
+                <w:bCs w:val="1"/>
+                <w:color w:val="000000"/>
+                <w:sz w:val="22"/>
+                <w:szCs w:val="22"/>
+              </w:rPr>
+            </w:pPr>
+            <w:bookmarkStart w:colFirst="0" w:colLast="0" w:name="_d6fu8zjuee0s" w:id="1"/>
+            <w:bookmarkEnd w:id="1"/>
+            <w:r>
+              <w:rPr>
+                <w:rFonts w:ascii="Malgun Gothic" w:cs="Malgun Gothic" w:eastAsia="Malgun Gothic" w:hAnsi="Malgun Gothic"/>
+                <w:b w:val="1"/>
+                <w:bCs w:val="1"/>
+                <w:color w:val="000000"/>
+                <w:sz w:val="22"/>
+                <w:szCs w:val="22"/>
+                <w:rtl w:val="0"/>
+              </w:rPr>
+              <w:t xml:space="preserve">1위 점수</w:t>
+            </w:r>
+          </w:p>
+        </w:tc>
+        <w:tc>
+          <w:tcPr>
+            <w:tcBorders>
+              <w:top w:color="808080" w:space="0" w:sz="7" w:val="single"/>
+              <w:left w:color="808080" w:space="0" w:sz="7" w:val="single"/>
+              <w:bottom w:color="808080" w:space="0" w:sz="7" w:val="single"/>
+              <w:right w:color="808080" w:space="0" w:sz="7" w:val="single"/>
+            </w:tcBorders>
+            <w:shd w:fill="cfe2f3" w:val="clear"/>
+            <w:tcMar>
+              <w:top w:w="0.0" w:type="dxa"/>
+              <w:left w:w="0.0" w:type="dxa"/>
+              <w:bottom w:w="0.0" w:type="dxa"/>
+              <w:right w:w="0.0" w:type="dxa"/>
+            </w:tcMar>
+            <w:vAlign w:val="center"/>
+          </w:tcPr>
+          <w:p>
+            <w:pPr>
+              <w:pStyle w:val="Heading3"/>
+              <w:keepNext w:val="0"/>
+              <w:keepLines w:val="0"/>
+              <w:spacing w:after="0" w:before="0" w:line="240" w:lineRule="auto"/>
+              <w:jc w:val="center"/>
+              <w:rPr>
+                <w:rFonts w:ascii="Malgun Gothic" w:cs="Malgun Gothic" w:eastAsia="Malgun Gothic" w:hAnsi="Malgun Gothic"/>
+                <w:b w:val="1"/>
+                <w:bCs w:val="1"/>
+                <w:color w:val="000000"/>
+                <w:sz w:val="22"/>
+                <w:szCs w:val="22"/>
+              </w:rPr>
+            </w:pPr>
+            <w:bookmarkStart w:colFirst="0" w:colLast="0" w:name="_d6fu8zjuee0s" w:id="1"/>
+            <w:bookmarkEnd w:id="1"/>
+            <w:r>
+              <w:rPr>
+                <w:rFonts w:ascii="Malgun Gothic" w:cs="Malgun Gothic" w:eastAsia="Malgun Gothic" w:hAnsi="Malgun Gothic"/>
+                <w:b w:val="1"/>
+                <w:bCs w:val="1"/>
+                <w:color w:val="000000"/>
+                <w:sz w:val="22"/>
+                <w:szCs w:val="22"/>
+                <w:rtl w:val="0"/>
+              </w:rPr>
+              <w:t xml:space="preserve">판정</w:t>
+            </w:r>
+          </w:p>
+        </w:tc>
+      </w:tr>
+      <w:tr>
+        <w:trPr>
+          <w:cantSplit w:val="0"/>
+          <w:trHeight w:val="566.9291338582677" w:hRule="atLeast"/>
+          <w:tblHeader w:val="0"/>
+        </w:trPr>
+        <w:tc>
+          <w:tcPr>
+            <w:tcBorders>
+              <w:top w:color="808080" w:space="0" w:sz="7" w:val="single"/>
+              <w:left w:color="808080" w:space="0" w:sz="7" w:val="single"/>
+              <w:bottom w:color="808080" w:space="0" w:sz="7" w:val="single"/>
+              <w:right w:color="808080" w:space="0" w:sz="7" w:val="single"/>
+            </w:tcBorders>
+            <w:tcMar>
+              <w:top w:w="0.0" w:type="dxa"/>
+              <w:left w:w="0.0" w:type="dxa"/>
+              <w:bottom w:w="0.0" w:type="dxa"/>
+              <w:right w:w="0.0" w:type="dxa"/>
+            </w:tcMar>
+            <w:vAlign w:val="center"/>
+          </w:tcPr>
+          <w:p>
+            <w:pPr>
+              <w:pStyle w:val="Heading3"/>
+              <w:keepNext w:val="0"/>
+              <w:keepLines w:val="0"/>
+              <w:spacing w:after="0" w:before="0" w:line="240" w:lineRule="auto"/>
+              <w:jc w:val="center"/>
+              <w:rPr>
+                <w:rFonts w:ascii="Malgun Gothic" w:cs="Malgun Gothic" w:eastAsia="Malgun Gothic" w:hAnsi="Malgun Gothic"/>
+                <w:color w:val="0000ff"/>
+                <w:sz w:val="22"/>
+                <w:szCs w:val="22"/>
+              </w:rPr>
+            </w:pPr>
+            <w:bookmarkStart w:colFirst="0" w:colLast="0" w:name="_d6fu8zjuee0s" w:id="1"/>
+            <w:bookmarkEnd w:id="1"/>
+            <w:r>
+              <w:rPr>
+                <w:rFonts w:ascii="Malgun Gothic" w:cs="Malgun Gothic" w:eastAsia="Malgun Gothic" w:hAnsi="Malgun Gothic"/>
+                <w:color w:val="0000ff"/>
+                <w:sz w:val="22"/>
+                <w:szCs w:val="22"/>
+                <w:rtl w:val="0"/>
+              </w:rPr>
+              <w:t xml:space="preserve">M01</w:t>
+            </w:r>
+          </w:p>
+        </w:tc>
+        <w:tc>
+          <w:tcPr>
+            <w:tcBorders>
+              <w:top w:color="808080" w:space="0" w:sz="7" w:val="single"/>
+              <w:left w:color="808080" w:space="0" w:sz="7" w:val="single"/>
+              <w:bottom w:color="808080" w:space="0" w:sz="7" w:val="single"/>
+              <w:right w:color="808080" w:space="0" w:sz="7" w:val="single"/>
+            </w:tcBorders>
+            <w:tcMar>
+              <w:top w:w="0.0" w:type="dxa"/>
+              <w:left w:w="0.0" w:type="dxa"/>
+              <w:bottom w:w="0.0" w:type="dxa"/>
+              <w:right w:w="0.0" w:type="dxa"/>
+            </w:tcMar>
+            <w:vAlign w:val="center"/>
+          </w:tcPr>
+          <w:p>
+            <w:pPr>
+              <w:pStyle w:val="Heading3"/>
+              <w:keepNext w:val="0"/>
+              <w:keepLines w:val="0"/>
+              <w:spacing w:after="0" w:before="0" w:line="240" w:lineRule="auto"/>
+              <w:jc w:val="center"/>
+              <w:rPr>
+                <w:rFonts w:ascii="Malgun Gothic" w:cs="Malgun Gothic" w:eastAsia="Malgun Gothic" w:hAnsi="Malgun Gothic"/>
+                <w:color w:val="0000ff"/>
+                <w:sz w:val="22"/>
+                <w:szCs w:val="22"/>
+              </w:rPr>
+            </w:pPr>
+            <w:bookmarkStart w:colFirst="0" w:colLast="0" w:name="_d6fu8zjuee0s" w:id="1"/>
+            <w:bookmarkEnd w:id="1"/>
+            <w:r>
+              <w:rPr>
+                <w:rFonts w:ascii="Malgun Gothic" w:cs="Malgun Gothic" w:eastAsia="Malgun Gothic" w:hAnsi="Malgun Gothic"/>
+                <w:color w:val="0000ff"/>
+                <w:sz w:val="22"/>
+                <w:szCs w:val="22"/>
+                <w:rtl w:val="0"/>
+              </w:rPr>
+              <w:t xml:space="preserve">체험 예약했는데 홍보 사진과 실제가 너무 달라서 환불받고 싶어요</w:t>
+            </w:r>
+          </w:p>
+        </w:tc>
+        <w:tc>
+          <w:tcPr>
+            <w:tcBorders>
+              <w:top w:color="808080" w:space="0" w:sz="7" w:val="single"/>
+              <w:left w:color="808080" w:space="0" w:sz="7" w:val="single"/>
+              <w:bottom w:color="808080" w:space="0" w:sz="7" w:val="single"/>
+              <w:right w:color="808080" w:space="0" w:sz="7" w:val="single"/>
+            </w:tcBorders>
+            <w:tcMar>
+              <w:top w:w="0.0" w:type="dxa"/>
+              <w:left w:w="0.0" w:type="dxa"/>
+              <w:bottom w:w="0.0" w:type="dxa"/>
+              <w:right w:w="0.0" w:type="dxa"/>
+            </w:tcMar>
+            <w:vAlign w:val="center"/>
+          </w:tcPr>
+          <w:p>
+            <w:pPr>
+              <w:pStyle w:val="Heading3"/>
+              <w:keepNext w:val="0"/>
+              <w:keepLines w:val="0"/>
+              <w:spacing w:after="0" w:before="0" w:line="240" w:lineRule="auto"/>
+              <w:jc w:val="center"/>
+              <w:rPr>
+                <w:rFonts w:ascii="Malgun Gothic" w:cs="Malgun Gothic" w:eastAsia="Malgun Gothic" w:hAnsi="Malgun Gothic"/>
+                <w:color w:val="0000ff"/>
+                <w:sz w:val="22"/>
+                <w:szCs w:val="22"/>
+              </w:rPr>
+            </w:pPr>
+            <w:bookmarkStart w:colFirst="0" w:colLast="0" w:name="_d6fu8zjuee0s" w:id="1"/>
+            <w:bookmarkEnd w:id="1"/>
+            <w:r>
+              <w:rPr>
+                <w:rFonts w:ascii="Malgun Gothic" w:cs="Malgun Gothic" w:eastAsia="Malgun Gothic" w:hAnsi="Malgun Gothic"/>
+                <w:color w:val="0000ff"/>
+                <w:sz w:val="22"/>
+                <w:szCs w:val="22"/>
+                <w:rtl w:val="0"/>
+              </w:rPr>
+              <w:t xml:space="preserve">업체 취소 조건과 일정 변경 구분 · 업체 취소 조건과 일정 변경 구분</w:t>
+            </w:r>
+          </w:p>
+        </w:tc>
+        <w:tc>
+          <w:tcPr>
+            <w:tcBorders>
+              <w:top w:color="808080" w:space="0" w:sz="7" w:val="single"/>
+              <w:left w:color="808080" w:space="0" w:sz="7" w:val="single"/>
+              <w:bottom w:color="808080" w:space="0" w:sz="7" w:val="single"/>
+              <w:right w:color="808080" w:space="0" w:sz="7" w:val="single"/>
+            </w:tcBorders>
+            <w:tcMar>
+              <w:top w:w="0.0" w:type="dxa"/>
+              <w:left w:w="0.0" w:type="dxa"/>
+              <w:bottom w:w="0.0" w:type="dxa"/>
+              <w:right w:w="0.0" w:type="dxa"/>
+            </w:tcMar>
+            <w:vAlign w:val="center"/>
+          </w:tcPr>
+          <w:p>
+            <w:pPr>
+              <w:pStyle w:val="Heading3"/>
+              <w:keepNext w:val="0"/>
+              <w:keepLines w:val="0"/>
+              <w:spacing w:after="0" w:before="0" w:line="240" w:lineRule="auto"/>
+              <w:jc w:val="center"/>
+              <w:rPr>
+                <w:rFonts w:ascii="Malgun Gothic" w:cs="Malgun Gothic" w:eastAsia="Malgun Gothic" w:hAnsi="Malgun Gothic"/>
+                <w:color w:val="0000ff"/>
+                <w:sz w:val="22"/>
+                <w:szCs w:val="22"/>
+              </w:rPr>
+            </w:pPr>
+            <w:bookmarkStart w:colFirst="0" w:colLast="0" w:name="_d6fu8zjuee0s" w:id="1"/>
+            <w:bookmarkEnd w:id="1"/>
+            <w:r>
+              <w:rPr>
+                <w:rFonts w:ascii="Malgun Gothic" w:cs="Malgun Gothic" w:eastAsia="Malgun Gothic" w:hAnsi="Malgun Gothic"/>
+                <w:color w:val="0000ff"/>
+                <w:sz w:val="22"/>
+                <w:szCs w:val="22"/>
+                <w:rtl w:val="0"/>
+              </w:rPr>
+              <w:t xml:space="preserve">0.394</w:t>
+            </w:r>
+          </w:p>
+        </w:tc>
+        <w:tc>
+          <w:tcPr>
+            <w:tcBorders>
+              <w:top w:color="808080" w:space="0" w:sz="7" w:val="single"/>
+              <w:left w:color="808080" w:space="0" w:sz="7" w:val="single"/>
+              <w:bottom w:color="808080" w:space="0" w:sz="7" w:val="single"/>
+              <w:right w:color="808080" w:space="0" w:sz="7" w:val="single"/>
+            </w:tcBorders>
+            <w:tcMar>
+              <w:top w:w="0.0" w:type="dxa"/>
+              <w:left w:w="0.0" w:type="dxa"/>
+              <w:bottom w:w="0.0" w:type="dxa"/>
+              <w:right w:w="0.0" w:type="dxa"/>
+            </w:tcMar>
+            <w:vAlign w:val="center"/>
+          </w:tcPr>
+          <w:p>
+            <w:pPr>
+              <w:pStyle w:val="Heading3"/>
+              <w:keepNext w:val="0"/>
+              <w:keepLines w:val="0"/>
+              <w:spacing w:after="0" w:before="0" w:line="240" w:lineRule="auto"/>
+              <w:jc w:val="center"/>
+              <w:rPr>
+                <w:rFonts w:ascii="Malgun Gothic" w:cs="Malgun Gothic" w:eastAsia="Malgun Gothic" w:hAnsi="Malgun Gothic"/>
+                <w:color w:val="0000ff"/>
+                <w:sz w:val="22"/>
+                <w:szCs w:val="22"/>
+              </w:rPr>
+            </w:pPr>
+            <w:bookmarkStart w:colFirst="0" w:colLast="0" w:name="_d6fu8zjuee0s" w:id="1"/>
+            <w:bookmarkEnd w:id="1"/>
+            <w:r>
+              <w:rPr>
+                <w:rFonts w:ascii="Malgun Gothic" w:cs="Malgun Gothic" w:eastAsia="Malgun Gothic" w:hAnsi="Malgun Gothic"/>
+                <w:color w:val="0000ff"/>
+                <w:sz w:val="22"/>
+                <w:szCs w:val="22"/>
+                <w:rtl w:val="0"/>
+              </w:rPr>
+              <w:t xml:space="preserve">미적중(관련 문서 없음)</w:t>
+            </w:r>
+          </w:p>
+        </w:tc>
+      </w:tr>
+      <w:tr>
+        <w:trPr>
+          <w:cantSplit w:val="0"/>
+          <w:trHeight w:val="566.9291338582677" w:hRule="atLeast"/>
+          <w:tblHeader w:val="0"/>
+        </w:trPr>
+        <w:tc>
+          <w:tcPr>
+            <w:tcBorders>
+              <w:top w:color="808080" w:space="0" w:sz="7" w:val="single"/>
+              <w:left w:color="808080" w:space="0" w:sz="7" w:val="single"/>
+              <w:bottom w:color="808080" w:space="0" w:sz="7" w:val="single"/>
+              <w:right w:color="808080" w:space="0" w:sz="7" w:val="single"/>
+            </w:tcBorders>
+            <w:tcMar>
+              <w:top w:w="0.0" w:type="dxa"/>
+              <w:left w:w="0.0" w:type="dxa"/>
+              <w:bottom w:w="0.0" w:type="dxa"/>
+              <w:right w:w="0.0" w:type="dxa"/>
+            </w:tcMar>
+            <w:vAlign w:val="center"/>
+          </w:tcPr>
+          <w:p>
+            <w:pPr>
+              <w:pStyle w:val="Heading3"/>
+              <w:keepNext w:val="0"/>
+              <w:keepLines w:val="0"/>
+              <w:spacing w:after="0" w:before="0" w:line="240" w:lineRule="auto"/>
+              <w:jc w:val="center"/>
+              <w:rPr>
+                <w:rFonts w:ascii="Malgun Gothic" w:cs="Malgun Gothic" w:eastAsia="Malgun Gothic" w:hAnsi="Malgun Gothic"/>
+                <w:color w:val="0000ff"/>
+                <w:sz w:val="22"/>
+                <w:szCs w:val="22"/>
+              </w:rPr>
+            </w:pPr>
+            <w:bookmarkStart w:colFirst="0" w:colLast="0" w:name="_d6fu8zjuee0s" w:id="1"/>
+            <w:bookmarkEnd w:id="1"/>
+            <w:r>
+              <w:rPr>
+                <w:rFonts w:ascii="Malgun Gothic" w:cs="Malgun Gothic" w:eastAsia="Malgun Gothic" w:hAnsi="Malgun Gothic"/>
+                <w:color w:val="0000ff"/>
+                <w:sz w:val="22"/>
+                <w:szCs w:val="22"/>
+                <w:rtl w:val="0"/>
+              </w:rPr>
+              <w:t xml:space="preserve">M02</w:t>
+            </w:r>
+          </w:p>
+        </w:tc>
+        <w:tc>
+          <w:tcPr>
+            <w:tcBorders>
+              <w:top w:color="808080" w:space="0" w:sz="7" w:val="single"/>
+              <w:left w:color="808080" w:space="0" w:sz="7" w:val="single"/>
+              <w:bottom w:color="808080" w:space="0" w:sz="7" w:val="single"/>
+              <w:right w:color="808080" w:space="0" w:sz="7" w:val="single"/>
+            </w:tcBorders>
+            <w:tcMar>
+              <w:top w:w="0.0" w:type="dxa"/>
+              <w:left w:w="0.0" w:type="dxa"/>
+              <w:bottom w:w="0.0" w:type="dxa"/>
+              <w:right w:w="0.0" w:type="dxa"/>
+            </w:tcMar>
+            <w:vAlign w:val="center"/>
+          </w:tcPr>
+          <w:p>
+            <w:pPr>
+              <w:pStyle w:val="Heading3"/>
+              <w:keepNext w:val="0"/>
+              <w:keepLines w:val="0"/>
+              <w:spacing w:after="0" w:before="0" w:line="240" w:lineRule="auto"/>
+              <w:jc w:val="center"/>
+              <w:rPr>
+                <w:rFonts w:ascii="Malgun Gothic" w:cs="Malgun Gothic" w:eastAsia="Malgun Gothic" w:hAnsi="Malgun Gothic"/>
+                <w:color w:val="0000ff"/>
+                <w:sz w:val="22"/>
+                <w:szCs w:val="22"/>
+              </w:rPr>
+            </w:pPr>
+            <w:bookmarkStart w:colFirst="0" w:colLast="0" w:name="_d6fu8zjuee0s" w:id="1"/>
+            <w:bookmarkEnd w:id="1"/>
+            <w:r>
+              <w:rPr>
+                <w:rFonts w:ascii="Malgun Gothic" w:cs="Malgun Gothic" w:eastAsia="Malgun Gothic" w:hAnsi="Malgun Gothic"/>
+                <w:color w:val="0000ff"/>
+                <w:sz w:val="22"/>
+                <w:szCs w:val="22"/>
+                <w:rtl w:val="0"/>
+              </w:rPr>
+              <w:t xml:space="preserve">서핑 강습 소개 영상과 다르게 진행됐는데 돈을 돌려받을 수 있나요?</w:t>
+            </w:r>
+          </w:p>
+        </w:tc>
+        <w:tc>
+          <w:tcPr>
+            <w:tcBorders>
+              <w:top w:color="808080" w:space="0" w:sz="7" w:val="single"/>
+              <w:left w:color="808080" w:space="0" w:sz="7" w:val="single"/>
+              <w:bottom w:color="808080" w:space="0" w:sz="7" w:val="single"/>
+              <w:right w:color="808080" w:space="0" w:sz="7" w:val="single"/>
+            </w:tcBorders>
+            <w:tcMar>
+              <w:top w:w="0.0" w:type="dxa"/>
+              <w:left w:w="0.0" w:type="dxa"/>
+              <w:bottom w:w="0.0" w:type="dxa"/>
+              <w:right w:w="0.0" w:type="dxa"/>
+            </w:tcMar>
+            <w:vAlign w:val="center"/>
+          </w:tcPr>
+          <w:p>
+            <w:pPr>
+              <w:pStyle w:val="Heading3"/>
+              <w:keepNext w:val="0"/>
+              <w:keepLines w:val="0"/>
+              <w:spacing w:after="0" w:before="0" w:line="240" w:lineRule="auto"/>
+              <w:jc w:val="center"/>
+              <w:rPr>
+                <w:rFonts w:ascii="Malgun Gothic" w:cs="Malgun Gothic" w:eastAsia="Malgun Gothic" w:hAnsi="Malgun Gothic"/>
+                <w:color w:val="0000ff"/>
+                <w:sz w:val="22"/>
+                <w:szCs w:val="22"/>
+              </w:rPr>
+            </w:pPr>
+            <w:bookmarkStart w:colFirst="0" w:colLast="0" w:name="_d6fu8zjuee0s" w:id="1"/>
+            <w:bookmarkEnd w:id="1"/>
+            <w:r>
+              <w:rPr>
+                <w:rFonts w:ascii="Malgun Gothic" w:cs="Malgun Gothic" w:eastAsia="Malgun Gothic" w:hAnsi="Malgun Gothic"/>
+                <w:color w:val="0000ff"/>
+                <w:sz w:val="22"/>
+                <w:szCs w:val="22"/>
+                <w:rtl w:val="0"/>
+              </w:rPr>
+              <w:t xml:space="preserve">취소·환급의 일반 기준과 업체 인계 · 되돌림은 새로운 거래다</w:t>
+            </w:r>
+          </w:p>
+        </w:tc>
+        <w:tc>
+          <w:tcPr>
+            <w:tcBorders>
+              <w:top w:color="808080" w:space="0" w:sz="7" w:val="single"/>
+              <w:left w:color="808080" w:space="0" w:sz="7" w:val="single"/>
+              <w:bottom w:color="808080" w:space="0" w:sz="7" w:val="single"/>
+              <w:right w:color="808080" w:space="0" w:sz="7" w:val="single"/>
+            </w:tcBorders>
+            <w:tcMar>
+              <w:top w:w="0.0" w:type="dxa"/>
+              <w:left w:w="0.0" w:type="dxa"/>
+              <w:bottom w:w="0.0" w:type="dxa"/>
+              <w:right w:w="0.0" w:type="dxa"/>
+            </w:tcMar>
+            <w:vAlign w:val="center"/>
+          </w:tcPr>
+          <w:p>
+            <w:pPr>
+              <w:pStyle w:val="Heading3"/>
+              <w:keepNext w:val="0"/>
+              <w:keepLines w:val="0"/>
+              <w:spacing w:after="0" w:before="0" w:line="240" w:lineRule="auto"/>
+              <w:jc w:val="center"/>
+              <w:rPr>
+                <w:rFonts w:ascii="Malgun Gothic" w:cs="Malgun Gothic" w:eastAsia="Malgun Gothic" w:hAnsi="Malgun Gothic"/>
+                <w:color w:val="0000ff"/>
+                <w:sz w:val="22"/>
+                <w:szCs w:val="22"/>
+              </w:rPr>
+            </w:pPr>
+            <w:bookmarkStart w:colFirst="0" w:colLast="0" w:name="_d6fu8zjuee0s" w:id="1"/>
+            <w:bookmarkEnd w:id="1"/>
+            <w:r>
+              <w:rPr>
+                <w:rFonts w:ascii="Malgun Gothic" w:cs="Malgun Gothic" w:eastAsia="Malgun Gothic" w:hAnsi="Malgun Gothic"/>
+                <w:color w:val="0000ff"/>
+                <w:sz w:val="22"/>
+                <w:szCs w:val="22"/>
+                <w:rtl w:val="0"/>
+              </w:rPr>
+              <w:t xml:space="preserve">0.317</w:t>
+            </w:r>
+          </w:p>
+        </w:tc>
+        <w:tc>
+          <w:tcPr>
+            <w:tcBorders>
+              <w:top w:color="808080" w:space="0" w:sz="7" w:val="single"/>
+              <w:left w:color="808080" w:space="0" w:sz="7" w:val="single"/>
+              <w:bottom w:color="808080" w:space="0" w:sz="7" w:val="single"/>
+              <w:right w:color="808080" w:space="0" w:sz="7" w:val="single"/>
+            </w:tcBorders>
+            <w:tcMar>
+              <w:top w:w="0.0" w:type="dxa"/>
+              <w:left w:w="0.0" w:type="dxa"/>
+              <w:bottom w:w="0.0" w:type="dxa"/>
+              <w:right w:w="0.0" w:type="dxa"/>
+            </w:tcMar>
+            <w:vAlign w:val="center"/>
+          </w:tcPr>
+          <w:p>
+            <w:pPr>
+              <w:pStyle w:val="Heading3"/>
+              <w:keepNext w:val="0"/>
+              <w:keepLines w:val="0"/>
+              <w:spacing w:after="0" w:before="0" w:line="240" w:lineRule="auto"/>
+              <w:jc w:val="center"/>
+              <w:rPr>
+                <w:rFonts w:ascii="Malgun Gothic" w:cs="Malgun Gothic" w:eastAsia="Malgun Gothic" w:hAnsi="Malgun Gothic"/>
+                <w:color w:val="0000ff"/>
+                <w:sz w:val="22"/>
+                <w:szCs w:val="22"/>
+              </w:rPr>
+            </w:pPr>
+            <w:bookmarkStart w:colFirst="0" w:colLast="0" w:name="_d6fu8zjuee0s" w:id="1"/>
+            <w:bookmarkEnd w:id="1"/>
+            <w:r>
+              <w:rPr>
+                <w:rFonts w:ascii="Malgun Gothic" w:cs="Malgun Gothic" w:eastAsia="Malgun Gothic" w:hAnsi="Malgun Gothic"/>
+                <w:color w:val="0000ff"/>
+                <w:sz w:val="22"/>
+                <w:szCs w:val="22"/>
+                <w:rtl w:val="0"/>
+              </w:rPr>
+              <w:t xml:space="preserve">적중(상위 2위)</w:t>
+            </w:r>
+          </w:p>
+        </w:tc>
+      </w:tr>
+      <w:tr>
+        <w:trPr>
+          <w:cantSplit w:val="0"/>
+          <w:trHeight w:val="566.9291338582677" w:hRule="atLeast"/>
+          <w:tblHeader w:val="0"/>
+        </w:trPr>
+        <w:tc>
+          <w:tcPr>
+            <w:tcBorders>
+              <w:top w:color="808080" w:space="0" w:sz="7" w:val="single"/>
+              <w:left w:color="808080" w:space="0" w:sz="7" w:val="single"/>
+              <w:bottom w:color="808080" w:space="0" w:sz="7" w:val="single"/>
+              <w:right w:color="808080" w:space="0" w:sz="7" w:val="single"/>
+            </w:tcBorders>
+            <w:tcMar>
+              <w:top w:w="0.0" w:type="dxa"/>
+              <w:left w:w="0.0" w:type="dxa"/>
+              <w:bottom w:w="0.0" w:type="dxa"/>
+              <w:right w:w="0.0" w:type="dxa"/>
+            </w:tcMar>
+            <w:vAlign w:val="center"/>
+          </w:tcPr>
+          <w:p>
+            <w:pPr>
+              <w:pStyle w:val="Heading3"/>
+              <w:keepNext w:val="0"/>
+              <w:keepLines w:val="0"/>
+              <w:spacing w:after="0" w:before="0" w:line="240" w:lineRule="auto"/>
+              <w:jc w:val="center"/>
+              <w:rPr>
+                <w:rFonts w:ascii="Malgun Gothic" w:cs="Malgun Gothic" w:eastAsia="Malgun Gothic" w:hAnsi="Malgun Gothic"/>
+                <w:color w:val="0000ff"/>
+                <w:sz w:val="22"/>
+                <w:szCs w:val="22"/>
+              </w:rPr>
+            </w:pPr>
+            <w:bookmarkStart w:colFirst="0" w:colLast="0" w:name="_d6fu8zjuee0s" w:id="1"/>
+            <w:bookmarkEnd w:id="1"/>
+            <w:r>
+              <w:rPr>
+                <w:rFonts w:ascii="Malgun Gothic" w:cs="Malgun Gothic" w:eastAsia="Malgun Gothic" w:hAnsi="Malgun Gothic"/>
+                <w:color w:val="0000ff"/>
+                <w:sz w:val="22"/>
+                <w:szCs w:val="22"/>
+                <w:rtl w:val="0"/>
+              </w:rPr>
+              <w:t xml:space="preserve">M03</w:t>
+            </w:r>
+          </w:p>
+        </w:tc>
+        <w:tc>
+          <w:tcPr>
+            <w:tcBorders>
+              <w:top w:color="808080" w:space="0" w:sz="7" w:val="single"/>
+              <w:left w:color="808080" w:space="0" w:sz="7" w:val="single"/>
+              <w:bottom w:color="808080" w:space="0" w:sz="7" w:val="single"/>
+              <w:right w:color="808080" w:space="0" w:sz="7" w:val="single"/>
+            </w:tcBorders>
+            <w:tcMar>
+              <w:top w:w="0.0" w:type="dxa"/>
+              <w:left w:w="0.0" w:type="dxa"/>
+              <w:bottom w:w="0.0" w:type="dxa"/>
+              <w:right w:w="0.0" w:type="dxa"/>
+            </w:tcMar>
+            <w:vAlign w:val="center"/>
+          </w:tcPr>
+          <w:p>
+            <w:pPr>
+              <w:pStyle w:val="Heading3"/>
+              <w:keepNext w:val="0"/>
+              <w:keepLines w:val="0"/>
+              <w:spacing w:after="0" w:before="0" w:line="240" w:lineRule="auto"/>
+              <w:jc w:val="center"/>
+              <w:rPr>
+                <w:rFonts w:ascii="Malgun Gothic" w:cs="Malgun Gothic" w:eastAsia="Malgun Gothic" w:hAnsi="Malgun Gothic"/>
+                <w:color w:val="0000ff"/>
+                <w:sz w:val="22"/>
+                <w:szCs w:val="22"/>
+              </w:rPr>
+            </w:pPr>
+            <w:bookmarkStart w:colFirst="0" w:colLast="0" w:name="_d6fu8zjuee0s" w:id="1"/>
+            <w:bookmarkEnd w:id="1"/>
+            <w:r>
+              <w:rPr>
+                <w:rFonts w:ascii="Malgun Gothic" w:cs="Malgun Gothic" w:eastAsia="Malgun Gothic" w:hAnsi="Malgun Gothic"/>
+                <w:color w:val="0000ff"/>
+                <w:sz w:val="22"/>
+                <w:szCs w:val="22"/>
+                <w:rtl w:val="0"/>
+              </w:rPr>
+              <w:t xml:space="preserve">예약하고 갔는데 수영장이 만원이라 입장을 못 했어요</w:t>
+            </w:r>
+          </w:p>
+        </w:tc>
+        <w:tc>
+          <w:tcPr>
+            <w:tcBorders>
+              <w:top w:color="808080" w:space="0" w:sz="7" w:val="single"/>
+              <w:left w:color="808080" w:space="0" w:sz="7" w:val="single"/>
+              <w:bottom w:color="808080" w:space="0" w:sz="7" w:val="single"/>
+              <w:right w:color="808080" w:space="0" w:sz="7" w:val="single"/>
+            </w:tcBorders>
+            <w:tcMar>
+              <w:top w:w="0.0" w:type="dxa"/>
+              <w:left w:w="0.0" w:type="dxa"/>
+              <w:bottom w:w="0.0" w:type="dxa"/>
+              <w:right w:w="0.0" w:type="dxa"/>
+            </w:tcMar>
+            <w:vAlign w:val="center"/>
+          </w:tcPr>
+          <w:p>
+            <w:pPr>
+              <w:pStyle w:val="Heading3"/>
+              <w:keepNext w:val="0"/>
+              <w:keepLines w:val="0"/>
+              <w:spacing w:after="0" w:before="0" w:line="240" w:lineRule="auto"/>
+              <w:jc w:val="center"/>
+              <w:rPr>
+                <w:rFonts w:ascii="Malgun Gothic" w:cs="Malgun Gothic" w:eastAsia="Malgun Gothic" w:hAnsi="Malgun Gothic"/>
+                <w:color w:val="0000ff"/>
+                <w:sz w:val="22"/>
+                <w:szCs w:val="22"/>
+              </w:rPr>
+            </w:pPr>
+            <w:bookmarkStart w:colFirst="0" w:colLast="0" w:name="_d6fu8zjuee0s" w:id="1"/>
+            <w:bookmarkEnd w:id="1"/>
+            <w:r>
+              <w:rPr>
+                <w:rFonts w:ascii="Malgun Gothic" w:cs="Malgun Gothic" w:eastAsia="Malgun Gothic" w:hAnsi="Malgun Gothic"/>
+                <w:color w:val="0000ff"/>
+                <w:sz w:val="22"/>
+                <w:szCs w:val="22"/>
+                <w:rtl w:val="0"/>
+              </w:rPr>
+              <w:t xml:space="preserve">무료·무예약 활동을 무엇으로 판정하나 · 예약이 없다는 것과 모른다는 것</w:t>
+            </w:r>
+          </w:p>
+        </w:tc>
+        <w:tc>
+          <w:tcPr>
+            <w:tcBorders>
+              <w:top w:color="808080" w:space="0" w:sz="7" w:val="single"/>
+              <w:left w:color="808080" w:space="0" w:sz="7" w:val="single"/>
+              <w:bottom w:color="808080" w:space="0" w:sz="7" w:val="single"/>
+              <w:right w:color="808080" w:space="0" w:sz="7" w:val="single"/>
+            </w:tcBorders>
+            <w:tcMar>
+              <w:top w:w="0.0" w:type="dxa"/>
+              <w:left w:w="0.0" w:type="dxa"/>
+              <w:bottom w:w="0.0" w:type="dxa"/>
+              <w:right w:w="0.0" w:type="dxa"/>
+            </w:tcMar>
+            <w:vAlign w:val="center"/>
+          </w:tcPr>
+          <w:p>
+            <w:pPr>
+              <w:pStyle w:val="Heading3"/>
+              <w:keepNext w:val="0"/>
+              <w:keepLines w:val="0"/>
+              <w:spacing w:after="0" w:before="0" w:line="240" w:lineRule="auto"/>
+              <w:jc w:val="center"/>
+              <w:rPr>
+                <w:rFonts w:ascii="Malgun Gothic" w:cs="Malgun Gothic" w:eastAsia="Malgun Gothic" w:hAnsi="Malgun Gothic"/>
+                <w:color w:val="0000ff"/>
+                <w:sz w:val="22"/>
+                <w:szCs w:val="22"/>
+              </w:rPr>
+            </w:pPr>
+            <w:bookmarkStart w:colFirst="0" w:colLast="0" w:name="_d6fu8zjuee0s" w:id="1"/>
+            <w:bookmarkEnd w:id="1"/>
+            <w:r>
+              <w:rPr>
+                <w:rFonts w:ascii="Malgun Gothic" w:cs="Malgun Gothic" w:eastAsia="Malgun Gothic" w:hAnsi="Malgun Gothic"/>
+                <w:color w:val="0000ff"/>
+                <w:sz w:val="22"/>
+                <w:szCs w:val="22"/>
+                <w:rtl w:val="0"/>
+              </w:rPr>
+              <w:t xml:space="preserve">0.365</w:t>
+            </w:r>
+          </w:p>
+        </w:tc>
+        <w:tc>
+          <w:tcPr>
+            <w:tcBorders>
+              <w:top w:color="808080" w:space="0" w:sz="7" w:val="single"/>
+              <w:left w:color="808080" w:space="0" w:sz="7" w:val="single"/>
+              <w:bottom w:color="808080" w:space="0" w:sz="7" w:val="single"/>
+              <w:right w:color="808080" w:space="0" w:sz="7" w:val="single"/>
+            </w:tcBorders>
+            <w:tcMar>
+              <w:top w:w="0.0" w:type="dxa"/>
+              <w:left w:w="0.0" w:type="dxa"/>
+              <w:bottom w:w="0.0" w:type="dxa"/>
+              <w:right w:w="0.0" w:type="dxa"/>
+            </w:tcMar>
+            <w:vAlign w:val="center"/>
+          </w:tcPr>
+          <w:p>
+            <w:pPr>
+              <w:pStyle w:val="Heading3"/>
+              <w:keepNext w:val="0"/>
+              <w:keepLines w:val="0"/>
+              <w:spacing w:after="0" w:before="0" w:line="240" w:lineRule="auto"/>
+              <w:jc w:val="center"/>
+              <w:rPr>
+                <w:rFonts w:ascii="Malgun Gothic" w:cs="Malgun Gothic" w:eastAsia="Malgun Gothic" w:hAnsi="Malgun Gothic"/>
+                <w:color w:val="0000ff"/>
+                <w:sz w:val="22"/>
+                <w:szCs w:val="22"/>
+              </w:rPr>
+            </w:pPr>
+            <w:bookmarkStart w:colFirst="0" w:colLast="0" w:name="_d6fu8zjuee0s" w:id="1"/>
+            <w:bookmarkEnd w:id="1"/>
+            <w:r>
+              <w:rPr>
+                <w:rFonts w:ascii="Malgun Gothic" w:cs="Malgun Gothic" w:eastAsia="Malgun Gothic" w:hAnsi="Malgun Gothic"/>
+                <w:color w:val="0000ff"/>
+                <w:sz w:val="22"/>
+                <w:szCs w:val="22"/>
+                <w:rtl w:val="0"/>
+              </w:rPr>
+              <w:t xml:space="preserve">미적중(관련 문서 없음)</w:t>
+            </w:r>
+          </w:p>
+        </w:tc>
+      </w:tr>
+      <w:tr>
+        <w:trPr>
+          <w:cantSplit w:val="0"/>
+          <w:trHeight w:val="566.9291338582677" w:hRule="atLeast"/>
+          <w:tblHeader w:val="0"/>
+        </w:trPr>
+        <w:tc>
+          <w:tcPr>
+            <w:tcBorders>
+              <w:top w:color="808080" w:space="0" w:sz="7" w:val="single"/>
+              <w:left w:color="808080" w:space="0" w:sz="7" w:val="single"/>
+              <w:bottom w:color="808080" w:space="0" w:sz="7" w:val="single"/>
+              <w:right w:color="808080" w:space="0" w:sz="7" w:val="single"/>
+            </w:tcBorders>
+            <w:tcMar>
+              <w:top w:w="0.0" w:type="dxa"/>
+              <w:left w:w="0.0" w:type="dxa"/>
+              <w:bottom w:w="0.0" w:type="dxa"/>
+              <w:right w:w="0.0" w:type="dxa"/>
+            </w:tcMar>
+            <w:vAlign w:val="center"/>
+          </w:tcPr>
+          <w:p>
+            <w:pPr>
+              <w:pStyle w:val="Heading3"/>
+              <w:keepNext w:val="0"/>
+              <w:keepLines w:val="0"/>
+              <w:spacing w:after="0" w:before="0" w:line="240" w:lineRule="auto"/>
+              <w:jc w:val="center"/>
+              <w:rPr>
+                <w:rFonts w:ascii="Malgun Gothic" w:cs="Malgun Gothic" w:eastAsia="Malgun Gothic" w:hAnsi="Malgun Gothic"/>
+                <w:color w:val="0000ff"/>
+                <w:sz w:val="22"/>
+                <w:szCs w:val="22"/>
+              </w:rPr>
+            </w:pPr>
+            <w:bookmarkStart w:colFirst="0" w:colLast="0" w:name="_d6fu8zjuee0s" w:id="1"/>
+            <w:bookmarkEnd w:id="1"/>
+            <w:r>
+              <w:rPr>
+                <w:rFonts w:ascii="Malgun Gothic" w:cs="Malgun Gothic" w:eastAsia="Malgun Gothic" w:hAnsi="Malgun Gothic"/>
+                <w:color w:val="0000ff"/>
+                <w:sz w:val="22"/>
+                <w:szCs w:val="22"/>
+                <w:rtl w:val="0"/>
+              </w:rPr>
+              <w:t xml:space="preserve">M04</w:t>
+            </w:r>
+          </w:p>
+        </w:tc>
+        <w:tc>
+          <w:tcPr>
+            <w:tcBorders>
+              <w:top w:color="808080" w:space="0" w:sz="7" w:val="single"/>
+              <w:left w:color="808080" w:space="0" w:sz="7" w:val="single"/>
+              <w:bottom w:color="808080" w:space="0" w:sz="7" w:val="single"/>
+              <w:right w:color="808080" w:space="0" w:sz="7" w:val="single"/>
+            </w:tcBorders>
+            <w:tcMar>
+              <w:top w:w="0.0" w:type="dxa"/>
+              <w:left w:w="0.0" w:type="dxa"/>
+              <w:bottom w:w="0.0" w:type="dxa"/>
+              <w:right w:w="0.0" w:type="dxa"/>
+            </w:tcMar>
+            <w:vAlign w:val="center"/>
+          </w:tcPr>
+          <w:p>
+            <w:pPr>
+              <w:pStyle w:val="Heading3"/>
+              <w:keepNext w:val="0"/>
+              <w:keepLines w:val="0"/>
+              <w:spacing w:after="0" w:before="0" w:line="240" w:lineRule="auto"/>
+              <w:jc w:val="center"/>
+              <w:rPr>
+                <w:rFonts w:ascii="Malgun Gothic" w:cs="Malgun Gothic" w:eastAsia="Malgun Gothic" w:hAnsi="Malgun Gothic"/>
+                <w:color w:val="0000ff"/>
+                <w:sz w:val="22"/>
+                <w:szCs w:val="22"/>
+              </w:rPr>
+            </w:pPr>
+            <w:bookmarkStart w:colFirst="0" w:colLast="0" w:name="_d6fu8zjuee0s" w:id="1"/>
+            <w:bookmarkEnd w:id="1"/>
+            <w:r>
+              <w:rPr>
+                <w:rFonts w:ascii="Malgun Gothic" w:cs="Malgun Gothic" w:eastAsia="Malgun Gothic" w:hAnsi="Malgun Gothic"/>
+                <w:color w:val="0000ff"/>
+                <w:sz w:val="22"/>
+                <w:szCs w:val="22"/>
+                <w:rtl w:val="0"/>
+              </w:rPr>
+              <w:t xml:space="preserve">예약한 클라이밍장이 정원이 차서 이용을 못 했어요</w:t>
+            </w:r>
+          </w:p>
+        </w:tc>
+        <w:tc>
+          <w:tcPr>
+            <w:tcBorders>
+              <w:top w:color="808080" w:space="0" w:sz="7" w:val="single"/>
+              <w:left w:color="808080" w:space="0" w:sz="7" w:val="single"/>
+              <w:bottom w:color="808080" w:space="0" w:sz="7" w:val="single"/>
+              <w:right w:color="808080" w:space="0" w:sz="7" w:val="single"/>
+            </w:tcBorders>
+            <w:tcMar>
+              <w:top w:w="0.0" w:type="dxa"/>
+              <w:left w:w="0.0" w:type="dxa"/>
+              <w:bottom w:w="0.0" w:type="dxa"/>
+              <w:right w:w="0.0" w:type="dxa"/>
+            </w:tcMar>
+            <w:vAlign w:val="center"/>
+          </w:tcPr>
+          <w:p>
+            <w:pPr>
+              <w:pStyle w:val="Heading3"/>
+              <w:keepNext w:val="0"/>
+              <w:keepLines w:val="0"/>
+              <w:spacing w:after="0" w:before="0" w:line="240" w:lineRule="auto"/>
+              <w:jc w:val="center"/>
+              <w:rPr>
+                <w:rFonts w:ascii="Malgun Gothic" w:cs="Malgun Gothic" w:eastAsia="Malgun Gothic" w:hAnsi="Malgun Gothic"/>
+                <w:color w:val="0000ff"/>
+                <w:sz w:val="22"/>
+                <w:szCs w:val="22"/>
+              </w:rPr>
+            </w:pPr>
+            <w:bookmarkStart w:colFirst="0" w:colLast="0" w:name="_d6fu8zjuee0s" w:id="1"/>
+            <w:bookmarkEnd w:id="1"/>
+            <w:r>
+              <w:rPr>
+                <w:rFonts w:ascii="Malgun Gothic" w:cs="Malgun Gothic" w:eastAsia="Malgun Gothic" w:hAnsi="Malgun Gothic"/>
+                <w:color w:val="0000ff"/>
+                <w:sz w:val="22"/>
+                <w:szCs w:val="22"/>
+                <w:rtl w:val="0"/>
+              </w:rPr>
+              <w:t xml:space="preserve">소비자분쟁해결기준 — 체육시설·레저·공연 · 시설을 정상적으로 이용할 수 없을 때</w:t>
+            </w:r>
+          </w:p>
+        </w:tc>
+        <w:tc>
+          <w:tcPr>
+            <w:tcBorders>
+              <w:top w:color="808080" w:space="0" w:sz="7" w:val="single"/>
+              <w:left w:color="808080" w:space="0" w:sz="7" w:val="single"/>
+              <w:bottom w:color="808080" w:space="0" w:sz="7" w:val="single"/>
+              <w:right w:color="808080" w:space="0" w:sz="7" w:val="single"/>
+            </w:tcBorders>
+            <w:tcMar>
+              <w:top w:w="0.0" w:type="dxa"/>
+              <w:left w:w="0.0" w:type="dxa"/>
+              <w:bottom w:w="0.0" w:type="dxa"/>
+              <w:right w:w="0.0" w:type="dxa"/>
+            </w:tcMar>
+            <w:vAlign w:val="center"/>
+          </w:tcPr>
+          <w:p>
+            <w:pPr>
+              <w:pStyle w:val="Heading3"/>
+              <w:keepNext w:val="0"/>
+              <w:keepLines w:val="0"/>
+              <w:spacing w:after="0" w:before="0" w:line="240" w:lineRule="auto"/>
+              <w:jc w:val="center"/>
+              <w:rPr>
+                <w:rFonts w:ascii="Malgun Gothic" w:cs="Malgun Gothic" w:eastAsia="Malgun Gothic" w:hAnsi="Malgun Gothic"/>
+                <w:color w:val="0000ff"/>
+                <w:sz w:val="22"/>
+                <w:szCs w:val="22"/>
+              </w:rPr>
+            </w:pPr>
+            <w:bookmarkStart w:colFirst="0" w:colLast="0" w:name="_d6fu8zjuee0s" w:id="1"/>
+            <w:bookmarkEnd w:id="1"/>
+            <w:r>
+              <w:rPr>
+                <w:rFonts w:ascii="Malgun Gothic" w:cs="Malgun Gothic" w:eastAsia="Malgun Gothic" w:hAnsi="Malgun Gothic"/>
+                <w:color w:val="0000ff"/>
+                <w:sz w:val="22"/>
+                <w:szCs w:val="22"/>
+                <w:rtl w:val="0"/>
+              </w:rPr>
+              <w:t xml:space="preserve">0.408</w:t>
+            </w:r>
+          </w:p>
+        </w:tc>
+        <w:tc>
+          <w:tcPr>
+            <w:tcBorders>
+              <w:top w:color="808080" w:space="0" w:sz="7" w:val="single"/>
+              <w:left w:color="808080" w:space="0" w:sz="7" w:val="single"/>
+              <w:bottom w:color="808080" w:space="0" w:sz="7" w:val="single"/>
+              <w:right w:color="808080" w:space="0" w:sz="7" w:val="single"/>
+            </w:tcBorders>
+            <w:tcMar>
+              <w:top w:w="0.0" w:type="dxa"/>
+              <w:left w:w="0.0" w:type="dxa"/>
+              <w:bottom w:w="0.0" w:type="dxa"/>
+              <w:right w:w="0.0" w:type="dxa"/>
+            </w:tcMar>
+            <w:vAlign w:val="center"/>
+          </w:tcPr>
+          <w:p>
+            <w:pPr>
+              <w:pStyle w:val="Heading3"/>
+              <w:keepNext w:val="0"/>
+              <w:keepLines w:val="0"/>
+              <w:spacing w:after="0" w:before="0" w:line="240" w:lineRule="auto"/>
+              <w:jc w:val="center"/>
+              <w:rPr>
+                <w:rFonts w:ascii="Malgun Gothic" w:cs="Malgun Gothic" w:eastAsia="Malgun Gothic" w:hAnsi="Malgun Gothic"/>
+                <w:color w:val="0000ff"/>
+                <w:sz w:val="22"/>
+                <w:szCs w:val="22"/>
+              </w:rPr>
+            </w:pPr>
+            <w:bookmarkStart w:colFirst="0" w:colLast="0" w:name="_d6fu8zjuee0s" w:id="1"/>
+            <w:bookmarkEnd w:id="1"/>
+            <w:r>
+              <w:rPr>
+                <w:rFonts w:ascii="Malgun Gothic" w:cs="Malgun Gothic" w:eastAsia="Malgun Gothic" w:hAnsi="Malgun Gothic"/>
+                <w:color w:val="0000ff"/>
+                <w:sz w:val="22"/>
+                <w:szCs w:val="22"/>
+                <w:rtl w:val="0"/>
+              </w:rPr>
+              <w:t xml:space="preserve">적중(상위 1위)</w:t>
+            </w:r>
+          </w:p>
+        </w:tc>
+      </w:tr>
+      <w:tr>
+        <w:trPr>
+          <w:cantSplit w:val="0"/>
+          <w:trHeight w:val="566.9291338582677" w:hRule="atLeast"/>
+          <w:tblHeader w:val="0"/>
+        </w:trPr>
+        <w:tc>
+          <w:tcPr>
+            <w:tcBorders>
+              <w:top w:color="808080" w:space="0" w:sz="7" w:val="single"/>
+              <w:left w:color="808080" w:space="0" w:sz="7" w:val="single"/>
+              <w:bottom w:color="808080" w:space="0" w:sz="7" w:val="single"/>
+              <w:right w:color="808080" w:space="0" w:sz="7" w:val="single"/>
+            </w:tcBorders>
+            <w:tcMar>
+              <w:top w:w="0.0" w:type="dxa"/>
+              <w:left w:w="0.0" w:type="dxa"/>
+              <w:bottom w:w="0.0" w:type="dxa"/>
+              <w:right w:w="0.0" w:type="dxa"/>
+            </w:tcMar>
+            <w:vAlign w:val="center"/>
+          </w:tcPr>
+          <w:p>
+            <w:pPr>
+              <w:pStyle w:val="Heading3"/>
+              <w:keepNext w:val="0"/>
+              <w:keepLines w:val="0"/>
+              <w:spacing w:after="0" w:before="0" w:line="240" w:lineRule="auto"/>
+              <w:jc w:val="center"/>
+              <w:rPr>
+                <w:rFonts w:ascii="Malgun Gothic" w:cs="Malgun Gothic" w:eastAsia="Malgun Gothic" w:hAnsi="Malgun Gothic"/>
+                <w:color w:val="0000ff"/>
+                <w:sz w:val="22"/>
+                <w:szCs w:val="22"/>
+              </w:rPr>
+            </w:pPr>
+            <w:bookmarkStart w:colFirst="0" w:colLast="0" w:name="_d6fu8zjuee0s" w:id="1"/>
+            <w:bookmarkEnd w:id="1"/>
+            <w:r>
+              <w:rPr>
+                <w:rFonts w:ascii="Malgun Gothic" w:cs="Malgun Gothic" w:eastAsia="Malgun Gothic" w:hAnsi="Malgun Gothic"/>
+                <w:color w:val="0000ff"/>
+                <w:sz w:val="22"/>
+                <w:szCs w:val="22"/>
+                <w:rtl w:val="0"/>
+              </w:rPr>
+              <w:t xml:space="preserve">M05</w:t>
+            </w:r>
+          </w:p>
+        </w:tc>
+        <w:tc>
+          <w:tcPr>
+            <w:tcBorders>
+              <w:top w:color="808080" w:space="0" w:sz="7" w:val="single"/>
+              <w:left w:color="808080" w:space="0" w:sz="7" w:val="single"/>
+              <w:bottom w:color="808080" w:space="0" w:sz="7" w:val="single"/>
+              <w:right w:color="808080" w:space="0" w:sz="7" w:val="single"/>
+            </w:tcBorders>
+            <w:tcMar>
+              <w:top w:w="0.0" w:type="dxa"/>
+              <w:left w:w="0.0" w:type="dxa"/>
+              <w:bottom w:w="0.0" w:type="dxa"/>
+              <w:right w:w="0.0" w:type="dxa"/>
+            </w:tcMar>
+            <w:vAlign w:val="center"/>
+          </w:tcPr>
+          <w:p>
+            <w:pPr>
+              <w:pStyle w:val="Heading3"/>
+              <w:keepNext w:val="0"/>
+              <w:keepLines w:val="0"/>
+              <w:spacing w:after="0" w:before="0" w:line="240" w:lineRule="auto"/>
+              <w:jc w:val="center"/>
+              <w:rPr>
+                <w:rFonts w:ascii="Malgun Gothic" w:cs="Malgun Gothic" w:eastAsia="Malgun Gothic" w:hAnsi="Malgun Gothic"/>
+                <w:color w:val="0000ff"/>
+                <w:sz w:val="22"/>
+                <w:szCs w:val="22"/>
+              </w:rPr>
+            </w:pPr>
+            <w:bookmarkStart w:colFirst="0" w:colLast="0" w:name="_d6fu8zjuee0s" w:id="1"/>
+            <w:bookmarkEnd w:id="1"/>
+            <w:r>
+              <w:rPr>
+                <w:rFonts w:ascii="Malgun Gothic" w:cs="Malgun Gothic" w:eastAsia="Malgun Gothic" w:hAnsi="Malgun Gothic"/>
+                <w:color w:val="0000ff"/>
+                <w:sz w:val="22"/>
+                <w:szCs w:val="22"/>
+                <w:rtl w:val="0"/>
+              </w:rPr>
+              <w:t xml:space="preserve">할머니가 돌아가셔서 여행을 못 가게 됐어요. 취소 수수료는요?</w:t>
+            </w:r>
+          </w:p>
+        </w:tc>
+        <w:tc>
+          <w:tcPr>
+            <w:tcBorders>
+              <w:top w:color="808080" w:space="0" w:sz="7" w:val="single"/>
+              <w:left w:color="808080" w:space="0" w:sz="7" w:val="single"/>
+              <w:bottom w:color="808080" w:space="0" w:sz="7" w:val="single"/>
+              <w:right w:color="808080" w:space="0" w:sz="7" w:val="single"/>
+            </w:tcBorders>
+            <w:tcMar>
+              <w:top w:w="0.0" w:type="dxa"/>
+              <w:left w:w="0.0" w:type="dxa"/>
+              <w:bottom w:w="0.0" w:type="dxa"/>
+              <w:right w:w="0.0" w:type="dxa"/>
+            </w:tcMar>
+            <w:vAlign w:val="center"/>
+          </w:tcPr>
+          <w:p>
+            <w:pPr>
+              <w:pStyle w:val="Heading3"/>
+              <w:keepNext w:val="0"/>
+              <w:keepLines w:val="0"/>
+              <w:spacing w:after="0" w:before="0" w:line="240" w:lineRule="auto"/>
+              <w:jc w:val="center"/>
+              <w:rPr>
+                <w:rFonts w:ascii="Malgun Gothic" w:cs="Malgun Gothic" w:eastAsia="Malgun Gothic" w:hAnsi="Malgun Gothic"/>
+                <w:color w:val="0000ff"/>
+                <w:sz w:val="22"/>
+                <w:szCs w:val="22"/>
+              </w:rPr>
+            </w:pPr>
+            <w:bookmarkStart w:colFirst="0" w:colLast="0" w:name="_d6fu8zjuee0s" w:id="1"/>
+            <w:bookmarkEnd w:id="1"/>
+            <w:r>
+              <w:rPr>
+                <w:rFonts w:ascii="Malgun Gothic" w:cs="Malgun Gothic" w:eastAsia="Malgun Gothic" w:hAnsi="Malgun Gothic"/>
+                <w:color w:val="0000ff"/>
+                <w:sz w:val="22"/>
+                <w:szCs w:val="22"/>
+                <w:rtl w:val="0"/>
+              </w:rPr>
+              <w:t xml:space="preserve">소비자분쟁해결기준 — 국내여행 · 인원 미달과 불가항력으로 취소하는 경우</w:t>
+            </w:r>
+          </w:p>
+        </w:tc>
+        <w:tc>
+          <w:tcPr>
+            <w:tcBorders>
+              <w:top w:color="808080" w:space="0" w:sz="7" w:val="single"/>
+              <w:left w:color="808080" w:space="0" w:sz="7" w:val="single"/>
+              <w:bottom w:color="808080" w:space="0" w:sz="7" w:val="single"/>
+              <w:right w:color="808080" w:space="0" w:sz="7" w:val="single"/>
+            </w:tcBorders>
+            <w:tcMar>
+              <w:top w:w="0.0" w:type="dxa"/>
+              <w:left w:w="0.0" w:type="dxa"/>
+              <w:bottom w:w="0.0" w:type="dxa"/>
+              <w:right w:w="0.0" w:type="dxa"/>
+            </w:tcMar>
+            <w:vAlign w:val="center"/>
+          </w:tcPr>
+          <w:p>
+            <w:pPr>
+              <w:pStyle w:val="Heading3"/>
+              <w:keepNext w:val="0"/>
+              <w:keepLines w:val="0"/>
+              <w:spacing w:after="0" w:before="0" w:line="240" w:lineRule="auto"/>
+              <w:jc w:val="center"/>
+              <w:rPr>
+                <w:rFonts w:ascii="Malgun Gothic" w:cs="Malgun Gothic" w:eastAsia="Malgun Gothic" w:hAnsi="Malgun Gothic"/>
+                <w:color w:val="0000ff"/>
+                <w:sz w:val="22"/>
+                <w:szCs w:val="22"/>
+              </w:rPr>
+            </w:pPr>
+            <w:bookmarkStart w:colFirst="0" w:colLast="0" w:name="_d6fu8zjuee0s" w:id="1"/>
+            <w:bookmarkEnd w:id="1"/>
+            <w:r>
+              <w:rPr>
+                <w:rFonts w:ascii="Malgun Gothic" w:cs="Malgun Gothic" w:eastAsia="Malgun Gothic" w:hAnsi="Malgun Gothic"/>
+                <w:color w:val="0000ff"/>
+                <w:sz w:val="22"/>
+                <w:szCs w:val="22"/>
+                <w:rtl w:val="0"/>
+              </w:rPr>
+              <w:t xml:space="preserve">0.512</w:t>
+            </w:r>
+          </w:p>
+        </w:tc>
+        <w:tc>
+          <w:tcPr>
+            <w:tcBorders>
+              <w:top w:color="808080" w:space="0" w:sz="7" w:val="single"/>
+              <w:left w:color="808080" w:space="0" w:sz="7" w:val="single"/>
+              <w:bottom w:color="808080" w:space="0" w:sz="7" w:val="single"/>
+              <w:right w:color="808080" w:space="0" w:sz="7" w:val="single"/>
+            </w:tcBorders>
+            <w:tcMar>
+              <w:top w:w="0.0" w:type="dxa"/>
+              <w:left w:w="0.0" w:type="dxa"/>
+              <w:bottom w:w="0.0" w:type="dxa"/>
+              <w:right w:w="0.0" w:type="dxa"/>
+            </w:tcMar>
+            <w:vAlign w:val="center"/>
+          </w:tcPr>
+          <w:p>
+            <w:pPr>
+              <w:pStyle w:val="Heading3"/>
+              <w:keepNext w:val="0"/>
+              <w:keepLines w:val="0"/>
+              <w:spacing w:after="0" w:before="0" w:line="240" w:lineRule="auto"/>
+              <w:jc w:val="center"/>
+              <w:rPr>
+                <w:rFonts w:ascii="Malgun Gothic" w:cs="Malgun Gothic" w:eastAsia="Malgun Gothic" w:hAnsi="Malgun Gothic"/>
+                <w:color w:val="0000ff"/>
+                <w:sz w:val="22"/>
+                <w:szCs w:val="22"/>
+              </w:rPr>
+            </w:pPr>
+            <w:bookmarkStart w:colFirst="0" w:colLast="0" w:name="_d6fu8zjuee0s" w:id="1"/>
+            <w:bookmarkEnd w:id="1"/>
+            <w:r>
+              <w:rPr>
+                <w:rFonts w:ascii="Malgun Gothic" w:cs="Malgun Gothic" w:eastAsia="Malgun Gothic" w:hAnsi="Malgun Gothic"/>
+                <w:color w:val="0000ff"/>
+                <w:sz w:val="22"/>
+                <w:szCs w:val="22"/>
+                <w:rtl w:val="0"/>
+              </w:rPr>
+              <w:t xml:space="preserve">적중(상위 3위)</w:t>
+            </w:r>
+          </w:p>
+        </w:tc>
+      </w:tr>
+      <w:tr>
+        <w:trPr>
+          <w:cantSplit w:val="0"/>
+          <w:trHeight w:val="566.9291338582677" w:hRule="atLeast"/>
+          <w:tblHeader w:val="0"/>
+        </w:trPr>
+        <w:tc>
+          <w:tcPr>
+            <w:tcBorders>
+              <w:top w:color="808080" w:space="0" w:sz="7" w:val="single"/>
+              <w:left w:color="808080" w:space="0" w:sz="7" w:val="single"/>
+              <w:bottom w:color="808080" w:space="0" w:sz="7" w:val="single"/>
+              <w:right w:color="808080" w:space="0" w:sz="7" w:val="single"/>
+            </w:tcBorders>
+            <w:tcMar>
+              <w:top w:w="0.0" w:type="dxa"/>
+              <w:left w:w="0.0" w:type="dxa"/>
+              <w:bottom w:w="0.0" w:type="dxa"/>
+              <w:right w:w="0.0" w:type="dxa"/>
+            </w:tcMar>
+            <w:vAlign w:val="center"/>
+          </w:tcPr>
+          <w:p>
+            <w:pPr>
+              <w:pStyle w:val="Heading3"/>
+              <w:keepNext w:val="0"/>
+              <w:keepLines w:val="0"/>
+              <w:spacing w:after="0" w:before="0" w:line="240" w:lineRule="auto"/>
+              <w:jc w:val="center"/>
+              <w:rPr>
+                <w:rFonts w:ascii="Malgun Gothic" w:cs="Malgun Gothic" w:eastAsia="Malgun Gothic" w:hAnsi="Malgun Gothic"/>
+                <w:color w:val="0000ff"/>
+                <w:sz w:val="22"/>
+                <w:szCs w:val="22"/>
+              </w:rPr>
+            </w:pPr>
+            <w:bookmarkStart w:colFirst="0" w:colLast="0" w:name="_d6fu8zjuee0s" w:id="1"/>
+            <w:bookmarkEnd w:id="1"/>
+            <w:r>
+              <w:rPr>
+                <w:rFonts w:ascii="Malgun Gothic" w:cs="Malgun Gothic" w:eastAsia="Malgun Gothic" w:hAnsi="Malgun Gothic"/>
+                <w:color w:val="0000ff"/>
+                <w:sz w:val="22"/>
+                <w:szCs w:val="22"/>
+                <w:rtl w:val="0"/>
+              </w:rPr>
+              <w:t xml:space="preserve">M06</w:t>
+            </w:r>
+          </w:p>
+        </w:tc>
+        <w:tc>
+          <w:tcPr>
+            <w:tcBorders>
+              <w:top w:color="808080" w:space="0" w:sz="7" w:val="single"/>
+              <w:left w:color="808080" w:space="0" w:sz="7" w:val="single"/>
+              <w:bottom w:color="808080" w:space="0" w:sz="7" w:val="single"/>
+              <w:right w:color="808080" w:space="0" w:sz="7" w:val="single"/>
+            </w:tcBorders>
+            <w:tcMar>
+              <w:top w:w="0.0" w:type="dxa"/>
+              <w:left w:w="0.0" w:type="dxa"/>
+              <w:bottom w:w="0.0" w:type="dxa"/>
+              <w:right w:w="0.0" w:type="dxa"/>
+            </w:tcMar>
+            <w:vAlign w:val="center"/>
+          </w:tcPr>
+          <w:p>
+            <w:pPr>
+              <w:pStyle w:val="Heading3"/>
+              <w:keepNext w:val="0"/>
+              <w:keepLines w:val="0"/>
+              <w:spacing w:after="0" w:before="0" w:line="240" w:lineRule="auto"/>
+              <w:jc w:val="center"/>
+              <w:rPr>
+                <w:rFonts w:ascii="Malgun Gothic" w:cs="Malgun Gothic" w:eastAsia="Malgun Gothic" w:hAnsi="Malgun Gothic"/>
+                <w:color w:val="0000ff"/>
+                <w:sz w:val="22"/>
+                <w:szCs w:val="22"/>
+              </w:rPr>
+            </w:pPr>
+            <w:bookmarkStart w:colFirst="0" w:colLast="0" w:name="_d6fu8zjuee0s" w:id="1"/>
+            <w:bookmarkEnd w:id="1"/>
+            <w:r>
+              <w:rPr>
+                <w:rFonts w:ascii="Malgun Gothic" w:cs="Malgun Gothic" w:eastAsia="Malgun Gothic" w:hAnsi="Malgun Gothic"/>
+                <w:color w:val="0000ff"/>
+                <w:sz w:val="22"/>
+                <w:szCs w:val="22"/>
+                <w:rtl w:val="0"/>
+              </w:rPr>
+              <w:t xml:space="preserve">삼촌 장례 때문에 일정을 취소하려고 해요. 위약금이 있나요?</w:t>
+            </w:r>
+          </w:p>
+        </w:tc>
+        <w:tc>
+          <w:tcPr>
+            <w:tcBorders>
+              <w:top w:color="808080" w:space="0" w:sz="7" w:val="single"/>
+              <w:left w:color="808080" w:space="0" w:sz="7" w:val="single"/>
+              <w:bottom w:color="808080" w:space="0" w:sz="7" w:val="single"/>
+              <w:right w:color="808080" w:space="0" w:sz="7" w:val="single"/>
+            </w:tcBorders>
+            <w:tcMar>
+              <w:top w:w="0.0" w:type="dxa"/>
+              <w:left w:w="0.0" w:type="dxa"/>
+              <w:bottom w:w="0.0" w:type="dxa"/>
+              <w:right w:w="0.0" w:type="dxa"/>
+            </w:tcMar>
+            <w:vAlign w:val="center"/>
+          </w:tcPr>
+          <w:p>
+            <w:pPr>
+              <w:pStyle w:val="Heading3"/>
+              <w:keepNext w:val="0"/>
+              <w:keepLines w:val="0"/>
+              <w:spacing w:after="0" w:before="0" w:line="240" w:lineRule="auto"/>
+              <w:jc w:val="center"/>
+              <w:rPr>
+                <w:rFonts w:ascii="Malgun Gothic" w:cs="Malgun Gothic" w:eastAsia="Malgun Gothic" w:hAnsi="Malgun Gothic"/>
+                <w:color w:val="0000ff"/>
+                <w:sz w:val="22"/>
+                <w:szCs w:val="22"/>
+              </w:rPr>
+            </w:pPr>
+            <w:bookmarkStart w:colFirst="0" w:colLast="0" w:name="_d6fu8zjuee0s" w:id="1"/>
+            <w:bookmarkEnd w:id="1"/>
+            <w:r>
+              <w:rPr>
+                <w:rFonts w:ascii="Malgun Gothic" w:cs="Malgun Gothic" w:eastAsia="Malgun Gothic" w:hAnsi="Malgun Gothic"/>
+                <w:color w:val="0000ff"/>
+                <w:sz w:val="22"/>
+                <w:szCs w:val="22"/>
+                <w:rtl w:val="0"/>
+              </w:rPr>
+              <w:t xml:space="preserve">소비자분쟁해결기준 — 국내여행 · 인원 미달과 불가항력으로 취소하는 경우</w:t>
+            </w:r>
+          </w:p>
+        </w:tc>
+        <w:tc>
+          <w:tcPr>
+            <w:tcBorders>
+              <w:top w:color="808080" w:space="0" w:sz="7" w:val="single"/>
+              <w:left w:color="808080" w:space="0" w:sz="7" w:val="single"/>
+              <w:bottom w:color="808080" w:space="0" w:sz="7" w:val="single"/>
+              <w:right w:color="808080" w:space="0" w:sz="7" w:val="single"/>
+            </w:tcBorders>
+            <w:tcMar>
+              <w:top w:w="0.0" w:type="dxa"/>
+              <w:left w:w="0.0" w:type="dxa"/>
+              <w:bottom w:w="0.0" w:type="dxa"/>
+              <w:right w:w="0.0" w:type="dxa"/>
+            </w:tcMar>
+            <w:vAlign w:val="center"/>
+          </w:tcPr>
+          <w:p>
+            <w:pPr>
+              <w:pStyle w:val="Heading3"/>
+              <w:keepNext w:val="0"/>
+              <w:keepLines w:val="0"/>
+              <w:spacing w:after="0" w:before="0" w:line="240" w:lineRule="auto"/>
+              <w:jc w:val="center"/>
+              <w:rPr>
+                <w:rFonts w:ascii="Malgun Gothic" w:cs="Malgun Gothic" w:eastAsia="Malgun Gothic" w:hAnsi="Malgun Gothic"/>
+                <w:color w:val="0000ff"/>
+                <w:sz w:val="22"/>
+                <w:szCs w:val="22"/>
+              </w:rPr>
+            </w:pPr>
+            <w:bookmarkStart w:colFirst="0" w:colLast="0" w:name="_d6fu8zjuee0s" w:id="1"/>
+            <w:bookmarkEnd w:id="1"/>
+            <w:r>
+              <w:rPr>
+                <w:rFonts w:ascii="Malgun Gothic" w:cs="Malgun Gothic" w:eastAsia="Malgun Gothic" w:hAnsi="Malgun Gothic"/>
+                <w:color w:val="0000ff"/>
+                <w:sz w:val="22"/>
+                <w:szCs w:val="22"/>
+                <w:rtl w:val="0"/>
+              </w:rPr>
+              <w:t xml:space="preserve">0.500</w:t>
+            </w:r>
+          </w:p>
+        </w:tc>
+        <w:tc>
+          <w:tcPr>
+            <w:tcBorders>
+              <w:top w:color="808080" w:space="0" w:sz="7" w:val="single"/>
+              <w:left w:color="808080" w:space="0" w:sz="7" w:val="single"/>
+              <w:bottom w:color="808080" w:space="0" w:sz="7" w:val="single"/>
+              <w:right w:color="808080" w:space="0" w:sz="7" w:val="single"/>
+            </w:tcBorders>
+            <w:tcMar>
+              <w:top w:w="0.0" w:type="dxa"/>
+              <w:left w:w="0.0" w:type="dxa"/>
+              <w:bottom w:w="0.0" w:type="dxa"/>
+              <w:right w:w="0.0" w:type="dxa"/>
+            </w:tcMar>
+            <w:vAlign w:val="center"/>
+          </w:tcPr>
+          <w:p>
+            <w:pPr>
+              <w:pStyle w:val="Heading3"/>
+              <w:keepNext w:val="0"/>
+              <w:keepLines w:val="0"/>
+              <w:spacing w:after="0" w:before="0" w:line="240" w:lineRule="auto"/>
+              <w:jc w:val="center"/>
+              <w:rPr>
+                <w:rFonts w:ascii="Malgun Gothic" w:cs="Malgun Gothic" w:eastAsia="Malgun Gothic" w:hAnsi="Malgun Gothic"/>
+                <w:color w:val="0000ff"/>
+                <w:sz w:val="22"/>
+                <w:szCs w:val="22"/>
+              </w:rPr>
+            </w:pPr>
+            <w:bookmarkStart w:colFirst="0" w:colLast="0" w:name="_d6fu8zjuee0s" w:id="1"/>
+            <w:bookmarkEnd w:id="1"/>
+            <w:r>
+              <w:rPr>
+                <w:rFonts w:ascii="Malgun Gothic" w:cs="Malgun Gothic" w:eastAsia="Malgun Gothic" w:hAnsi="Malgun Gothic"/>
+                <w:color w:val="0000ff"/>
+                <w:sz w:val="22"/>
+                <w:szCs w:val="22"/>
+                <w:rtl w:val="0"/>
+              </w:rPr>
+              <w:t xml:space="preserve">미적중(관련 문서 없음)</w:t>
+            </w:r>
+          </w:p>
+        </w:tc>
+      </w:tr>
+      <w:tr>
+        <w:trPr>
+          <w:cantSplit w:val="0"/>
+          <w:trHeight w:val="566.9291338582677" w:hRule="atLeast"/>
+          <w:tblHeader w:val="0"/>
+        </w:trPr>
+        <w:tc>
+          <w:tcPr>
+            <w:tcBorders>
+              <w:top w:color="808080" w:space="0" w:sz="7" w:val="single"/>
+              <w:left w:color="808080" w:space="0" w:sz="7" w:val="single"/>
+              <w:bottom w:color="808080" w:space="0" w:sz="7" w:val="single"/>
+              <w:right w:color="808080" w:space="0" w:sz="7" w:val="single"/>
+            </w:tcBorders>
+            <w:tcMar>
+              <w:top w:w="0.0" w:type="dxa"/>
+              <w:left w:w="0.0" w:type="dxa"/>
+              <w:bottom w:w="0.0" w:type="dxa"/>
+              <w:right w:w="0.0" w:type="dxa"/>
+            </w:tcMar>
+            <w:vAlign w:val="center"/>
+          </w:tcPr>
+          <w:p>
+            <w:pPr>
+              <w:pStyle w:val="Heading3"/>
+              <w:keepNext w:val="0"/>
+              <w:keepLines w:val="0"/>
+              <w:spacing w:after="0" w:before="0" w:line="240" w:lineRule="auto"/>
+              <w:jc w:val="center"/>
+              <w:rPr>
+                <w:rFonts w:ascii="Malgun Gothic" w:cs="Malgun Gothic" w:eastAsia="Malgun Gothic" w:hAnsi="Malgun Gothic"/>
+                <w:color w:val="0000ff"/>
+                <w:sz w:val="22"/>
+                <w:szCs w:val="22"/>
+              </w:rPr>
+            </w:pPr>
+            <w:bookmarkStart w:colFirst="0" w:colLast="0" w:name="_d6fu8zjuee0s" w:id="1"/>
+            <w:bookmarkEnd w:id="1"/>
+            <w:r>
+              <w:rPr>
+                <w:rFonts w:ascii="Malgun Gothic" w:cs="Malgun Gothic" w:eastAsia="Malgun Gothic" w:hAnsi="Malgun Gothic"/>
+                <w:color w:val="0000ff"/>
+                <w:sz w:val="22"/>
+                <w:szCs w:val="22"/>
+                <w:rtl w:val="0"/>
+              </w:rPr>
+              <w:t xml:space="preserve">M07</w:t>
+            </w:r>
+          </w:p>
+        </w:tc>
+        <w:tc>
+          <w:tcPr>
+            <w:tcBorders>
+              <w:top w:color="808080" w:space="0" w:sz="7" w:val="single"/>
+              <w:left w:color="808080" w:space="0" w:sz="7" w:val="single"/>
+              <w:bottom w:color="808080" w:space="0" w:sz="7" w:val="single"/>
+              <w:right w:color="808080" w:space="0" w:sz="7" w:val="single"/>
+            </w:tcBorders>
+            <w:tcMar>
+              <w:top w:w="0.0" w:type="dxa"/>
+              <w:left w:w="0.0" w:type="dxa"/>
+              <w:bottom w:w="0.0" w:type="dxa"/>
+              <w:right w:w="0.0" w:type="dxa"/>
+            </w:tcMar>
+            <w:vAlign w:val="center"/>
+          </w:tcPr>
+          <w:p>
+            <w:pPr>
+              <w:pStyle w:val="Heading3"/>
+              <w:keepNext w:val="0"/>
+              <w:keepLines w:val="0"/>
+              <w:spacing w:after="0" w:before="0" w:line="240" w:lineRule="auto"/>
+              <w:jc w:val="center"/>
+              <w:rPr>
+                <w:rFonts w:ascii="Malgun Gothic" w:cs="Malgun Gothic" w:eastAsia="Malgun Gothic" w:hAnsi="Malgun Gothic"/>
+                <w:color w:val="0000ff"/>
+                <w:sz w:val="22"/>
+                <w:szCs w:val="22"/>
+              </w:rPr>
+            </w:pPr>
+            <w:bookmarkStart w:colFirst="0" w:colLast="0" w:name="_d6fu8zjuee0s" w:id="1"/>
+            <w:bookmarkEnd w:id="1"/>
+            <w:r>
+              <w:rPr>
+                <w:rFonts w:ascii="Malgun Gothic" w:cs="Malgun Gothic" w:eastAsia="Malgun Gothic" w:hAnsi="Malgun Gothic"/>
+                <w:color w:val="0000ff"/>
+                <w:sz w:val="22"/>
+                <w:szCs w:val="22"/>
+                <w:rtl w:val="0"/>
+              </w:rPr>
+              <w:t xml:space="preserve">몸이 많이 아파서 여행 참가가 어려운데 위약금 없이 취소되나요?</w:t>
+            </w:r>
+          </w:p>
+        </w:tc>
+        <w:tc>
+          <w:tcPr>
+            <w:tcBorders>
+              <w:top w:color="808080" w:space="0" w:sz="7" w:val="single"/>
+              <w:left w:color="808080" w:space="0" w:sz="7" w:val="single"/>
+              <w:bottom w:color="808080" w:space="0" w:sz="7" w:val="single"/>
+              <w:right w:color="808080" w:space="0" w:sz="7" w:val="single"/>
+            </w:tcBorders>
+            <w:tcMar>
+              <w:top w:w="0.0" w:type="dxa"/>
+              <w:left w:w="0.0" w:type="dxa"/>
+              <w:bottom w:w="0.0" w:type="dxa"/>
+              <w:right w:w="0.0" w:type="dxa"/>
+            </w:tcMar>
+            <w:vAlign w:val="center"/>
+          </w:tcPr>
+          <w:p>
+            <w:pPr>
+              <w:pStyle w:val="Heading3"/>
+              <w:keepNext w:val="0"/>
+              <w:keepLines w:val="0"/>
+              <w:spacing w:after="0" w:before="0" w:line="240" w:lineRule="auto"/>
+              <w:jc w:val="center"/>
+              <w:rPr>
+                <w:rFonts w:ascii="Malgun Gothic" w:cs="Malgun Gothic" w:eastAsia="Malgun Gothic" w:hAnsi="Malgun Gothic"/>
+                <w:color w:val="0000ff"/>
+                <w:sz w:val="22"/>
+                <w:szCs w:val="22"/>
+              </w:rPr>
+            </w:pPr>
+            <w:bookmarkStart w:colFirst="0" w:colLast="0" w:name="_d6fu8zjuee0s" w:id="1"/>
+            <w:bookmarkEnd w:id="1"/>
+            <w:r>
+              <w:rPr>
+                <w:rFonts w:ascii="Malgun Gothic" w:cs="Malgun Gothic" w:eastAsia="Malgun Gothic" w:hAnsi="Malgun Gothic"/>
+                <w:color w:val="0000ff"/>
+                <w:sz w:val="22"/>
+                <w:szCs w:val="22"/>
+                <w:rtl w:val="0"/>
+              </w:rPr>
+              <w:t xml:space="preserve">소비자분쟁해결기준 — 국내여행 · 인원 미달과 불가항력으로 취소하는 경우</w:t>
+            </w:r>
+          </w:p>
+        </w:tc>
+        <w:tc>
+          <w:tcPr>
+            <w:tcBorders>
+              <w:top w:color="808080" w:space="0" w:sz="7" w:val="single"/>
+              <w:left w:color="808080" w:space="0" w:sz="7" w:val="single"/>
+              <w:bottom w:color="808080" w:space="0" w:sz="7" w:val="single"/>
+              <w:right w:color="808080" w:space="0" w:sz="7" w:val="single"/>
+            </w:tcBorders>
+            <w:tcMar>
+              <w:top w:w="0.0" w:type="dxa"/>
+              <w:left w:w="0.0" w:type="dxa"/>
+              <w:bottom w:w="0.0" w:type="dxa"/>
+              <w:right w:w="0.0" w:type="dxa"/>
+            </w:tcMar>
+            <w:vAlign w:val="center"/>
+          </w:tcPr>
+          <w:p>
+            <w:pPr>
+              <w:pStyle w:val="Heading3"/>
+              <w:keepNext w:val="0"/>
+              <w:keepLines w:val="0"/>
+              <w:spacing w:after="0" w:before="0" w:line="240" w:lineRule="auto"/>
+              <w:jc w:val="center"/>
+              <w:rPr>
+                <w:rFonts w:ascii="Malgun Gothic" w:cs="Malgun Gothic" w:eastAsia="Malgun Gothic" w:hAnsi="Malgun Gothic"/>
+                <w:color w:val="0000ff"/>
+                <w:sz w:val="22"/>
+                <w:szCs w:val="22"/>
+              </w:rPr>
+            </w:pPr>
+            <w:bookmarkStart w:colFirst="0" w:colLast="0" w:name="_d6fu8zjuee0s" w:id="1"/>
+            <w:bookmarkEnd w:id="1"/>
+            <w:r>
+              <w:rPr>
+                <w:rFonts w:ascii="Malgun Gothic" w:cs="Malgun Gothic" w:eastAsia="Malgun Gothic" w:hAnsi="Malgun Gothic"/>
+                <w:color w:val="0000ff"/>
+                <w:sz w:val="22"/>
+                <w:szCs w:val="22"/>
+                <w:rtl w:val="0"/>
+              </w:rPr>
+              <w:t xml:space="preserve">0.632</w:t>
+            </w:r>
+          </w:p>
+        </w:tc>
+        <w:tc>
+          <w:tcPr>
+            <w:tcBorders>
+              <w:top w:color="808080" w:space="0" w:sz="7" w:val="single"/>
+              <w:left w:color="808080" w:space="0" w:sz="7" w:val="single"/>
+              <w:bottom w:color="808080" w:space="0" w:sz="7" w:val="single"/>
+              <w:right w:color="808080" w:space="0" w:sz="7" w:val="single"/>
+            </w:tcBorders>
+            <w:tcMar>
+              <w:top w:w="0.0" w:type="dxa"/>
+              <w:left w:w="0.0" w:type="dxa"/>
+              <w:bottom w:w="0.0" w:type="dxa"/>
+              <w:right w:w="0.0" w:type="dxa"/>
+            </w:tcMar>
+            <w:vAlign w:val="center"/>
+          </w:tcPr>
+          <w:p>
+            <w:pPr>
+              <w:pStyle w:val="Heading3"/>
+              <w:keepNext w:val="0"/>
+              <w:keepLines w:val="0"/>
+              <w:spacing w:after="0" w:before="0" w:line="240" w:lineRule="auto"/>
+              <w:jc w:val="center"/>
+              <w:rPr>
+                <w:rFonts w:ascii="Malgun Gothic" w:cs="Malgun Gothic" w:eastAsia="Malgun Gothic" w:hAnsi="Malgun Gothic"/>
+                <w:color w:val="0000ff"/>
+                <w:sz w:val="22"/>
+                <w:szCs w:val="22"/>
+              </w:rPr>
+            </w:pPr>
+            <w:bookmarkStart w:colFirst="0" w:colLast="0" w:name="_d6fu8zjuee0s" w:id="1"/>
+            <w:bookmarkEnd w:id="1"/>
+            <w:r>
+              <w:rPr>
+                <w:rFonts w:ascii="Malgun Gothic" w:cs="Malgun Gothic" w:eastAsia="Malgun Gothic" w:hAnsi="Malgun Gothic"/>
+                <w:color w:val="0000ff"/>
+                <w:sz w:val="22"/>
+                <w:szCs w:val="22"/>
+                <w:rtl w:val="0"/>
+              </w:rPr>
+              <w:t xml:space="preserve">미적중(같은 문서의 다른 절)</w:t>
+            </w:r>
+          </w:p>
+        </w:tc>
+      </w:tr>
+      <w:tr>
+        <w:trPr>
+          <w:cantSplit w:val="0"/>
+          <w:trHeight w:val="566.9291338582677" w:hRule="atLeast"/>
+          <w:tblHeader w:val="0"/>
+        </w:trPr>
+        <w:tc>
+          <w:tcPr>
+            <w:tcBorders>
+              <w:top w:color="808080" w:space="0" w:sz="7" w:val="single"/>
+              <w:left w:color="808080" w:space="0" w:sz="7" w:val="single"/>
+              <w:bottom w:color="808080" w:space="0" w:sz="7" w:val="single"/>
+              <w:right w:color="808080" w:space="0" w:sz="7" w:val="single"/>
+            </w:tcBorders>
+            <w:tcMar>
+              <w:top w:w="0.0" w:type="dxa"/>
+              <w:left w:w="0.0" w:type="dxa"/>
+              <w:bottom w:w="0.0" w:type="dxa"/>
+              <w:right w:w="0.0" w:type="dxa"/>
+            </w:tcMar>
+            <w:vAlign w:val="center"/>
+          </w:tcPr>
+          <w:p>
+            <w:pPr>
+              <w:pStyle w:val="Heading3"/>
+              <w:keepNext w:val="0"/>
+              <w:keepLines w:val="0"/>
+              <w:spacing w:after="0" w:before="0" w:line="240" w:lineRule="auto"/>
+              <w:jc w:val="center"/>
+              <w:rPr>
+                <w:rFonts w:ascii="Malgun Gothic" w:cs="Malgun Gothic" w:eastAsia="Malgun Gothic" w:hAnsi="Malgun Gothic"/>
+                <w:color w:val="0000ff"/>
+                <w:sz w:val="22"/>
+                <w:szCs w:val="22"/>
+              </w:rPr>
+            </w:pPr>
+            <w:bookmarkStart w:colFirst="0" w:colLast="0" w:name="_d6fu8zjuee0s" w:id="1"/>
+            <w:bookmarkEnd w:id="1"/>
+            <w:r>
+              <w:rPr>
+                <w:rFonts w:ascii="Malgun Gothic" w:cs="Malgun Gothic" w:eastAsia="Malgun Gothic" w:hAnsi="Malgun Gothic"/>
+                <w:color w:val="0000ff"/>
+                <w:sz w:val="22"/>
+                <w:szCs w:val="22"/>
+                <w:rtl w:val="0"/>
+              </w:rPr>
+              <w:t xml:space="preserve">M08</w:t>
+            </w:r>
+          </w:p>
+        </w:tc>
+        <w:tc>
+          <w:tcPr>
+            <w:tcBorders>
+              <w:top w:color="808080" w:space="0" w:sz="7" w:val="single"/>
+              <w:left w:color="808080" w:space="0" w:sz="7" w:val="single"/>
+              <w:bottom w:color="808080" w:space="0" w:sz="7" w:val="single"/>
+              <w:right w:color="808080" w:space="0" w:sz="7" w:val="single"/>
+            </w:tcBorders>
+            <w:tcMar>
+              <w:top w:w="0.0" w:type="dxa"/>
+              <w:left w:w="0.0" w:type="dxa"/>
+              <w:bottom w:w="0.0" w:type="dxa"/>
+              <w:right w:w="0.0" w:type="dxa"/>
+            </w:tcMar>
+            <w:vAlign w:val="center"/>
+          </w:tcPr>
+          <w:p>
+            <w:pPr>
+              <w:pStyle w:val="Heading3"/>
+              <w:keepNext w:val="0"/>
+              <w:keepLines w:val="0"/>
+              <w:spacing w:after="0" w:before="0" w:line="240" w:lineRule="auto"/>
+              <w:jc w:val="center"/>
+              <w:rPr>
+                <w:rFonts w:ascii="Malgun Gothic" w:cs="Malgun Gothic" w:eastAsia="Malgun Gothic" w:hAnsi="Malgun Gothic"/>
+                <w:color w:val="0000ff"/>
+                <w:sz w:val="22"/>
+                <w:szCs w:val="22"/>
+              </w:rPr>
+            </w:pPr>
+            <w:bookmarkStart w:colFirst="0" w:colLast="0" w:name="_d6fu8zjuee0s" w:id="1"/>
+            <w:bookmarkEnd w:id="1"/>
+            <w:r>
+              <w:rPr>
+                <w:rFonts w:ascii="Malgun Gothic" w:cs="Malgun Gothic" w:eastAsia="Malgun Gothic" w:hAnsi="Malgun Gothic"/>
+                <w:color w:val="0000ff"/>
+                <w:sz w:val="22"/>
+                <w:szCs w:val="22"/>
+                <w:rtl w:val="0"/>
+              </w:rPr>
+              <w:t xml:space="preserve">필라테스 센터 이용권을 사정이 생겨 해지하면 위약금이 얼마예요?</w:t>
+            </w:r>
+          </w:p>
+        </w:tc>
+        <w:tc>
+          <w:tcPr>
+            <w:tcBorders>
+              <w:top w:color="808080" w:space="0" w:sz="7" w:val="single"/>
+              <w:left w:color="808080" w:space="0" w:sz="7" w:val="single"/>
+              <w:bottom w:color="808080" w:space="0" w:sz="7" w:val="single"/>
+              <w:right w:color="808080" w:space="0" w:sz="7" w:val="single"/>
+            </w:tcBorders>
+            <w:tcMar>
+              <w:top w:w="0.0" w:type="dxa"/>
+              <w:left w:w="0.0" w:type="dxa"/>
+              <w:bottom w:w="0.0" w:type="dxa"/>
+              <w:right w:w="0.0" w:type="dxa"/>
+            </w:tcMar>
+            <w:vAlign w:val="center"/>
+          </w:tcPr>
+          <w:p>
+            <w:pPr>
+              <w:pStyle w:val="Heading3"/>
+              <w:keepNext w:val="0"/>
+              <w:keepLines w:val="0"/>
+              <w:spacing w:after="0" w:before="0" w:line="240" w:lineRule="auto"/>
+              <w:jc w:val="center"/>
+              <w:rPr>
+                <w:rFonts w:ascii="Malgun Gothic" w:cs="Malgun Gothic" w:eastAsia="Malgun Gothic" w:hAnsi="Malgun Gothic"/>
+                <w:color w:val="0000ff"/>
+                <w:sz w:val="22"/>
+                <w:szCs w:val="22"/>
+              </w:rPr>
+            </w:pPr>
+            <w:bookmarkStart w:colFirst="0" w:colLast="0" w:name="_d6fu8zjuee0s" w:id="1"/>
+            <w:bookmarkEnd w:id="1"/>
+            <w:r>
+              <w:rPr>
+                <w:rFonts w:ascii="Malgun Gothic" w:cs="Malgun Gothic" w:eastAsia="Malgun Gothic" w:hAnsi="Malgun Gothic"/>
+                <w:color w:val="0000ff"/>
+                <w:sz w:val="22"/>
+                <w:szCs w:val="22"/>
+                <w:rtl w:val="0"/>
+              </w:rPr>
+              <w:t xml:space="preserve">소비자분쟁해결기준 — 체육시설·레저·공연 · 소비자 책임으로 해제하는 경우의 반환 금액</w:t>
+            </w:r>
+          </w:p>
+        </w:tc>
+        <w:tc>
+          <w:tcPr>
+            <w:tcBorders>
+              <w:top w:color="808080" w:space="0" w:sz="7" w:val="single"/>
+              <w:left w:color="808080" w:space="0" w:sz="7" w:val="single"/>
+              <w:bottom w:color="808080" w:space="0" w:sz="7" w:val="single"/>
+              <w:right w:color="808080" w:space="0" w:sz="7" w:val="single"/>
+            </w:tcBorders>
+            <w:tcMar>
+              <w:top w:w="0.0" w:type="dxa"/>
+              <w:left w:w="0.0" w:type="dxa"/>
+              <w:bottom w:w="0.0" w:type="dxa"/>
+              <w:right w:w="0.0" w:type="dxa"/>
+            </w:tcMar>
+            <w:vAlign w:val="center"/>
+          </w:tcPr>
+          <w:p>
+            <w:pPr>
+              <w:pStyle w:val="Heading3"/>
+              <w:keepNext w:val="0"/>
+              <w:keepLines w:val="0"/>
+              <w:spacing w:after="0" w:before="0" w:line="240" w:lineRule="auto"/>
+              <w:jc w:val="center"/>
+              <w:rPr>
+                <w:rFonts w:ascii="Malgun Gothic" w:cs="Malgun Gothic" w:eastAsia="Malgun Gothic" w:hAnsi="Malgun Gothic"/>
+                <w:color w:val="0000ff"/>
+                <w:sz w:val="22"/>
+                <w:szCs w:val="22"/>
+              </w:rPr>
+            </w:pPr>
+            <w:bookmarkStart w:colFirst="0" w:colLast="0" w:name="_d6fu8zjuee0s" w:id="1"/>
+            <w:bookmarkEnd w:id="1"/>
+            <w:r>
+              <w:rPr>
+                <w:rFonts w:ascii="Malgun Gothic" w:cs="Malgun Gothic" w:eastAsia="Malgun Gothic" w:hAnsi="Malgun Gothic"/>
+                <w:color w:val="0000ff"/>
+                <w:sz w:val="22"/>
+                <w:szCs w:val="22"/>
+                <w:rtl w:val="0"/>
+              </w:rPr>
+              <w:t xml:space="preserve">0.418</w:t>
+            </w:r>
+          </w:p>
+        </w:tc>
+        <w:tc>
+          <w:tcPr>
+            <w:tcBorders>
+              <w:top w:color="808080" w:space="0" w:sz="7" w:val="single"/>
+              <w:left w:color="808080" w:space="0" w:sz="7" w:val="single"/>
+              <w:bottom w:color="808080" w:space="0" w:sz="7" w:val="single"/>
+              <w:right w:color="808080" w:space="0" w:sz="7" w:val="single"/>
+            </w:tcBorders>
+            <w:tcMar>
+              <w:top w:w="0.0" w:type="dxa"/>
+              <w:left w:w="0.0" w:type="dxa"/>
+              <w:bottom w:w="0.0" w:type="dxa"/>
+              <w:right w:w="0.0" w:type="dxa"/>
+            </w:tcMar>
+            <w:vAlign w:val="center"/>
+          </w:tcPr>
+          <w:p>
+            <w:pPr>
+              <w:pStyle w:val="Heading3"/>
+              <w:keepNext w:val="0"/>
+              <w:keepLines w:val="0"/>
+              <w:spacing w:after="0" w:before="0" w:line="240" w:lineRule="auto"/>
+              <w:jc w:val="center"/>
+              <w:rPr>
+                <w:rFonts w:ascii="Malgun Gothic" w:cs="Malgun Gothic" w:eastAsia="Malgun Gothic" w:hAnsi="Malgun Gothic"/>
+                <w:color w:val="0000ff"/>
+                <w:sz w:val="22"/>
+                <w:szCs w:val="22"/>
+              </w:rPr>
+            </w:pPr>
+            <w:bookmarkStart w:colFirst="0" w:colLast="0" w:name="_d6fu8zjuee0s" w:id="1"/>
+            <w:bookmarkEnd w:id="1"/>
+            <w:r>
+              <w:rPr>
+                <w:rFonts w:ascii="Malgun Gothic" w:cs="Malgun Gothic" w:eastAsia="Malgun Gothic" w:hAnsi="Malgun Gothic"/>
+                <w:color w:val="0000ff"/>
+                <w:sz w:val="22"/>
+                <w:szCs w:val="22"/>
+                <w:rtl w:val="0"/>
+              </w:rPr>
+              <w:t xml:space="preserve">적중(상위 1위)</w:t>
+            </w:r>
+          </w:p>
+        </w:tc>
+      </w:tr>
+      <w:tr>
+        <w:trPr>
+          <w:cantSplit w:val="0"/>
+          <w:trHeight w:val="566.9291338582677" w:hRule="atLeast"/>
+          <w:tblHeader w:val="0"/>
+        </w:trPr>
+        <w:tc>
+          <w:tcPr>
+            <w:tcBorders>
+              <w:top w:color="808080" w:space="0" w:sz="7" w:val="single"/>
+              <w:left w:color="808080" w:space="0" w:sz="7" w:val="single"/>
+              <w:bottom w:color="808080" w:space="0" w:sz="7" w:val="single"/>
+              <w:right w:color="808080" w:space="0" w:sz="7" w:val="single"/>
+            </w:tcBorders>
+            <w:tcMar>
+              <w:top w:w="0.0" w:type="dxa"/>
+              <w:left w:w="0.0" w:type="dxa"/>
+              <w:bottom w:w="0.0" w:type="dxa"/>
+              <w:right w:w="0.0" w:type="dxa"/>
+            </w:tcMar>
+            <w:vAlign w:val="center"/>
+          </w:tcPr>
+          <w:p>
+            <w:pPr>
+              <w:pStyle w:val="Heading3"/>
+              <w:keepNext w:val="0"/>
+              <w:keepLines w:val="0"/>
+              <w:spacing w:after="0" w:before="0" w:line="240" w:lineRule="auto"/>
+              <w:jc w:val="center"/>
+              <w:rPr>
+                <w:rFonts w:ascii="Malgun Gothic" w:cs="Malgun Gothic" w:eastAsia="Malgun Gothic" w:hAnsi="Malgun Gothic"/>
+                <w:color w:val="0000ff"/>
+                <w:sz w:val="22"/>
+                <w:szCs w:val="22"/>
+              </w:rPr>
+            </w:pPr>
+            <w:bookmarkStart w:colFirst="0" w:colLast="0" w:name="_d6fu8zjuee0s" w:id="1"/>
+            <w:bookmarkEnd w:id="1"/>
+            <w:r>
+              <w:rPr>
+                <w:rFonts w:ascii="Malgun Gothic" w:cs="Malgun Gothic" w:eastAsia="Malgun Gothic" w:hAnsi="Malgun Gothic"/>
+                <w:color w:val="0000ff"/>
+                <w:sz w:val="22"/>
+                <w:szCs w:val="22"/>
+                <w:rtl w:val="0"/>
+              </w:rPr>
+              <w:t xml:space="preserve">M09</w:t>
+            </w:r>
+          </w:p>
+        </w:tc>
+        <w:tc>
+          <w:tcPr>
+            <w:tcBorders>
+              <w:top w:color="808080" w:space="0" w:sz="7" w:val="single"/>
+              <w:left w:color="808080" w:space="0" w:sz="7" w:val="single"/>
+              <w:bottom w:color="808080" w:space="0" w:sz="7" w:val="single"/>
+              <w:right w:color="808080" w:space="0" w:sz="7" w:val="single"/>
+            </w:tcBorders>
+            <w:tcMar>
+              <w:top w:w="0.0" w:type="dxa"/>
+              <w:left w:w="0.0" w:type="dxa"/>
+              <w:bottom w:w="0.0" w:type="dxa"/>
+              <w:right w:w="0.0" w:type="dxa"/>
+            </w:tcMar>
+            <w:vAlign w:val="center"/>
+          </w:tcPr>
+          <w:p>
+            <w:pPr>
+              <w:pStyle w:val="Heading3"/>
+              <w:keepNext w:val="0"/>
+              <w:keepLines w:val="0"/>
+              <w:spacing w:after="0" w:before="0" w:line="240" w:lineRule="auto"/>
+              <w:jc w:val="center"/>
+              <w:rPr>
+                <w:rFonts w:ascii="Malgun Gothic" w:cs="Malgun Gothic" w:eastAsia="Malgun Gothic" w:hAnsi="Malgun Gothic"/>
+                <w:color w:val="0000ff"/>
+                <w:sz w:val="22"/>
+                <w:szCs w:val="22"/>
+              </w:rPr>
+            </w:pPr>
+            <w:bookmarkStart w:colFirst="0" w:colLast="0" w:name="_d6fu8zjuee0s" w:id="1"/>
+            <w:bookmarkEnd w:id="1"/>
+            <w:r>
+              <w:rPr>
+                <w:rFonts w:ascii="Malgun Gothic" w:cs="Malgun Gothic" w:eastAsia="Malgun Gothic" w:hAnsi="Malgun Gothic"/>
+                <w:color w:val="0000ff"/>
+                <w:sz w:val="22"/>
+                <w:szCs w:val="22"/>
+                <w:rtl w:val="0"/>
+              </w:rPr>
+              <w:t xml:space="preserve">공연 당일 오전에 표를 취소하면 얼마나 돌려받나요?</w:t>
+            </w:r>
+          </w:p>
+        </w:tc>
+        <w:tc>
+          <w:tcPr>
+            <w:tcBorders>
+              <w:top w:color="808080" w:space="0" w:sz="7" w:val="single"/>
+              <w:left w:color="808080" w:space="0" w:sz="7" w:val="single"/>
+              <w:bottom w:color="808080" w:space="0" w:sz="7" w:val="single"/>
+              <w:right w:color="808080" w:space="0" w:sz="7" w:val="single"/>
+            </w:tcBorders>
+            <w:tcMar>
+              <w:top w:w="0.0" w:type="dxa"/>
+              <w:left w:w="0.0" w:type="dxa"/>
+              <w:bottom w:w="0.0" w:type="dxa"/>
+              <w:right w:w="0.0" w:type="dxa"/>
+            </w:tcMar>
+            <w:vAlign w:val="center"/>
+          </w:tcPr>
+          <w:p>
+            <w:pPr>
+              <w:pStyle w:val="Heading3"/>
+              <w:keepNext w:val="0"/>
+              <w:keepLines w:val="0"/>
+              <w:spacing w:after="0" w:before="0" w:line="240" w:lineRule="auto"/>
+              <w:jc w:val="center"/>
+              <w:rPr>
+                <w:rFonts w:ascii="Malgun Gothic" w:cs="Malgun Gothic" w:eastAsia="Malgun Gothic" w:hAnsi="Malgun Gothic"/>
+                <w:color w:val="0000ff"/>
+                <w:sz w:val="22"/>
+                <w:szCs w:val="22"/>
+              </w:rPr>
+            </w:pPr>
+            <w:bookmarkStart w:colFirst="0" w:colLast="0" w:name="_d6fu8zjuee0s" w:id="1"/>
+            <w:bookmarkEnd w:id="1"/>
+            <w:r>
+              <w:rPr>
+                <w:rFonts w:ascii="Malgun Gothic" w:cs="Malgun Gothic" w:eastAsia="Malgun Gothic" w:hAnsi="Malgun Gothic"/>
+                <w:color w:val="0000ff"/>
+                <w:sz w:val="22"/>
+                <w:szCs w:val="22"/>
+                <w:rtl w:val="0"/>
+              </w:rPr>
+              <w:t xml:space="preserve">소비자분쟁해결기준 — 체육시설·레저·공연 · 관객이 환급을 요구하는 경우</w:t>
+            </w:r>
+          </w:p>
+        </w:tc>
+        <w:tc>
+          <w:tcPr>
+            <w:tcBorders>
+              <w:top w:color="808080" w:space="0" w:sz="7" w:val="single"/>
+              <w:left w:color="808080" w:space="0" w:sz="7" w:val="single"/>
+              <w:bottom w:color="808080" w:space="0" w:sz="7" w:val="single"/>
+              <w:right w:color="808080" w:space="0" w:sz="7" w:val="single"/>
+            </w:tcBorders>
+            <w:tcMar>
+              <w:top w:w="0.0" w:type="dxa"/>
+              <w:left w:w="0.0" w:type="dxa"/>
+              <w:bottom w:w="0.0" w:type="dxa"/>
+              <w:right w:w="0.0" w:type="dxa"/>
+            </w:tcMar>
+            <w:vAlign w:val="center"/>
+          </w:tcPr>
+          <w:p>
+            <w:pPr>
+              <w:pStyle w:val="Heading3"/>
+              <w:keepNext w:val="0"/>
+              <w:keepLines w:val="0"/>
+              <w:spacing w:after="0" w:before="0" w:line="240" w:lineRule="auto"/>
+              <w:jc w:val="center"/>
+              <w:rPr>
+                <w:rFonts w:ascii="Malgun Gothic" w:cs="Malgun Gothic" w:eastAsia="Malgun Gothic" w:hAnsi="Malgun Gothic"/>
+                <w:color w:val="0000ff"/>
+                <w:sz w:val="22"/>
+                <w:szCs w:val="22"/>
+              </w:rPr>
+            </w:pPr>
+            <w:bookmarkStart w:colFirst="0" w:colLast="0" w:name="_d6fu8zjuee0s" w:id="1"/>
+            <w:bookmarkEnd w:id="1"/>
+            <w:r>
+              <w:rPr>
+                <w:rFonts w:ascii="Malgun Gothic" w:cs="Malgun Gothic" w:eastAsia="Malgun Gothic" w:hAnsi="Malgun Gothic"/>
+                <w:color w:val="0000ff"/>
+                <w:sz w:val="22"/>
+                <w:szCs w:val="22"/>
+                <w:rtl w:val="0"/>
+              </w:rPr>
+              <w:t xml:space="preserve">0.553</w:t>
+            </w:r>
+          </w:p>
+        </w:tc>
+        <w:tc>
+          <w:tcPr>
+            <w:tcBorders>
+              <w:top w:color="808080" w:space="0" w:sz="7" w:val="single"/>
+              <w:left w:color="808080" w:space="0" w:sz="7" w:val="single"/>
+              <w:bottom w:color="808080" w:space="0" w:sz="7" w:val="single"/>
+              <w:right w:color="808080" w:space="0" w:sz="7" w:val="single"/>
+            </w:tcBorders>
+            <w:tcMar>
+              <w:top w:w="0.0" w:type="dxa"/>
+              <w:left w:w="0.0" w:type="dxa"/>
+              <w:bottom w:w="0.0" w:type="dxa"/>
+              <w:right w:w="0.0" w:type="dxa"/>
+            </w:tcMar>
+            <w:vAlign w:val="center"/>
+          </w:tcPr>
+          <w:p>
+            <w:pPr>
+              <w:pStyle w:val="Heading3"/>
+              <w:keepNext w:val="0"/>
+              <w:keepLines w:val="0"/>
+              <w:spacing w:after="0" w:before="0" w:line="240" w:lineRule="auto"/>
+              <w:jc w:val="center"/>
+              <w:rPr>
+                <w:rFonts w:ascii="Malgun Gothic" w:cs="Malgun Gothic" w:eastAsia="Malgun Gothic" w:hAnsi="Malgun Gothic"/>
+                <w:color w:val="0000ff"/>
+                <w:sz w:val="22"/>
+                <w:szCs w:val="22"/>
+              </w:rPr>
+            </w:pPr>
+            <w:bookmarkStart w:colFirst="0" w:colLast="0" w:name="_d6fu8zjuee0s" w:id="1"/>
+            <w:bookmarkEnd w:id="1"/>
+            <w:r>
+              <w:rPr>
+                <w:rFonts w:ascii="Malgun Gothic" w:cs="Malgun Gothic" w:eastAsia="Malgun Gothic" w:hAnsi="Malgun Gothic"/>
+                <w:color w:val="0000ff"/>
+                <w:sz w:val="22"/>
+                <w:szCs w:val="22"/>
+                <w:rtl w:val="0"/>
+              </w:rPr>
+              <w:t xml:space="preserve">적중(상위 1위)</w:t>
+            </w:r>
+          </w:p>
+        </w:tc>
+      </w:tr>
+      <w:tr>
+        <w:trPr>
+          <w:cantSplit w:val="0"/>
+          <w:trHeight w:val="566.9291338582677" w:hRule="atLeast"/>
+          <w:tblHeader w:val="0"/>
+        </w:trPr>
+        <w:tc>
+          <w:tcPr>
+            <w:tcBorders>
+              <w:top w:color="808080" w:space="0" w:sz="7" w:val="single"/>
+              <w:left w:color="808080" w:space="0" w:sz="7" w:val="single"/>
+              <w:bottom w:color="808080" w:space="0" w:sz="7" w:val="single"/>
+              <w:right w:color="808080" w:space="0" w:sz="7" w:val="single"/>
+            </w:tcBorders>
+            <w:tcMar>
+              <w:top w:w="0.0" w:type="dxa"/>
+              <w:left w:w="0.0" w:type="dxa"/>
+              <w:bottom w:w="0.0" w:type="dxa"/>
+              <w:right w:w="0.0" w:type="dxa"/>
+            </w:tcMar>
+            <w:vAlign w:val="center"/>
+          </w:tcPr>
+          <w:p>
+            <w:pPr>
+              <w:pStyle w:val="Heading3"/>
+              <w:keepNext w:val="0"/>
+              <w:keepLines w:val="0"/>
+              <w:spacing w:after="0" w:before="0" w:line="240" w:lineRule="auto"/>
+              <w:jc w:val="center"/>
+              <w:rPr>
+                <w:rFonts w:ascii="Malgun Gothic" w:cs="Malgun Gothic" w:eastAsia="Malgun Gothic" w:hAnsi="Malgun Gothic"/>
+                <w:color w:val="0000ff"/>
+                <w:sz w:val="22"/>
+                <w:szCs w:val="22"/>
+              </w:rPr>
+            </w:pPr>
+            <w:bookmarkStart w:colFirst="0" w:colLast="0" w:name="_d6fu8zjuee0s" w:id="1"/>
+            <w:bookmarkEnd w:id="1"/>
+            <w:r>
+              <w:rPr>
+                <w:rFonts w:ascii="Malgun Gothic" w:cs="Malgun Gothic" w:eastAsia="Malgun Gothic" w:hAnsi="Malgun Gothic"/>
+                <w:color w:val="0000ff"/>
+                <w:sz w:val="22"/>
+                <w:szCs w:val="22"/>
+                <w:rtl w:val="0"/>
+              </w:rPr>
+              <w:t xml:space="preserve">M10</w:t>
+            </w:r>
+          </w:p>
+        </w:tc>
+        <w:tc>
+          <w:tcPr>
+            <w:tcBorders>
+              <w:top w:color="808080" w:space="0" w:sz="7" w:val="single"/>
+              <w:left w:color="808080" w:space="0" w:sz="7" w:val="single"/>
+              <w:bottom w:color="808080" w:space="0" w:sz="7" w:val="single"/>
+              <w:right w:color="808080" w:space="0" w:sz="7" w:val="single"/>
+            </w:tcBorders>
+            <w:tcMar>
+              <w:top w:w="0.0" w:type="dxa"/>
+              <w:left w:w="0.0" w:type="dxa"/>
+              <w:bottom w:w="0.0" w:type="dxa"/>
+              <w:right w:w="0.0" w:type="dxa"/>
+            </w:tcMar>
+            <w:vAlign w:val="center"/>
+          </w:tcPr>
+          <w:p>
+            <w:pPr>
+              <w:pStyle w:val="Heading3"/>
+              <w:keepNext w:val="0"/>
+              <w:keepLines w:val="0"/>
+              <w:spacing w:after="0" w:before="0" w:line="240" w:lineRule="auto"/>
+              <w:jc w:val="center"/>
+              <w:rPr>
+                <w:rFonts w:ascii="Malgun Gothic" w:cs="Malgun Gothic" w:eastAsia="Malgun Gothic" w:hAnsi="Malgun Gothic"/>
+                <w:color w:val="0000ff"/>
+                <w:sz w:val="22"/>
+                <w:szCs w:val="22"/>
+              </w:rPr>
+            </w:pPr>
+            <w:bookmarkStart w:colFirst="0" w:colLast="0" w:name="_d6fu8zjuee0s" w:id="1"/>
+            <w:bookmarkEnd w:id="1"/>
+            <w:r>
+              <w:rPr>
+                <w:rFonts w:ascii="Malgun Gothic" w:cs="Malgun Gothic" w:eastAsia="Malgun Gothic" w:hAnsi="Malgun Gothic"/>
+                <w:color w:val="0000ff"/>
+                <w:sz w:val="22"/>
+                <w:szCs w:val="22"/>
+                <w:rtl w:val="0"/>
+              </w:rPr>
+              <w:t xml:space="preserve">여행사가 일정을 바꿔서 해지했어요. 통보 시점에 따라 보상이 다른가요?</w:t>
+            </w:r>
+          </w:p>
+        </w:tc>
+        <w:tc>
+          <w:tcPr>
+            <w:tcBorders>
+              <w:top w:color="808080" w:space="0" w:sz="7" w:val="single"/>
+              <w:left w:color="808080" w:space="0" w:sz="7" w:val="single"/>
+              <w:bottom w:color="808080" w:space="0" w:sz="7" w:val="single"/>
+              <w:right w:color="808080" w:space="0" w:sz="7" w:val="single"/>
+            </w:tcBorders>
+            <w:tcMar>
+              <w:top w:w="0.0" w:type="dxa"/>
+              <w:left w:w="0.0" w:type="dxa"/>
+              <w:bottom w:w="0.0" w:type="dxa"/>
+              <w:right w:w="0.0" w:type="dxa"/>
+            </w:tcMar>
+            <w:vAlign w:val="center"/>
+          </w:tcPr>
+          <w:p>
+            <w:pPr>
+              <w:pStyle w:val="Heading3"/>
+              <w:keepNext w:val="0"/>
+              <w:keepLines w:val="0"/>
+              <w:spacing w:after="0" w:before="0" w:line="240" w:lineRule="auto"/>
+              <w:jc w:val="center"/>
+              <w:rPr>
+                <w:rFonts w:ascii="Malgun Gothic" w:cs="Malgun Gothic" w:eastAsia="Malgun Gothic" w:hAnsi="Malgun Gothic"/>
+                <w:color w:val="0000ff"/>
+                <w:sz w:val="22"/>
+                <w:szCs w:val="22"/>
+              </w:rPr>
+            </w:pPr>
+            <w:bookmarkStart w:colFirst="0" w:colLast="0" w:name="_d6fu8zjuee0s" w:id="1"/>
+            <w:bookmarkEnd w:id="1"/>
+            <w:r>
+              <w:rPr>
+                <w:rFonts w:ascii="Malgun Gothic" w:cs="Malgun Gothic" w:eastAsia="Malgun Gothic" w:hAnsi="Malgun Gothic"/>
+                <w:color w:val="0000ff"/>
+                <w:sz w:val="22"/>
+                <w:szCs w:val="22"/>
+                <w:rtl w:val="0"/>
+              </w:rPr>
+              <w:t xml:space="preserve">소비자분쟁해결기준 — 국내여행 · 여행사가 계약 조건을 바꿔 해지하는 경우</w:t>
+            </w:r>
+          </w:p>
+        </w:tc>
+        <w:tc>
+          <w:tcPr>
+            <w:tcBorders>
+              <w:top w:color="808080" w:space="0" w:sz="7" w:val="single"/>
+              <w:left w:color="808080" w:space="0" w:sz="7" w:val="single"/>
+              <w:bottom w:color="808080" w:space="0" w:sz="7" w:val="single"/>
+              <w:right w:color="808080" w:space="0" w:sz="7" w:val="single"/>
+            </w:tcBorders>
+            <w:tcMar>
+              <w:top w:w="0.0" w:type="dxa"/>
+              <w:left w:w="0.0" w:type="dxa"/>
+              <w:bottom w:w="0.0" w:type="dxa"/>
+              <w:right w:w="0.0" w:type="dxa"/>
+            </w:tcMar>
+            <w:vAlign w:val="center"/>
+          </w:tcPr>
+          <w:p>
+            <w:pPr>
+              <w:pStyle w:val="Heading3"/>
+              <w:keepNext w:val="0"/>
+              <w:keepLines w:val="0"/>
+              <w:spacing w:after="0" w:before="0" w:line="240" w:lineRule="auto"/>
+              <w:jc w:val="center"/>
+              <w:rPr>
+                <w:rFonts w:ascii="Malgun Gothic" w:cs="Malgun Gothic" w:eastAsia="Malgun Gothic" w:hAnsi="Malgun Gothic"/>
+                <w:color w:val="0000ff"/>
+                <w:sz w:val="22"/>
+                <w:szCs w:val="22"/>
+              </w:rPr>
+            </w:pPr>
+            <w:bookmarkStart w:colFirst="0" w:colLast="0" w:name="_d6fu8zjuee0s" w:id="1"/>
+            <w:bookmarkEnd w:id="1"/>
+            <w:r>
+              <w:rPr>
+                <w:rFonts w:ascii="Malgun Gothic" w:cs="Malgun Gothic" w:eastAsia="Malgun Gothic" w:hAnsi="Malgun Gothic"/>
+                <w:color w:val="0000ff"/>
+                <w:sz w:val="22"/>
+                <w:szCs w:val="22"/>
+                <w:rtl w:val="0"/>
+              </w:rPr>
+              <w:t xml:space="preserve">0.650</w:t>
+            </w:r>
+          </w:p>
+        </w:tc>
+        <w:tc>
+          <w:tcPr>
+            <w:tcBorders>
+              <w:top w:color="808080" w:space="0" w:sz="7" w:val="single"/>
+              <w:left w:color="808080" w:space="0" w:sz="7" w:val="single"/>
+              <w:bottom w:color="808080" w:space="0" w:sz="7" w:val="single"/>
+              <w:right w:color="808080" w:space="0" w:sz="7" w:val="single"/>
+            </w:tcBorders>
+            <w:tcMar>
+              <w:top w:w="0.0" w:type="dxa"/>
+              <w:left w:w="0.0" w:type="dxa"/>
+              <w:bottom w:w="0.0" w:type="dxa"/>
+              <w:right w:w="0.0" w:type="dxa"/>
+            </w:tcMar>
+            <w:vAlign w:val="center"/>
+          </w:tcPr>
+          <w:p>
+            <w:pPr>
+              <w:pStyle w:val="Heading3"/>
+              <w:keepNext w:val="0"/>
+              <w:keepLines w:val="0"/>
+              <w:spacing w:after="0" w:before="0" w:line="240" w:lineRule="auto"/>
+              <w:jc w:val="center"/>
+              <w:rPr>
+                <w:rFonts w:ascii="Malgun Gothic" w:cs="Malgun Gothic" w:eastAsia="Malgun Gothic" w:hAnsi="Malgun Gothic"/>
+                <w:color w:val="0000ff"/>
+                <w:sz w:val="22"/>
+                <w:szCs w:val="22"/>
+              </w:rPr>
+            </w:pPr>
+            <w:bookmarkStart w:colFirst="0" w:colLast="0" w:name="_d6fu8zjuee0s" w:id="1"/>
+            <w:bookmarkEnd w:id="1"/>
+            <w:r>
+              <w:rPr>
+                <w:rFonts w:ascii="Malgun Gothic" w:cs="Malgun Gothic" w:eastAsia="Malgun Gothic" w:hAnsi="Malgun Gothic"/>
+                <w:color w:val="0000ff"/>
+                <w:sz w:val="22"/>
+                <w:szCs w:val="22"/>
+                <w:rtl w:val="0"/>
+              </w:rPr>
+              <w:t xml:space="preserve">적중(상위 1위)</w:t>
+            </w:r>
+          </w:p>
+        </w:tc>
+      </w:tr>
+    </w:tbl>
+    <w:p>
+      <w:pPr>
         <w:numPr>
           <w:ilvl w:val="0"/>
           <w:numId w:val="6"/>
@@ -21477,6 +24051,286 @@
           <w:sz w:val="17"/>
         </w:rPr>
         <w:t xml:space="preserve">Hit@3 8/10 · Hit@1 4/10</w:t>
+      </w:r>
+    </w:p>
+    <w:p>
+      <w:pPr>
+        <w:spacing w:after="240" w:before="240" w:lineRule="auto"/>
+        <w:ind w:left="720" w:firstLine="0"/>
+        <w:rPr>
+          <w:rFonts w:ascii="Malgun Gothic" w:cs="Malgun Gothic" w:eastAsia="Malgun Gothic" w:hAnsi="Malgun Gothic"/>
+          <w:b w:val="0"/>
+          <w:bCs w:val="0"/>
+        </w:rPr>
+      </w:pPr>
+      <w:r>
+        <w:rPr>
+          <w:color w:val="0000ff"/>
+          <w:rtl w:val="0"/>
+          <w:rFonts w:ascii="Consolas" w:hAnsi="Consolas"/>
+          <w:sz w:val="17"/>
+        </w:rPr>
+        <w:t xml:space="preserve"/>
+      </w:r>
+    </w:p>
+    <w:p>
+      <w:pPr>
+        <w:spacing w:after="240" w:before="240" w:lineRule="auto"/>
+        <w:ind w:left="720" w:firstLine="0"/>
+        <w:rPr>
+          <w:rFonts w:ascii="Malgun Gothic" w:cs="Malgun Gothic" w:eastAsia="Malgun Gothic" w:hAnsi="Malgun Gothic"/>
+          <w:b w:val="0"/>
+          <w:bCs w:val="0"/>
+        </w:rPr>
+      </w:pPr>
+      <w:r>
+        <w:rPr>
+          <w:color w:val="0000ff"/>
+          <w:rtl w:val="0"/>
+          <w:rFonts w:ascii="Consolas" w:hAnsi="Consolas"/>
+          <w:sz w:val="17"/>
+        </w:rPr>
+        <w:t xml:space="preserve">$ python retrieval_test_10q_round2.py   # 3개 절 보강 후 새 질문 10문항</w:t>
+      </w:r>
+    </w:p>
+    <w:p>
+      <w:pPr>
+        <w:spacing w:after="240" w:before="240" w:lineRule="auto"/>
+        <w:ind w:left="720" w:firstLine="0"/>
+        <w:rPr>
+          <w:rFonts w:ascii="Malgun Gothic" w:cs="Malgun Gothic" w:eastAsia="Malgun Gothic" w:hAnsi="Malgun Gothic"/>
+          <w:b w:val="0"/>
+          <w:bCs w:val="0"/>
+        </w:rPr>
+      </w:pPr>
+      <w:r>
+        <w:rPr>
+          <w:color w:val="0000ff"/>
+          <w:rtl w:val="0"/>
+          <w:rFonts w:ascii="Consolas" w:hAnsi="Consolas"/>
+          <w:sz w:val="17"/>
+        </w:rPr>
+        <w:t xml:space="preserve"/>
+      </w:r>
+    </w:p>
+    <w:p>
+      <w:pPr>
+        <w:spacing w:after="240" w:before="240" w:lineRule="auto"/>
+        <w:ind w:left="720" w:firstLine="0"/>
+        <w:rPr>
+          <w:rFonts w:ascii="Malgun Gothic" w:cs="Malgun Gothic" w:eastAsia="Malgun Gothic" w:hAnsi="Malgun Gothic"/>
+          <w:b w:val="0"/>
+          <w:bCs w:val="0"/>
+        </w:rPr>
+      </w:pPr>
+      <w:r>
+        <w:rPr>
+          <w:color w:val="0000ff"/>
+          <w:rtl w:val="0"/>
+          <w:rFonts w:ascii="Consolas" w:hAnsi="Consolas"/>
+          <w:sz w:val="17"/>
+        </w:rPr>
+        <w:t xml:space="preserve">M01 미적중 rank=None [1705ms] 체험 예약했는데 홍보 사진과 실제가 너무 달라서 환불받고 싶어요</w:t>
+      </w:r>
+    </w:p>
+    <w:p>
+      <w:pPr>
+        <w:spacing w:after="240" w:before="240" w:lineRule="auto"/>
+        <w:ind w:left="720" w:firstLine="0"/>
+        <w:rPr>
+          <w:rFonts w:ascii="Malgun Gothic" w:cs="Malgun Gothic" w:eastAsia="Malgun Gothic" w:hAnsi="Malgun Gothic"/>
+          <w:b w:val="0"/>
+          <w:bCs w:val="0"/>
+        </w:rPr>
+      </w:pPr>
+      <w:r>
+        <w:rPr>
+          <w:color w:val="0000ff"/>
+          <w:rtl w:val="0"/>
+          <w:rFonts w:ascii="Consolas" w:hAnsi="Consolas"/>
+          <w:sz w:val="17"/>
+        </w:rPr>
+        <w:t xml:space="preserve">M02 적중 rank=2 [257ms] 서핑 강습 소개 영상과 다르게 진행됐는데 돈을 돌려받을 수 있나요?</w:t>
+      </w:r>
+    </w:p>
+    <w:p>
+      <w:pPr>
+        <w:spacing w:after="240" w:before="240" w:lineRule="auto"/>
+        <w:ind w:left="720" w:firstLine="0"/>
+        <w:rPr>
+          <w:rFonts w:ascii="Malgun Gothic" w:cs="Malgun Gothic" w:eastAsia="Malgun Gothic" w:hAnsi="Malgun Gothic"/>
+          <w:b w:val="0"/>
+          <w:bCs w:val="0"/>
+        </w:rPr>
+      </w:pPr>
+      <w:r>
+        <w:rPr>
+          <w:color w:val="0000ff"/>
+          <w:rtl w:val="0"/>
+          <w:rFonts w:ascii="Consolas" w:hAnsi="Consolas"/>
+          <w:sz w:val="17"/>
+        </w:rPr>
+        <w:t xml:space="preserve">M03 미적중 rank=None [221ms] 예약하고 갔는데 수영장이 만원이라 입장을 못 했어요</w:t>
+      </w:r>
+    </w:p>
+    <w:p>
+      <w:pPr>
+        <w:spacing w:after="240" w:before="240" w:lineRule="auto"/>
+        <w:ind w:left="720" w:firstLine="0"/>
+        <w:rPr>
+          <w:rFonts w:ascii="Malgun Gothic" w:cs="Malgun Gothic" w:eastAsia="Malgun Gothic" w:hAnsi="Malgun Gothic"/>
+          <w:b w:val="0"/>
+          <w:bCs w:val="0"/>
+        </w:rPr>
+      </w:pPr>
+      <w:r>
+        <w:rPr>
+          <w:color w:val="0000ff"/>
+          <w:rtl w:val="0"/>
+          <w:rFonts w:ascii="Consolas" w:hAnsi="Consolas"/>
+          <w:sz w:val="17"/>
+        </w:rPr>
+        <w:t xml:space="preserve">M04 적중 rank=1 [264ms] 예약한 클라이밍장이 정원이 차서 이용을 못 했어요</w:t>
+      </w:r>
+    </w:p>
+    <w:p>
+      <w:pPr>
+        <w:spacing w:after="240" w:before="240" w:lineRule="auto"/>
+        <w:ind w:left="720" w:firstLine="0"/>
+        <w:rPr>
+          <w:rFonts w:ascii="Malgun Gothic" w:cs="Malgun Gothic" w:eastAsia="Malgun Gothic" w:hAnsi="Malgun Gothic"/>
+          <w:b w:val="0"/>
+          <w:bCs w:val="0"/>
+        </w:rPr>
+      </w:pPr>
+      <w:r>
+        <w:rPr>
+          <w:color w:val="0000ff"/>
+          <w:rtl w:val="0"/>
+          <w:rFonts w:ascii="Consolas" w:hAnsi="Consolas"/>
+          <w:sz w:val="17"/>
+        </w:rPr>
+        <w:t xml:space="preserve">M05 적중 rank=3 [265ms] 할머니가 돌아가셔서 여행을 못 가게 됐어요. 취소 수수료는요?</w:t>
+      </w:r>
+    </w:p>
+    <w:p>
+      <w:pPr>
+        <w:spacing w:after="240" w:before="240" w:lineRule="auto"/>
+        <w:ind w:left="720" w:firstLine="0"/>
+        <w:rPr>
+          <w:rFonts w:ascii="Malgun Gothic" w:cs="Malgun Gothic" w:eastAsia="Malgun Gothic" w:hAnsi="Malgun Gothic"/>
+          <w:b w:val="0"/>
+          <w:bCs w:val="0"/>
+        </w:rPr>
+      </w:pPr>
+      <w:r>
+        <w:rPr>
+          <w:color w:val="0000ff"/>
+          <w:rtl w:val="0"/>
+          <w:rFonts w:ascii="Consolas" w:hAnsi="Consolas"/>
+          <w:sz w:val="17"/>
+        </w:rPr>
+        <w:t xml:space="preserve">M06 미적중 rank=None [365ms] 삼촌 장례 때문에 일정을 취소하려고 해요. 위약금이 있나요?</w:t>
+      </w:r>
+    </w:p>
+    <w:p>
+      <w:pPr>
+        <w:spacing w:after="240" w:before="240" w:lineRule="auto"/>
+        <w:ind w:left="720" w:firstLine="0"/>
+        <w:rPr>
+          <w:rFonts w:ascii="Malgun Gothic" w:cs="Malgun Gothic" w:eastAsia="Malgun Gothic" w:hAnsi="Malgun Gothic"/>
+          <w:b w:val="0"/>
+          <w:bCs w:val="0"/>
+        </w:rPr>
+      </w:pPr>
+      <w:r>
+        <w:rPr>
+          <w:color w:val="0000ff"/>
+          <w:rtl w:val="0"/>
+          <w:rFonts w:ascii="Consolas" w:hAnsi="Consolas"/>
+          <w:sz w:val="17"/>
+        </w:rPr>
+        <w:t xml:space="preserve">M07 미적중 rank=None [242ms] 몸이 많이 아파서 여행 참가가 어려운데 위약금 없이 취소되나요?</w:t>
+      </w:r>
+    </w:p>
+    <w:p>
+      <w:pPr>
+        <w:spacing w:after="240" w:before="240" w:lineRule="auto"/>
+        <w:ind w:left="720" w:firstLine="0"/>
+        <w:rPr>
+          <w:rFonts w:ascii="Malgun Gothic" w:cs="Malgun Gothic" w:eastAsia="Malgun Gothic" w:hAnsi="Malgun Gothic"/>
+          <w:b w:val="0"/>
+          <w:bCs w:val="0"/>
+        </w:rPr>
+      </w:pPr>
+      <w:r>
+        <w:rPr>
+          <w:color w:val="0000ff"/>
+          <w:rtl w:val="0"/>
+          <w:rFonts w:ascii="Consolas" w:hAnsi="Consolas"/>
+          <w:sz w:val="17"/>
+        </w:rPr>
+        <w:t xml:space="preserve">M08 적중 rank=1 [254ms] 필라테스 센터 이용권을 사정이 생겨 해지하면 위약금이 얼마예요?</w:t>
+      </w:r>
+    </w:p>
+    <w:p>
+      <w:pPr>
+        <w:spacing w:after="240" w:before="240" w:lineRule="auto"/>
+        <w:ind w:left="720" w:firstLine="0"/>
+        <w:rPr>
+          <w:rFonts w:ascii="Malgun Gothic" w:cs="Malgun Gothic" w:eastAsia="Malgun Gothic" w:hAnsi="Malgun Gothic"/>
+          <w:b w:val="0"/>
+          <w:bCs w:val="0"/>
+        </w:rPr>
+      </w:pPr>
+      <w:r>
+        <w:rPr>
+          <w:color w:val="0000ff"/>
+          <w:rtl w:val="0"/>
+          <w:rFonts w:ascii="Consolas" w:hAnsi="Consolas"/>
+          <w:sz w:val="17"/>
+        </w:rPr>
+        <w:t xml:space="preserve">M09 적중 rank=1 [213ms] 공연 당일 오전에 표를 취소하면 얼마나 돌려받나요?</w:t>
+      </w:r>
+    </w:p>
+    <w:p>
+      <w:pPr>
+        <w:spacing w:after="240" w:before="240" w:lineRule="auto"/>
+        <w:ind w:left="720" w:firstLine="0"/>
+        <w:rPr>
+          <w:rFonts w:ascii="Malgun Gothic" w:cs="Malgun Gothic" w:eastAsia="Malgun Gothic" w:hAnsi="Malgun Gothic"/>
+          <w:b w:val="0"/>
+          <w:bCs w:val="0"/>
+        </w:rPr>
+      </w:pPr>
+      <w:r>
+        <w:rPr>
+          <w:color w:val="0000ff"/>
+          <w:rtl w:val="0"/>
+          <w:rFonts w:ascii="Consolas" w:hAnsi="Consolas"/>
+          <w:sz w:val="17"/>
+        </w:rPr>
+        <w:t xml:space="preserve">M10 적중 rank=1 [248ms] 여행사가 일정을 바꿔서 해지했어요. 통보 시점에 따라 보상이 다른가요?</w:t>
+      </w:r>
+    </w:p>
+    <w:p>
+      <w:pPr>
+        <w:spacing w:after="240" w:before="240" w:lineRule="auto"/>
+        <w:ind w:left="720" w:firstLine="0"/>
+        <w:rPr>
+          <w:rFonts w:ascii="Malgun Gothic" w:cs="Malgun Gothic" w:eastAsia="Malgun Gothic" w:hAnsi="Malgun Gothic"/>
+          <w:b w:val="0"/>
+          <w:bCs w:val="0"/>
+        </w:rPr>
+      </w:pPr>
+      <w:r>
+        <w:rPr>
+          <w:color w:val="0000ff"/>
+          <w:rtl w:val="0"/>
+          <w:rFonts w:ascii="Consolas" w:hAnsi="Consolas"/>
+          <w:sz w:val="17"/>
+        </w:rPr>
+        <w:t xml:space="preserve">Hit@3 6/10 · Hit@1 4/10</w:t>
       </w:r>
     </w:p>
     <w:p>

</xml_diff>

<commit_message>
feat(activity): split 2 mixed sections, add rule-based policy query expansion (activity only, mode switch), results + report
- travel_ext: split t_ext_01 section 3 and t_ext_02 section 4 (20 chunks)
- activity: policy_query.py dictionary expansion in ActivityTeam._read, guardrails travel.activity_policy_query.mode
- measured on-vs-off Hit@3 per question set; report updated

Co-Authored-By: Claude Sonnet 5.5 <noreply@anthropic.com>
</commit_message>
<xml_diff>
--- a/docs/activity/산출물/벡터DB_GraphDB_구축결과서_활동에이전트_2026-10-14.docx
+++ b/docs/activity/산출물/벡터DB_GraphDB_구축결과서_활동에이전트_2026-10-14.docx
@@ -885,7 +885,7 @@
           <w:szCs w:val="22"/>
           <w:rtl w:val="0"/>
         </w:rPr>
-        <w:t xml:space="preserve">벡터 데이터베이스: 서비스 운영 기준 문서(취소·변경 접수, 무료·무예약 판정, 운영 통제, 날씨·재난, 취소 공통 절차, 동행 조건 등) 및 공정거래위원회 국내여행 표준약관·소비자분쟁해결기준(공식 자료 3문서)을 더한 총 19문서·152청크의 임베딩과 유사도 검색 엔진을 PostgreSQL pgvector 로 구축. 활동 에이전트가 쓰는 범위는 4개 scope 14문서·100청크.</w:t>
+        <w:t xml:space="preserve">벡터 데이터베이스: 서비스 운영 기준 문서(취소·변경 접수, 무료·무예약 판정, 운영 통제, 날씨·재난, 취소 공통 절차, 동행 조건 등) 및 공정거래위원회 국내여행 표준약관·소비자분쟁해결기준(공식 자료 3문서)을 더한 총 19문서·154청크의 임베딩과 유사도 검색 엔진을 PostgreSQL pgvector 로 구축. 활동 에이전트가 쓰는 범위는 4개 scope 14문서·102청크.</w:t>
       </w:r>
     </w:p>
     <w:p>
@@ -1543,7 +1543,7 @@
                 <w:szCs w:val="22"/>
                 <w:rtl w:val="0"/>
               </w:rPr>
-              <w:t xml:space="preserve">서비스 운영 기준 문서 + 공식 자료(표준약관·분쟁해결기준) 19건(152청크) — 활동 관련 4개 scope 14문서</w:t>
+              <w:t xml:space="preserve">서비스 운영 기준 문서 + 공식 자료(표준약관·분쟁해결기준) 19건(154청크) — 활동 관련 4개 scope 14문서</w:t>
             </w:r>
           </w:p>
         </w:tc>
@@ -4112,7 +4112,7 @@
                 <w:szCs w:val="22"/>
                 <w:rtl w:val="0"/>
               </w:rPr>
-              <w:t xml:space="preserve">20문항 시험(공식 자료 추가 후): 절 단위 Hit@3 12/20 (60%), Hit@1 8/20 (40%), 문서 단위 Hit@3 16/20 (80%). 레저·공연 문서에 구어체 표현을 반영한 뒤 새 질문 10문항: Hit@3 8/10, Hit@1 4/10. 실패 절(고객 표현 불일치)을 보강하고 재적재한 뒤 다시 새 질문 10문항: Hit@3 6/10, Hit@1 4/10. 기본 코퍼스 7문항 시험은 5/6</w:t>
+              <w:t xml:space="preserve">20문항 시험(공식 자료 추가 후): 절 단위 Hit@3 12/20 (60%), Hit@1 8/20 (40%), 문서 단위 Hit@3 16/20 (80%). 레저·공연 문서에 구어체 표현을 반영한 뒤 새 질문 10문항: Hit@3 8/10, Hit@1 4/10. 실패 절(고객 표현 불일치)을 보강하고 재적재한 뒤 다시 새 질문 10문항: Hit@3 6/10, Hit@1 4/10. 이어서 절 분리와 질문 변환(사전)을 적용했을 때의 변화는 아래 표에 있다(끈 때 대비 켠 때 +2~+4문항). 기본 코퍼스 7문항 시험은 5/6</w:t>
             </w:r>
           </w:p>
         </w:tc>
@@ -4793,7 +4793,7 @@
                 <w:szCs w:val="22"/>
                 <w:rtl w:val="0"/>
               </w:rPr>
-              <w:t xml:space="preserve">152/152 (100%), 1,536차원</w:t>
+              <w:t xml:space="preserve">154/154 (100%), 1,536차원</w:t>
             </w:r>
           </w:p>
         </w:tc>
@@ -7426,7 +7426,7 @@
                 <w:szCs w:val="20"/>
                 <w:rtl w:val="0"/>
               </w:rPr>
-              <w:t xml:space="preserve">26</w:t>
+              <w:t xml:space="preserve">28</w:t>
             </w:r>
           </w:p>
         </w:tc>
@@ -7970,7 +7970,7 @@
                 <w:szCs w:val="20"/>
                 <w:rtl w:val="0"/>
               </w:rPr>
-              <w:t xml:space="preserve">152</w:t>
+              <w:t xml:space="preserve">154</w:t>
             </w:r>
           </w:p>
         </w:tc>
@@ -7994,7 +7994,7 @@
           <w:color w:val="0000ff"/>
           <w:rtl w:val="0"/>
         </w:rPr>
-        <w:t xml:space="preserve">총 19개 문서를 152개 청크로 적재했고 모든 청크에 1,536차원 벡터가 채워진 것을 확인했다(152/152). 활동 에이전트가 사용하는 범위는 4개 scope 14문서·100청크이다. 이 중 3문서·18청크는 공정거래위원회 국내여행 표준약관(제10020호)과 소비자분쟁해결기준(고시 제2025-14호)을 판단 단위로 풀어 쓴 것이며(knowledge/travel_ext/), 원문과 대조해 문장 6곳을 고친 뒤 재적재했다. 장소별·업체별 약관은 담지 않았다. 그래프 DB 는 구축하지 않았다. 측정: 2026-10-13~14, 로컬 개발 DB(PostgreSQL + pgvector, Docker), OpenAI 임베딩 호출 기본 코퍼스 3회(입력 43,287 토큰) + 공식 자료 적재 2회(재적재 포함, 각 약 5,000 토큰).</w:t>
+        <w:t xml:space="preserve">총 19개 문서를 154개 청크로 적재했고 모든 청크에 1,536차원 벡터가 채워진 것을 확인했다(154/154). 활동 에이전트가 사용하는 범위는 4개 scope 14문서·102청크이다. 이 중 3문서·20청크는 공정거래위원회 국내여행 표준약관(제10020호)과 소비자분쟁해결기준(고시 제2025-14호)을 판단 단위로 풀어 쓴 것이며(knowledge/travel_ext/), 원문과 대조해 문장 6곳을 고친 뒤 재적재했다. 장소별·업체별 약관은 담지 않았다. 그래프 DB 는 구축하지 않았다. 측정: 2026-10-13~14, 로컬 개발 DB(PostgreSQL + pgvector, Docker), OpenAI 임베딩 호출 기본 코퍼스 3회(입력 43,287 토큰) + 공식 자료 적재 2회(재적재 포함, 각 약 5,000 토큰).</w:t>
       </w:r>
     </w:p>
     <w:p>
@@ -22211,6 +22211,1357 @@
     </w:tbl>
     <w:p>
       <w:pPr>
+        <w:spacing w:after="240" w:before="240" w:lineRule="auto"/>
+        <w:ind w:left="720" w:firstLine="0"/>
+        <w:rPr>
+          <w:rFonts w:ascii="Malgun Gothic" w:cs="Malgun Gothic" w:eastAsia="Malgun Gothic" w:hAnsi="Malgun Gothic"/>
+          <w:b w:val="0"/>
+          <w:bCs w:val="0"/>
+        </w:rPr>
+      </w:pPr>
+      <w:r>
+        <w:rPr>
+          <w:rFonts w:ascii="Malgun Gothic" w:cs="Malgun Gothic" w:eastAsia="Malgun Gothic" w:hAnsi="Malgun Gothic"/>
+          <w:color w:val="0000ff"/>
+          <w:rtl w:val="0"/>
+        </w:rPr>
+        <w:t xml:space="preserve">질문 변환(사전) 효과 — 활동 코드 안에서 고객 말을 규정 문서 용어로 덧붙여 검색(LLM 호출 없음, 코어 무변경). 절 분리(2개 절을 4개로) 후 같은 DB에서 켠 때와 끈 때를 비교했다. 주의: E 묶음을 뺀 나머지는 규칙을 만들 때 질문 문장을 이미 본 상태라 학습 데이터에 가깝다. 규칙 작성 뒤 만든 E 묶음에서도 개선은 규칙 어휘와 겹친 질문(E01·E06·E08)에서만 나왔고, 규칙에 없는 표현(E05·E09·E10)은 그대로 미적중이었다. 즉 이 방식은 사전에 있는 표현에 한해 효과가 있으며 일반화 성능은 입증하지 못했다.</w:t>
+      </w:r>
+    </w:p>
+    <w:tbl>
+      <w:tblPr>
+        <w:tblStyle w:val="Table4"/>
+        <w:tblW w:w="9665.0" w:type="dxa"/>
+        <w:jc w:val="center"/>
+        <w:tblBorders>
+          <w:top w:color="808080" w:space="0" w:sz="7" w:val="single"/>
+          <w:left w:color="808080" w:space="0" w:sz="7" w:val="single"/>
+          <w:bottom w:color="808080" w:space="0" w:sz="7" w:val="single"/>
+          <w:right w:color="808080" w:space="0" w:sz="7" w:val="single"/>
+          <w:insideH w:color="808080" w:space="0" w:sz="7" w:val="single"/>
+          <w:insideV w:color="808080" w:space="0" w:sz="7" w:val="single"/>
+        </w:tblBorders>
+        <w:tblLayout w:type="fixed"/>
+        <w:tblLook w:val="0600"/>
+      </w:tblPr>
+      <w:tblGrid>
+        <w:gridCol w:w="1205"/>
+        <w:gridCol w:w="2135"/>
+        <w:gridCol w:w="3110"/>
+        <w:gridCol w:w="3215"/>
+        <w:tblGridChange w:id="0">
+          <w:tblGrid>
+            <w:gridCol w:w="1205"/>
+            <w:gridCol w:w="2135"/>
+            <w:gridCol w:w="3110"/>
+            <w:gridCol w:w="3215"/>
+          </w:tblGrid>
+        </w:tblGridChange>
+      </w:tblGrid>
+      <w:tr>
+        <w:trPr>
+          <w:cantSplit w:val="0"/>
+          <w:trHeight w:val="566.9291338582677" w:hRule="atLeast"/>
+          <w:tblHeader w:val="0"/>
+        </w:trPr>
+        <w:tc>
+          <w:tcPr>
+            <w:tcBorders>
+              <w:top w:color="808080" w:space="0" w:sz="7" w:val="single"/>
+              <w:left w:color="808080" w:space="0" w:sz="7" w:val="single"/>
+              <w:bottom w:color="808080" w:space="0" w:sz="7" w:val="single"/>
+              <w:right w:color="808080" w:space="0" w:sz="7" w:val="single"/>
+            </w:tcBorders>
+            <w:shd w:fill="cfe2f3" w:val="clear"/>
+            <w:tcMar>
+              <w:top w:w="56.69291338582678" w:type="dxa"/>
+              <w:left w:w="56.69291338582678" w:type="dxa"/>
+              <w:bottom w:w="56.69291338582678" w:type="dxa"/>
+              <w:right w:w="56.69291338582678" w:type="dxa"/>
+            </w:tcMar>
+            <w:vAlign w:val="center"/>
+          </w:tcPr>
+          <w:p>
+            <w:pPr>
+              <w:pStyle w:val="Heading3"/>
+              <w:keepNext w:val="0"/>
+              <w:keepLines w:val="0"/>
+              <w:spacing w:after="0" w:before="0" w:line="240" w:lineRule="auto"/>
+              <w:jc w:val="center"/>
+              <w:rPr>
+                <w:rFonts w:ascii="Malgun Gothic" w:cs="Malgun Gothic" w:eastAsia="Malgun Gothic" w:hAnsi="Malgun Gothic"/>
+                <w:b w:val="1"/>
+                <w:bCs w:val="1"/>
+                <w:color w:val="000000"/>
+                <w:sz w:val="22"/>
+                <w:szCs w:val="22"/>
+              </w:rPr>
+            </w:pPr>
+            <w:bookmarkStart w:colFirst="0" w:colLast="0" w:name="_d6fu8zjuee0s" w:id="1"/>
+            <w:bookmarkEnd w:id="1"/>
+            <w:r>
+              <w:rPr>
+                <w:rFonts w:ascii="Malgun Gothic" w:cs="Malgun Gothic" w:eastAsia="Malgun Gothic" w:hAnsi="Malgun Gothic"/>
+                <w:b w:val="1"/>
+                <w:bCs w:val="1"/>
+                <w:color w:val="000000"/>
+                <w:sz w:val="22"/>
+                <w:szCs w:val="22"/>
+                <w:rtl w:val="0"/>
+              </w:rPr>
+              <w:t xml:space="preserve">질문 묶음</w:t>
+            </w:r>
+          </w:p>
+        </w:tc>
+        <w:tc>
+          <w:tcPr>
+            <w:tcBorders>
+              <w:top w:color="808080" w:space="0" w:sz="7" w:val="single"/>
+              <w:left w:color="808080" w:space="0" w:sz="7" w:val="single"/>
+              <w:bottom w:color="808080" w:space="0" w:sz="7" w:val="single"/>
+              <w:right w:color="808080" w:space="0" w:sz="7" w:val="single"/>
+            </w:tcBorders>
+            <w:shd w:fill="cfe2f3" w:val="clear"/>
+            <w:tcMar>
+              <w:top w:w="56.69291338582678" w:type="dxa"/>
+              <w:left w:w="56.69291338582678" w:type="dxa"/>
+              <w:bottom w:w="56.69291338582678" w:type="dxa"/>
+              <w:right w:w="56.69291338582678" w:type="dxa"/>
+            </w:tcMar>
+            <w:vAlign w:val="center"/>
+          </w:tcPr>
+          <w:p>
+            <w:pPr>
+              <w:pStyle w:val="Heading3"/>
+              <w:keepNext w:val="0"/>
+              <w:keepLines w:val="0"/>
+              <w:spacing w:after="0" w:before="0" w:line="240" w:lineRule="auto"/>
+              <w:jc w:val="center"/>
+              <w:rPr>
+                <w:rFonts w:ascii="Malgun Gothic" w:cs="Malgun Gothic" w:eastAsia="Malgun Gothic" w:hAnsi="Malgun Gothic"/>
+                <w:b w:val="1"/>
+                <w:bCs w:val="1"/>
+                <w:color w:val="000000"/>
+                <w:sz w:val="22"/>
+                <w:szCs w:val="22"/>
+              </w:rPr>
+            </w:pPr>
+            <w:bookmarkStart w:colFirst="0" w:colLast="0" w:name="_d6fu8zjuee0s" w:id="1"/>
+            <w:bookmarkEnd w:id="1"/>
+            <w:r>
+              <w:rPr>
+                <w:rFonts w:ascii="Malgun Gothic" w:cs="Malgun Gothic" w:eastAsia="Malgun Gothic" w:hAnsi="Malgun Gothic"/>
+                <w:b w:val="1"/>
+                <w:bCs w:val="1"/>
+                <w:color w:val="000000"/>
+                <w:sz w:val="22"/>
+                <w:szCs w:val="22"/>
+                <w:rtl w:val="0"/>
+              </w:rPr>
+              <w:t xml:space="preserve">문항</w:t>
+            </w:r>
+          </w:p>
+        </w:tc>
+        <w:tc>
+          <w:tcPr>
+            <w:tcBorders>
+              <w:top w:color="808080" w:space="0" w:sz="7" w:val="single"/>
+              <w:left w:color="808080" w:space="0" w:sz="7" w:val="single"/>
+              <w:bottom w:color="808080" w:space="0" w:sz="7" w:val="single"/>
+              <w:right w:color="808080" w:space="0" w:sz="7" w:val="single"/>
+            </w:tcBorders>
+            <w:shd w:fill="cfe2f3" w:val="clear"/>
+            <w:tcMar>
+              <w:top w:w="56.69291338582678" w:type="dxa"/>
+              <w:left w:w="56.69291338582678" w:type="dxa"/>
+              <w:bottom w:w="56.69291338582678" w:type="dxa"/>
+              <w:right w:w="56.69291338582678" w:type="dxa"/>
+            </w:tcMar>
+            <w:vAlign w:val="center"/>
+          </w:tcPr>
+          <w:p>
+            <w:pPr>
+              <w:pStyle w:val="Heading3"/>
+              <w:keepNext w:val="0"/>
+              <w:keepLines w:val="0"/>
+              <w:spacing w:after="0" w:before="0" w:line="240" w:lineRule="auto"/>
+              <w:jc w:val="center"/>
+              <w:rPr>
+                <w:rFonts w:ascii="Malgun Gothic" w:cs="Malgun Gothic" w:eastAsia="Malgun Gothic" w:hAnsi="Malgun Gothic"/>
+                <w:b w:val="1"/>
+                <w:bCs w:val="1"/>
+                <w:color w:val="000000"/>
+                <w:sz w:val="22"/>
+                <w:szCs w:val="22"/>
+              </w:rPr>
+            </w:pPr>
+            <w:bookmarkStart w:colFirst="0" w:colLast="0" w:name="_d6fu8zjuee0s" w:id="1"/>
+            <w:bookmarkEnd w:id="1"/>
+            <w:r>
+              <w:rPr>
+                <w:rFonts w:ascii="Malgun Gothic" w:cs="Malgun Gothic" w:eastAsia="Malgun Gothic" w:hAnsi="Malgun Gothic"/>
+                <w:b w:val="1"/>
+                <w:bCs w:val="1"/>
+                <w:color w:val="000000"/>
+                <w:sz w:val="22"/>
+                <w:szCs w:val="22"/>
+                <w:rtl w:val="0"/>
+              </w:rPr>
+              <w:t xml:space="preserve">끈 때 Hit@3</w:t>
+            </w:r>
+          </w:p>
+        </w:tc>
+        <w:tc>
+          <w:tcPr>
+            <w:tcBorders>
+              <w:top w:color="808080" w:space="0" w:sz="7" w:val="single"/>
+              <w:left w:color="808080" w:space="0" w:sz="7" w:val="single"/>
+              <w:bottom w:color="808080" w:space="0" w:sz="7" w:val="single"/>
+              <w:right w:color="808080" w:space="0" w:sz="7" w:val="single"/>
+            </w:tcBorders>
+            <w:shd w:fill="cfe2f3" w:val="clear"/>
+            <w:tcMar>
+              <w:top w:w="56.69291338582678" w:type="dxa"/>
+              <w:left w:w="56.69291338582678" w:type="dxa"/>
+              <w:bottom w:w="56.69291338582678" w:type="dxa"/>
+              <w:right w:w="56.69291338582678" w:type="dxa"/>
+            </w:tcMar>
+            <w:vAlign w:val="center"/>
+          </w:tcPr>
+          <w:p>
+            <w:pPr>
+              <w:pStyle w:val="Heading3"/>
+              <w:keepNext w:val="0"/>
+              <w:keepLines w:val="0"/>
+              <w:spacing w:after="0" w:before="0" w:line="240" w:lineRule="auto"/>
+              <w:jc w:val="center"/>
+              <w:rPr>
+                <w:rFonts w:ascii="Malgun Gothic" w:cs="Malgun Gothic" w:eastAsia="Malgun Gothic" w:hAnsi="Malgun Gothic"/>
+                <w:b w:val="1"/>
+                <w:bCs w:val="1"/>
+                <w:color w:val="000000"/>
+                <w:sz w:val="22"/>
+                <w:szCs w:val="22"/>
+              </w:rPr>
+            </w:pPr>
+            <w:bookmarkStart w:colFirst="0" w:colLast="0" w:name="_d6fu8zjuee0s" w:id="1"/>
+            <w:bookmarkEnd w:id="1"/>
+            <w:r>
+              <w:rPr>
+                <w:rFonts w:ascii="Malgun Gothic" w:cs="Malgun Gothic" w:eastAsia="Malgun Gothic" w:hAnsi="Malgun Gothic"/>
+                <w:b w:val="1"/>
+                <w:bCs w:val="1"/>
+                <w:color w:val="000000"/>
+                <w:sz w:val="22"/>
+                <w:szCs w:val="22"/>
+                <w:rtl w:val="0"/>
+              </w:rPr>
+              <w:t xml:space="preserve">켠 때 Hit@3</w:t>
+            </w:r>
+          </w:p>
+        </w:tc>
+      </w:tr>
+      <w:tr>
+        <w:trPr>
+          <w:cantSplit w:val="0"/>
+          <w:trHeight w:val="566.9291338582677" w:hRule="atLeast"/>
+          <w:tblHeader w:val="0"/>
+        </w:trPr>
+        <w:tc>
+          <w:tcPr>
+            <w:tcBorders>
+              <w:top w:color="808080" w:space="0" w:sz="7" w:val="single"/>
+              <w:left w:color="808080" w:space="0" w:sz="7" w:val="single"/>
+              <w:bottom w:color="808080" w:space="0" w:sz="7" w:val="single"/>
+              <w:right w:color="808080" w:space="0" w:sz="7" w:val="single"/>
+            </w:tcBorders>
+            <w:tcMar>
+              <w:top w:w="56.69291338582678" w:type="dxa"/>
+              <w:left w:w="56.69291338582678" w:type="dxa"/>
+              <w:bottom w:w="56.69291338582678" w:type="dxa"/>
+              <w:right w:w="56.69291338582678" w:type="dxa"/>
+            </w:tcMar>
+            <w:vAlign w:val="center"/>
+          </w:tcPr>
+          <w:p>
+            <w:pPr>
+              <w:pStyle w:val="Heading3"/>
+              <w:keepNext w:val="0"/>
+              <w:keepLines w:val="0"/>
+              <w:spacing w:after="0" w:before="0" w:line="240" w:lineRule="auto"/>
+              <w:jc w:val="center"/>
+              <w:rPr>
+                <w:rFonts w:ascii="Malgun Gothic" w:cs="Malgun Gothic" w:eastAsia="Malgun Gothic" w:hAnsi="Malgun Gothic"/>
+                <w:color w:val="0000ff"/>
+                <w:sz w:val="22"/>
+                <w:szCs w:val="22"/>
+              </w:rPr>
+            </w:pPr>
+            <w:bookmarkStart w:colFirst="0" w:colLast="0" w:name="_d6fu8zjuee0s" w:id="1"/>
+            <w:bookmarkEnd w:id="1"/>
+            <w:r>
+              <w:rPr>
+                <w:rFonts w:ascii="Malgun Gothic" w:cs="Malgun Gothic" w:eastAsia="Malgun Gothic" w:hAnsi="Malgun Gothic"/>
+                <w:color w:val="0000ff"/>
+                <w:sz w:val="22"/>
+                <w:szCs w:val="22"/>
+                <w:rtl w:val="0"/>
+              </w:rPr>
+              <w:t xml:space="preserve">20문항(Q01~Q20)</w:t>
+            </w:r>
+          </w:p>
+        </w:tc>
+        <w:tc>
+          <w:tcPr>
+            <w:tcBorders>
+              <w:top w:color="808080" w:space="0" w:sz="7" w:val="single"/>
+              <w:left w:color="808080" w:space="0" w:sz="7" w:val="single"/>
+              <w:bottom w:color="808080" w:space="0" w:sz="7" w:val="single"/>
+              <w:right w:color="808080" w:space="0" w:sz="7" w:val="single"/>
+            </w:tcBorders>
+            <w:tcMar>
+              <w:top w:w="56.69291338582678" w:type="dxa"/>
+              <w:left w:w="56.69291338582678" w:type="dxa"/>
+              <w:bottom w:w="56.69291338582678" w:type="dxa"/>
+              <w:right w:w="56.69291338582678" w:type="dxa"/>
+            </w:tcMar>
+            <w:vAlign w:val="center"/>
+          </w:tcPr>
+          <w:p>
+            <w:pPr>
+              <w:pStyle w:val="Heading3"/>
+              <w:keepNext w:val="0"/>
+              <w:keepLines w:val="0"/>
+              <w:spacing w:after="0" w:before="0" w:line="240" w:lineRule="auto"/>
+              <w:jc w:val="center"/>
+              <w:rPr>
+                <w:rFonts w:ascii="Malgun Gothic" w:cs="Malgun Gothic" w:eastAsia="Malgun Gothic" w:hAnsi="Malgun Gothic"/>
+                <w:color w:val="0000ff"/>
+                <w:sz w:val="22"/>
+                <w:szCs w:val="22"/>
+              </w:rPr>
+            </w:pPr>
+            <w:bookmarkStart w:colFirst="0" w:colLast="0" w:name="_d6fu8zjuee0s" w:id="1"/>
+            <w:bookmarkEnd w:id="1"/>
+            <w:r>
+              <w:rPr>
+                <w:rFonts w:ascii="Malgun Gothic" w:cs="Malgun Gothic" w:eastAsia="Malgun Gothic" w:hAnsi="Malgun Gothic"/>
+                <w:color w:val="0000ff"/>
+                <w:sz w:val="22"/>
+                <w:szCs w:val="22"/>
+                <w:rtl w:val="0"/>
+              </w:rPr>
+              <w:t xml:space="preserve">20</w:t>
+            </w:r>
+          </w:p>
+        </w:tc>
+        <w:tc>
+          <w:tcPr>
+            <w:tcBorders>
+              <w:top w:color="808080" w:space="0" w:sz="7" w:val="single"/>
+              <w:left w:color="808080" w:space="0" w:sz="7" w:val="single"/>
+              <w:bottom w:color="808080" w:space="0" w:sz="7" w:val="single"/>
+              <w:right w:color="808080" w:space="0" w:sz="7" w:val="single"/>
+            </w:tcBorders>
+            <w:tcMar>
+              <w:top w:w="56.69291338582678" w:type="dxa"/>
+              <w:left w:w="56.69291338582678" w:type="dxa"/>
+              <w:bottom w:w="56.69291338582678" w:type="dxa"/>
+              <w:right w:w="56.69291338582678" w:type="dxa"/>
+            </w:tcMar>
+            <w:vAlign w:val="center"/>
+          </w:tcPr>
+          <w:p>
+            <w:pPr>
+              <w:pStyle w:val="Heading3"/>
+              <w:keepNext w:val="0"/>
+              <w:keepLines w:val="0"/>
+              <w:spacing w:after="0" w:before="0" w:line="240" w:lineRule="auto"/>
+              <w:jc w:val="center"/>
+              <w:rPr>
+                <w:rFonts w:ascii="Malgun Gothic" w:cs="Malgun Gothic" w:eastAsia="Malgun Gothic" w:hAnsi="Malgun Gothic"/>
+                <w:color w:val="0000ff"/>
+                <w:sz w:val="22"/>
+                <w:szCs w:val="22"/>
+              </w:rPr>
+            </w:pPr>
+            <w:bookmarkStart w:colFirst="0" w:colLast="0" w:name="_d6fu8zjuee0s" w:id="1"/>
+            <w:bookmarkEnd w:id="1"/>
+            <w:r>
+              <w:rPr>
+                <w:rFonts w:ascii="Malgun Gothic" w:cs="Malgun Gothic" w:eastAsia="Malgun Gothic" w:hAnsi="Malgun Gothic"/>
+                <w:color w:val="0000ff"/>
+                <w:sz w:val="22"/>
+                <w:szCs w:val="22"/>
+                <w:rtl w:val="0"/>
+              </w:rPr>
+              <w:t xml:space="preserve">11/20</w:t>
+            </w:r>
+          </w:p>
+        </w:tc>
+        <w:tc>
+          <w:tcPr>
+            <w:tcBorders>
+              <w:top w:color="808080" w:space="0" w:sz="7" w:val="single"/>
+              <w:left w:color="808080" w:space="0" w:sz="7" w:val="single"/>
+              <w:bottom w:color="808080" w:space="0" w:sz="7" w:val="single"/>
+              <w:right w:color="808080" w:space="0" w:sz="7" w:val="single"/>
+            </w:tcBorders>
+            <w:tcMar>
+              <w:top w:w="56.69291338582678" w:type="dxa"/>
+              <w:left w:w="56.69291338582678" w:type="dxa"/>
+              <w:bottom w:w="56.69291338582678" w:type="dxa"/>
+              <w:right w:w="56.69291338582678" w:type="dxa"/>
+            </w:tcMar>
+            <w:vAlign w:val="center"/>
+          </w:tcPr>
+          <w:p>
+            <w:pPr>
+              <w:pStyle w:val="Heading3"/>
+              <w:keepNext w:val="0"/>
+              <w:keepLines w:val="0"/>
+              <w:spacing w:after="0" w:before="0" w:line="240" w:lineRule="auto"/>
+              <w:jc w:val="center"/>
+              <w:rPr>
+                <w:rFonts w:ascii="Malgun Gothic" w:cs="Malgun Gothic" w:eastAsia="Malgun Gothic" w:hAnsi="Malgun Gothic"/>
+                <w:color w:val="0000ff"/>
+                <w:sz w:val="22"/>
+                <w:szCs w:val="22"/>
+              </w:rPr>
+            </w:pPr>
+            <w:bookmarkStart w:colFirst="0" w:colLast="0" w:name="_d6fu8zjuee0s" w:id="1"/>
+            <w:bookmarkEnd w:id="1"/>
+            <w:r>
+              <w:rPr>
+                <w:rFonts w:ascii="Malgun Gothic" w:cs="Malgun Gothic" w:eastAsia="Malgun Gothic" w:hAnsi="Malgun Gothic"/>
+                <w:color w:val="0000ff"/>
+                <w:sz w:val="22"/>
+                <w:szCs w:val="22"/>
+                <w:rtl w:val="0"/>
+              </w:rPr>
+              <w:t xml:space="preserve">14/20</w:t>
+            </w:r>
+          </w:p>
+        </w:tc>
+      </w:tr>
+      <w:tr>
+        <w:trPr>
+          <w:cantSplit w:val="0"/>
+          <w:trHeight w:val="566.9291338582677" w:hRule="atLeast"/>
+          <w:tblHeader w:val="0"/>
+        </w:trPr>
+        <w:tc>
+          <w:tcPr>
+            <w:tcBorders>
+              <w:top w:color="808080" w:space="0" w:sz="7" w:val="single"/>
+              <w:left w:color="808080" w:space="0" w:sz="7" w:val="single"/>
+              <w:bottom w:color="808080" w:space="0" w:sz="7" w:val="single"/>
+              <w:right w:color="808080" w:space="0" w:sz="7" w:val="single"/>
+            </w:tcBorders>
+            <w:tcMar>
+              <w:top w:w="56.69291338582678" w:type="dxa"/>
+              <w:left w:w="56.69291338582678" w:type="dxa"/>
+              <w:bottom w:w="56.69291338582678" w:type="dxa"/>
+              <w:right w:w="56.69291338582678" w:type="dxa"/>
+            </w:tcMar>
+            <w:vAlign w:val="center"/>
+          </w:tcPr>
+          <w:p>
+            <w:pPr>
+              <w:pStyle w:val="Heading3"/>
+              <w:keepNext w:val="0"/>
+              <w:keepLines w:val="0"/>
+              <w:spacing w:after="0" w:before="0" w:line="240" w:lineRule="auto"/>
+              <w:jc w:val="center"/>
+              <w:rPr>
+                <w:rFonts w:ascii="Malgun Gothic" w:cs="Malgun Gothic" w:eastAsia="Malgun Gothic" w:hAnsi="Malgun Gothic"/>
+                <w:color w:val="0000ff"/>
+                <w:sz w:val="22"/>
+                <w:szCs w:val="22"/>
+              </w:rPr>
+            </w:pPr>
+            <w:bookmarkStart w:colFirst="0" w:colLast="0" w:name="_d6fu8zjuee0s" w:id="1"/>
+            <w:bookmarkEnd w:id="1"/>
+            <w:r>
+              <w:rPr>
+                <w:rFonts w:ascii="Malgun Gothic" w:cs="Malgun Gothic" w:eastAsia="Malgun Gothic" w:hAnsi="Malgun Gothic"/>
+                <w:color w:val="0000ff"/>
+                <w:sz w:val="22"/>
+                <w:szCs w:val="22"/>
+                <w:rtl w:val="0"/>
+              </w:rPr>
+              <w:t xml:space="preserve">새 10문항 1차(N01~N10)</w:t>
+            </w:r>
+          </w:p>
+        </w:tc>
+        <w:tc>
+          <w:tcPr>
+            <w:tcBorders>
+              <w:top w:color="808080" w:space="0" w:sz="7" w:val="single"/>
+              <w:left w:color="808080" w:space="0" w:sz="7" w:val="single"/>
+              <w:bottom w:color="808080" w:space="0" w:sz="7" w:val="single"/>
+              <w:right w:color="808080" w:space="0" w:sz="7" w:val="single"/>
+            </w:tcBorders>
+            <w:tcMar>
+              <w:top w:w="56.69291338582678" w:type="dxa"/>
+              <w:left w:w="56.69291338582678" w:type="dxa"/>
+              <w:bottom w:w="56.69291338582678" w:type="dxa"/>
+              <w:right w:w="56.69291338582678" w:type="dxa"/>
+            </w:tcMar>
+            <w:vAlign w:val="center"/>
+          </w:tcPr>
+          <w:p>
+            <w:pPr>
+              <w:pStyle w:val="Heading3"/>
+              <w:keepNext w:val="0"/>
+              <w:keepLines w:val="0"/>
+              <w:spacing w:after="0" w:before="0" w:line="240" w:lineRule="auto"/>
+              <w:jc w:val="center"/>
+              <w:rPr>
+                <w:rFonts w:ascii="Malgun Gothic" w:cs="Malgun Gothic" w:eastAsia="Malgun Gothic" w:hAnsi="Malgun Gothic"/>
+                <w:color w:val="0000ff"/>
+                <w:sz w:val="22"/>
+                <w:szCs w:val="22"/>
+              </w:rPr>
+            </w:pPr>
+            <w:bookmarkStart w:colFirst="0" w:colLast="0" w:name="_d6fu8zjuee0s" w:id="1"/>
+            <w:bookmarkEnd w:id="1"/>
+            <w:r>
+              <w:rPr>
+                <w:rFonts w:ascii="Malgun Gothic" w:cs="Malgun Gothic" w:eastAsia="Malgun Gothic" w:hAnsi="Malgun Gothic"/>
+                <w:color w:val="0000ff"/>
+                <w:sz w:val="22"/>
+                <w:szCs w:val="22"/>
+                <w:rtl w:val="0"/>
+              </w:rPr>
+              <w:t xml:space="preserve">10</w:t>
+            </w:r>
+          </w:p>
+        </w:tc>
+        <w:tc>
+          <w:tcPr>
+            <w:tcBorders>
+              <w:top w:color="808080" w:space="0" w:sz="7" w:val="single"/>
+              <w:left w:color="808080" w:space="0" w:sz="7" w:val="single"/>
+              <w:bottom w:color="808080" w:space="0" w:sz="7" w:val="single"/>
+              <w:right w:color="808080" w:space="0" w:sz="7" w:val="single"/>
+            </w:tcBorders>
+            <w:tcMar>
+              <w:top w:w="56.69291338582678" w:type="dxa"/>
+              <w:left w:w="56.69291338582678" w:type="dxa"/>
+              <w:bottom w:w="56.69291338582678" w:type="dxa"/>
+              <w:right w:w="56.69291338582678" w:type="dxa"/>
+            </w:tcMar>
+            <w:vAlign w:val="center"/>
+          </w:tcPr>
+          <w:p>
+            <w:pPr>
+              <w:pStyle w:val="Heading3"/>
+              <w:keepNext w:val="0"/>
+              <w:keepLines w:val="0"/>
+              <w:spacing w:after="0" w:before="0" w:line="240" w:lineRule="auto"/>
+              <w:jc w:val="center"/>
+              <w:rPr>
+                <w:rFonts w:ascii="Malgun Gothic" w:cs="Malgun Gothic" w:eastAsia="Malgun Gothic" w:hAnsi="Malgun Gothic"/>
+                <w:color w:val="0000ff"/>
+                <w:sz w:val="22"/>
+                <w:szCs w:val="22"/>
+              </w:rPr>
+            </w:pPr>
+            <w:bookmarkStart w:colFirst="0" w:colLast="0" w:name="_d6fu8zjuee0s" w:id="1"/>
+            <w:bookmarkEnd w:id="1"/>
+            <w:r>
+              <w:rPr>
+                <w:rFonts w:ascii="Malgun Gothic" w:cs="Malgun Gothic" w:eastAsia="Malgun Gothic" w:hAnsi="Malgun Gothic"/>
+                <w:color w:val="0000ff"/>
+                <w:sz w:val="22"/>
+                <w:szCs w:val="22"/>
+                <w:rtl w:val="0"/>
+              </w:rPr>
+              <w:t xml:space="preserve">6/10</w:t>
+            </w:r>
+          </w:p>
+        </w:tc>
+        <w:tc>
+          <w:tcPr>
+            <w:tcBorders>
+              <w:top w:color="808080" w:space="0" w:sz="7" w:val="single"/>
+              <w:left w:color="808080" w:space="0" w:sz="7" w:val="single"/>
+              <w:bottom w:color="808080" w:space="0" w:sz="7" w:val="single"/>
+              <w:right w:color="808080" w:space="0" w:sz="7" w:val="single"/>
+            </w:tcBorders>
+            <w:tcMar>
+              <w:top w:w="56.69291338582678" w:type="dxa"/>
+              <w:left w:w="56.69291338582678" w:type="dxa"/>
+              <w:bottom w:w="56.69291338582678" w:type="dxa"/>
+              <w:right w:w="56.69291338582678" w:type="dxa"/>
+            </w:tcMar>
+            <w:vAlign w:val="center"/>
+          </w:tcPr>
+          <w:p>
+            <w:pPr>
+              <w:pStyle w:val="Heading3"/>
+              <w:keepNext w:val="0"/>
+              <w:keepLines w:val="0"/>
+              <w:spacing w:after="0" w:before="0" w:line="240" w:lineRule="auto"/>
+              <w:jc w:val="center"/>
+              <w:rPr>
+                <w:rFonts w:ascii="Malgun Gothic" w:cs="Malgun Gothic" w:eastAsia="Malgun Gothic" w:hAnsi="Malgun Gothic"/>
+                <w:color w:val="0000ff"/>
+                <w:sz w:val="22"/>
+                <w:szCs w:val="22"/>
+              </w:rPr>
+            </w:pPr>
+            <w:bookmarkStart w:colFirst="0" w:colLast="0" w:name="_d6fu8zjuee0s" w:id="1"/>
+            <w:bookmarkEnd w:id="1"/>
+            <w:r>
+              <w:rPr>
+                <w:rFonts w:ascii="Malgun Gothic" w:cs="Malgun Gothic" w:eastAsia="Malgun Gothic" w:hAnsi="Malgun Gothic"/>
+                <w:color w:val="0000ff"/>
+                <w:sz w:val="22"/>
+                <w:szCs w:val="22"/>
+                <w:rtl w:val="0"/>
+              </w:rPr>
+              <w:t xml:space="preserve">9/10</w:t>
+            </w:r>
+          </w:p>
+        </w:tc>
+      </w:tr>
+      <w:tr>
+        <w:trPr>
+          <w:cantSplit w:val="0"/>
+          <w:trHeight w:val="566.9291338582677" w:hRule="atLeast"/>
+          <w:tblHeader w:val="0"/>
+        </w:trPr>
+        <w:tc>
+          <w:tcPr>
+            <w:tcBorders>
+              <w:top w:color="808080" w:space="0" w:sz="7" w:val="single"/>
+              <w:left w:color="808080" w:space="0" w:sz="7" w:val="single"/>
+              <w:bottom w:color="808080" w:space="0" w:sz="7" w:val="single"/>
+              <w:right w:color="808080" w:space="0" w:sz="7" w:val="single"/>
+            </w:tcBorders>
+            <w:tcMar>
+              <w:top w:w="56.69291338582678" w:type="dxa"/>
+              <w:left w:w="56.69291338582678" w:type="dxa"/>
+              <w:bottom w:w="56.69291338582678" w:type="dxa"/>
+              <w:right w:w="56.69291338582678" w:type="dxa"/>
+            </w:tcMar>
+            <w:vAlign w:val="center"/>
+          </w:tcPr>
+          <w:p>
+            <w:pPr>
+              <w:pStyle w:val="Heading3"/>
+              <w:keepNext w:val="0"/>
+              <w:keepLines w:val="0"/>
+              <w:spacing w:after="0" w:before="0" w:line="240" w:lineRule="auto"/>
+              <w:jc w:val="center"/>
+              <w:rPr>
+                <w:rFonts w:ascii="Malgun Gothic" w:cs="Malgun Gothic" w:eastAsia="Malgun Gothic" w:hAnsi="Malgun Gothic"/>
+                <w:color w:val="0000ff"/>
+                <w:sz w:val="22"/>
+                <w:szCs w:val="22"/>
+              </w:rPr>
+            </w:pPr>
+            <w:bookmarkStart w:colFirst="0" w:colLast="0" w:name="_d6fu8zjuee0s" w:id="1"/>
+            <w:bookmarkEnd w:id="1"/>
+            <w:r>
+              <w:rPr>
+                <w:rFonts w:ascii="Malgun Gothic" w:cs="Malgun Gothic" w:eastAsia="Malgun Gothic" w:hAnsi="Malgun Gothic"/>
+                <w:color w:val="0000ff"/>
+                <w:sz w:val="22"/>
+                <w:szCs w:val="22"/>
+                <w:rtl w:val="0"/>
+              </w:rPr>
+              <w:t xml:space="preserve">새 10문항 2차(M01~M10)</w:t>
+            </w:r>
+          </w:p>
+        </w:tc>
+        <w:tc>
+          <w:tcPr>
+            <w:tcBorders>
+              <w:top w:color="808080" w:space="0" w:sz="7" w:val="single"/>
+              <w:left w:color="808080" w:space="0" w:sz="7" w:val="single"/>
+              <w:bottom w:color="808080" w:space="0" w:sz="7" w:val="single"/>
+              <w:right w:color="808080" w:space="0" w:sz="7" w:val="single"/>
+            </w:tcBorders>
+            <w:tcMar>
+              <w:top w:w="56.69291338582678" w:type="dxa"/>
+              <w:left w:w="56.69291338582678" w:type="dxa"/>
+              <w:bottom w:w="56.69291338582678" w:type="dxa"/>
+              <w:right w:w="56.69291338582678" w:type="dxa"/>
+            </w:tcMar>
+            <w:vAlign w:val="center"/>
+          </w:tcPr>
+          <w:p>
+            <w:pPr>
+              <w:pStyle w:val="Heading3"/>
+              <w:keepNext w:val="0"/>
+              <w:keepLines w:val="0"/>
+              <w:spacing w:after="0" w:before="0" w:line="240" w:lineRule="auto"/>
+              <w:jc w:val="center"/>
+              <w:rPr>
+                <w:rFonts w:ascii="Malgun Gothic" w:cs="Malgun Gothic" w:eastAsia="Malgun Gothic" w:hAnsi="Malgun Gothic"/>
+                <w:color w:val="0000ff"/>
+                <w:sz w:val="22"/>
+                <w:szCs w:val="22"/>
+              </w:rPr>
+            </w:pPr>
+            <w:bookmarkStart w:colFirst="0" w:colLast="0" w:name="_d6fu8zjuee0s" w:id="1"/>
+            <w:bookmarkEnd w:id="1"/>
+            <w:r>
+              <w:rPr>
+                <w:rFonts w:ascii="Malgun Gothic" w:cs="Malgun Gothic" w:eastAsia="Malgun Gothic" w:hAnsi="Malgun Gothic"/>
+                <w:color w:val="0000ff"/>
+                <w:sz w:val="22"/>
+                <w:szCs w:val="22"/>
+                <w:rtl w:val="0"/>
+              </w:rPr>
+              <w:t xml:space="preserve">10</w:t>
+            </w:r>
+          </w:p>
+        </w:tc>
+        <w:tc>
+          <w:tcPr>
+            <w:tcBorders>
+              <w:top w:color="808080" w:space="0" w:sz="7" w:val="single"/>
+              <w:left w:color="808080" w:space="0" w:sz="7" w:val="single"/>
+              <w:bottom w:color="808080" w:space="0" w:sz="7" w:val="single"/>
+              <w:right w:color="808080" w:space="0" w:sz="7" w:val="single"/>
+            </w:tcBorders>
+            <w:tcMar>
+              <w:top w:w="56.69291338582678" w:type="dxa"/>
+              <w:left w:w="56.69291338582678" w:type="dxa"/>
+              <w:bottom w:w="56.69291338582678" w:type="dxa"/>
+              <w:right w:w="56.69291338582678" w:type="dxa"/>
+            </w:tcMar>
+            <w:vAlign w:val="center"/>
+          </w:tcPr>
+          <w:p>
+            <w:pPr>
+              <w:pStyle w:val="Heading3"/>
+              <w:keepNext w:val="0"/>
+              <w:keepLines w:val="0"/>
+              <w:spacing w:after="0" w:before="0" w:line="240" w:lineRule="auto"/>
+              <w:jc w:val="center"/>
+              <w:rPr>
+                <w:rFonts w:ascii="Malgun Gothic" w:cs="Malgun Gothic" w:eastAsia="Malgun Gothic" w:hAnsi="Malgun Gothic"/>
+                <w:color w:val="0000ff"/>
+                <w:sz w:val="22"/>
+                <w:szCs w:val="22"/>
+              </w:rPr>
+            </w:pPr>
+            <w:bookmarkStart w:colFirst="0" w:colLast="0" w:name="_d6fu8zjuee0s" w:id="1"/>
+            <w:bookmarkEnd w:id="1"/>
+            <w:r>
+              <w:rPr>
+                <w:rFonts w:ascii="Malgun Gothic" w:cs="Malgun Gothic" w:eastAsia="Malgun Gothic" w:hAnsi="Malgun Gothic"/>
+                <w:color w:val="0000ff"/>
+                <w:sz w:val="22"/>
+                <w:szCs w:val="22"/>
+                <w:rtl w:val="0"/>
+              </w:rPr>
+              <w:t xml:space="preserve">5/10</w:t>
+            </w:r>
+          </w:p>
+        </w:tc>
+        <w:tc>
+          <w:tcPr>
+            <w:tcBorders>
+              <w:top w:color="808080" w:space="0" w:sz="7" w:val="single"/>
+              <w:left w:color="808080" w:space="0" w:sz="7" w:val="single"/>
+              <w:bottom w:color="808080" w:space="0" w:sz="7" w:val="single"/>
+              <w:right w:color="808080" w:space="0" w:sz="7" w:val="single"/>
+            </w:tcBorders>
+            <w:tcMar>
+              <w:top w:w="56.69291338582678" w:type="dxa"/>
+              <w:left w:w="56.69291338582678" w:type="dxa"/>
+              <w:bottom w:w="56.69291338582678" w:type="dxa"/>
+              <w:right w:w="56.69291338582678" w:type="dxa"/>
+            </w:tcMar>
+            <w:vAlign w:val="center"/>
+          </w:tcPr>
+          <w:p>
+            <w:pPr>
+              <w:pStyle w:val="Heading3"/>
+              <w:keepNext w:val="0"/>
+              <w:keepLines w:val="0"/>
+              <w:spacing w:after="0" w:before="0" w:line="240" w:lineRule="auto"/>
+              <w:jc w:val="center"/>
+              <w:rPr>
+                <w:rFonts w:ascii="Malgun Gothic" w:cs="Malgun Gothic" w:eastAsia="Malgun Gothic" w:hAnsi="Malgun Gothic"/>
+                <w:color w:val="0000ff"/>
+                <w:sz w:val="22"/>
+                <w:szCs w:val="22"/>
+              </w:rPr>
+            </w:pPr>
+            <w:bookmarkStart w:colFirst="0" w:colLast="0" w:name="_d6fu8zjuee0s" w:id="1"/>
+            <w:bookmarkEnd w:id="1"/>
+            <w:r>
+              <w:rPr>
+                <w:rFonts w:ascii="Malgun Gothic" w:cs="Malgun Gothic" w:eastAsia="Malgun Gothic" w:hAnsi="Malgun Gothic"/>
+                <w:color w:val="0000ff"/>
+                <w:sz w:val="22"/>
+                <w:szCs w:val="22"/>
+                <w:rtl w:val="0"/>
+              </w:rPr>
+              <w:t xml:space="preserve">7/10</w:t>
+            </w:r>
+          </w:p>
+        </w:tc>
+      </w:tr>
+      <w:tr>
+        <w:trPr>
+          <w:cantSplit w:val="0"/>
+          <w:trHeight w:val="566.9291338582677" w:hRule="atLeast"/>
+          <w:tblHeader w:val="0"/>
+        </w:trPr>
+        <w:tc>
+          <w:tcPr>
+            <w:tcBorders>
+              <w:top w:color="808080" w:space="0" w:sz="7" w:val="single"/>
+              <w:left w:color="808080" w:space="0" w:sz="7" w:val="single"/>
+              <w:bottom w:color="808080" w:space="0" w:sz="7" w:val="single"/>
+              <w:right w:color="808080" w:space="0" w:sz="7" w:val="single"/>
+            </w:tcBorders>
+            <w:tcMar>
+              <w:top w:w="56.69291338582678" w:type="dxa"/>
+              <w:left w:w="56.69291338582678" w:type="dxa"/>
+              <w:bottom w:w="56.69291338582678" w:type="dxa"/>
+              <w:right w:w="56.69291338582678" w:type="dxa"/>
+            </w:tcMar>
+            <w:vAlign w:val="center"/>
+          </w:tcPr>
+          <w:p>
+            <w:pPr>
+              <w:pStyle w:val="Heading3"/>
+              <w:keepNext w:val="0"/>
+              <w:keepLines w:val="0"/>
+              <w:spacing w:after="0" w:before="0" w:line="240" w:lineRule="auto"/>
+              <w:jc w:val="center"/>
+              <w:rPr>
+                <w:rFonts w:ascii="Malgun Gothic" w:cs="Malgun Gothic" w:eastAsia="Malgun Gothic" w:hAnsi="Malgun Gothic"/>
+                <w:color w:val="0000ff"/>
+                <w:sz w:val="22"/>
+                <w:szCs w:val="22"/>
+              </w:rPr>
+            </w:pPr>
+            <w:bookmarkStart w:colFirst="0" w:colLast="0" w:name="_d6fu8zjuee0s" w:id="1"/>
+            <w:bookmarkEnd w:id="1"/>
+            <w:r>
+              <w:rPr>
+                <w:rFonts w:ascii="Malgun Gothic" w:cs="Malgun Gothic" w:eastAsia="Malgun Gothic" w:hAnsi="Malgun Gothic"/>
+                <w:color w:val="0000ff"/>
+                <w:sz w:val="22"/>
+                <w:szCs w:val="22"/>
+                <w:rtl w:val="0"/>
+              </w:rPr>
+              <w:t xml:space="preserve">C01~C10</w:t>
+            </w:r>
+          </w:p>
+        </w:tc>
+        <w:tc>
+          <w:tcPr>
+            <w:tcBorders>
+              <w:top w:color="808080" w:space="0" w:sz="7" w:val="single"/>
+              <w:left w:color="808080" w:space="0" w:sz="7" w:val="single"/>
+              <w:bottom w:color="808080" w:space="0" w:sz="7" w:val="single"/>
+              <w:right w:color="808080" w:space="0" w:sz="7" w:val="single"/>
+            </w:tcBorders>
+            <w:tcMar>
+              <w:top w:w="56.69291338582678" w:type="dxa"/>
+              <w:left w:w="56.69291338582678" w:type="dxa"/>
+              <w:bottom w:w="56.69291338582678" w:type="dxa"/>
+              <w:right w:w="56.69291338582678" w:type="dxa"/>
+            </w:tcMar>
+            <w:vAlign w:val="center"/>
+          </w:tcPr>
+          <w:p>
+            <w:pPr>
+              <w:pStyle w:val="Heading3"/>
+              <w:keepNext w:val="0"/>
+              <w:keepLines w:val="0"/>
+              <w:spacing w:after="0" w:before="0" w:line="240" w:lineRule="auto"/>
+              <w:jc w:val="center"/>
+              <w:rPr>
+                <w:rFonts w:ascii="Malgun Gothic" w:cs="Malgun Gothic" w:eastAsia="Malgun Gothic" w:hAnsi="Malgun Gothic"/>
+                <w:color w:val="0000ff"/>
+                <w:sz w:val="22"/>
+                <w:szCs w:val="22"/>
+              </w:rPr>
+            </w:pPr>
+            <w:bookmarkStart w:colFirst="0" w:colLast="0" w:name="_d6fu8zjuee0s" w:id="1"/>
+            <w:bookmarkEnd w:id="1"/>
+            <w:r>
+              <w:rPr>
+                <w:rFonts w:ascii="Malgun Gothic" w:cs="Malgun Gothic" w:eastAsia="Malgun Gothic" w:hAnsi="Malgun Gothic"/>
+                <w:color w:val="0000ff"/>
+                <w:sz w:val="22"/>
+                <w:szCs w:val="22"/>
+                <w:rtl w:val="0"/>
+              </w:rPr>
+              <w:t xml:space="preserve">10</w:t>
+            </w:r>
+          </w:p>
+        </w:tc>
+        <w:tc>
+          <w:tcPr>
+            <w:tcBorders>
+              <w:top w:color="808080" w:space="0" w:sz="7" w:val="single"/>
+              <w:left w:color="808080" w:space="0" w:sz="7" w:val="single"/>
+              <w:bottom w:color="808080" w:space="0" w:sz="7" w:val="single"/>
+              <w:right w:color="808080" w:space="0" w:sz="7" w:val="single"/>
+            </w:tcBorders>
+            <w:tcMar>
+              <w:top w:w="56.69291338582678" w:type="dxa"/>
+              <w:left w:w="56.69291338582678" w:type="dxa"/>
+              <w:bottom w:w="56.69291338582678" w:type="dxa"/>
+              <w:right w:w="56.69291338582678" w:type="dxa"/>
+            </w:tcMar>
+            <w:vAlign w:val="center"/>
+          </w:tcPr>
+          <w:p>
+            <w:pPr>
+              <w:pStyle w:val="Heading3"/>
+              <w:keepNext w:val="0"/>
+              <w:keepLines w:val="0"/>
+              <w:spacing w:after="0" w:before="0" w:line="240" w:lineRule="auto"/>
+              <w:jc w:val="center"/>
+              <w:rPr>
+                <w:rFonts w:ascii="Malgun Gothic" w:cs="Malgun Gothic" w:eastAsia="Malgun Gothic" w:hAnsi="Malgun Gothic"/>
+                <w:color w:val="0000ff"/>
+                <w:sz w:val="22"/>
+                <w:szCs w:val="22"/>
+              </w:rPr>
+            </w:pPr>
+            <w:bookmarkStart w:colFirst="0" w:colLast="0" w:name="_d6fu8zjuee0s" w:id="1"/>
+            <w:bookmarkEnd w:id="1"/>
+            <w:r>
+              <w:rPr>
+                <w:rFonts w:ascii="Malgun Gothic" w:cs="Malgun Gothic" w:eastAsia="Malgun Gothic" w:hAnsi="Malgun Gothic"/>
+                <w:color w:val="0000ff"/>
+                <w:sz w:val="22"/>
+                <w:szCs w:val="22"/>
+                <w:rtl w:val="0"/>
+              </w:rPr>
+              <w:t xml:space="preserve">5/10</w:t>
+            </w:r>
+          </w:p>
+        </w:tc>
+        <w:tc>
+          <w:tcPr>
+            <w:tcBorders>
+              <w:top w:color="808080" w:space="0" w:sz="7" w:val="single"/>
+              <w:left w:color="808080" w:space="0" w:sz="7" w:val="single"/>
+              <w:bottom w:color="808080" w:space="0" w:sz="7" w:val="single"/>
+              <w:right w:color="808080" w:space="0" w:sz="7" w:val="single"/>
+            </w:tcBorders>
+            <w:tcMar>
+              <w:top w:w="56.69291338582678" w:type="dxa"/>
+              <w:left w:w="56.69291338582678" w:type="dxa"/>
+              <w:bottom w:w="56.69291338582678" w:type="dxa"/>
+              <w:right w:w="56.69291338582678" w:type="dxa"/>
+            </w:tcMar>
+            <w:vAlign w:val="center"/>
+          </w:tcPr>
+          <w:p>
+            <w:pPr>
+              <w:pStyle w:val="Heading3"/>
+              <w:keepNext w:val="0"/>
+              <w:keepLines w:val="0"/>
+              <w:spacing w:after="0" w:before="0" w:line="240" w:lineRule="auto"/>
+              <w:jc w:val="center"/>
+              <w:rPr>
+                <w:rFonts w:ascii="Malgun Gothic" w:cs="Malgun Gothic" w:eastAsia="Malgun Gothic" w:hAnsi="Malgun Gothic"/>
+                <w:color w:val="0000ff"/>
+                <w:sz w:val="22"/>
+                <w:szCs w:val="22"/>
+              </w:rPr>
+            </w:pPr>
+            <w:bookmarkStart w:colFirst="0" w:colLast="0" w:name="_d6fu8zjuee0s" w:id="1"/>
+            <w:bookmarkEnd w:id="1"/>
+            <w:r>
+              <w:rPr>
+                <w:rFonts w:ascii="Malgun Gothic" w:cs="Malgun Gothic" w:eastAsia="Malgun Gothic" w:hAnsi="Malgun Gothic"/>
+                <w:color w:val="0000ff"/>
+                <w:sz w:val="22"/>
+                <w:szCs w:val="22"/>
+                <w:rtl w:val="0"/>
+              </w:rPr>
+              <w:t xml:space="preserve">9/10</w:t>
+            </w:r>
+          </w:p>
+        </w:tc>
+      </w:tr>
+      <w:tr>
+        <w:trPr>
+          <w:cantSplit w:val="0"/>
+          <w:trHeight w:val="566.9291338582677" w:hRule="atLeast"/>
+          <w:tblHeader w:val="0"/>
+        </w:trPr>
+        <w:tc>
+          <w:tcPr>
+            <w:tcBorders>
+              <w:top w:color="808080" w:space="0" w:sz="7" w:val="single"/>
+              <w:left w:color="808080" w:space="0" w:sz="7" w:val="single"/>
+              <w:bottom w:color="808080" w:space="0" w:sz="7" w:val="single"/>
+              <w:right w:color="808080" w:space="0" w:sz="7" w:val="single"/>
+            </w:tcBorders>
+            <w:tcMar>
+              <w:top w:w="56.69291338582678" w:type="dxa"/>
+              <w:left w:w="56.69291338582678" w:type="dxa"/>
+              <w:bottom w:w="56.69291338582678" w:type="dxa"/>
+              <w:right w:w="56.69291338582678" w:type="dxa"/>
+            </w:tcMar>
+            <w:vAlign w:val="center"/>
+          </w:tcPr>
+          <w:p>
+            <w:pPr>
+              <w:pStyle w:val="Heading3"/>
+              <w:keepNext w:val="0"/>
+              <w:keepLines w:val="0"/>
+              <w:spacing w:after="0" w:before="0" w:line="240" w:lineRule="auto"/>
+              <w:jc w:val="center"/>
+              <w:rPr>
+                <w:rFonts w:ascii="Malgun Gothic" w:cs="Malgun Gothic" w:eastAsia="Malgun Gothic" w:hAnsi="Malgun Gothic"/>
+                <w:color w:val="0000ff"/>
+                <w:sz w:val="22"/>
+                <w:szCs w:val="22"/>
+              </w:rPr>
+            </w:pPr>
+            <w:bookmarkStart w:colFirst="0" w:colLast="0" w:name="_d6fu8zjuee0s" w:id="1"/>
+            <w:bookmarkEnd w:id="1"/>
+            <w:r>
+              <w:rPr>
+                <w:rFonts w:ascii="Malgun Gothic" w:cs="Malgun Gothic" w:eastAsia="Malgun Gothic" w:hAnsi="Malgun Gothic"/>
+                <w:color w:val="0000ff"/>
+                <w:sz w:val="22"/>
+                <w:szCs w:val="22"/>
+                <w:rtl w:val="0"/>
+              </w:rPr>
+              <w:t xml:space="preserve">D01~D10</w:t>
+            </w:r>
+          </w:p>
+        </w:tc>
+        <w:tc>
+          <w:tcPr>
+            <w:tcBorders>
+              <w:top w:color="808080" w:space="0" w:sz="7" w:val="single"/>
+              <w:left w:color="808080" w:space="0" w:sz="7" w:val="single"/>
+              <w:bottom w:color="808080" w:space="0" w:sz="7" w:val="single"/>
+              <w:right w:color="808080" w:space="0" w:sz="7" w:val="single"/>
+            </w:tcBorders>
+            <w:tcMar>
+              <w:top w:w="56.69291338582678" w:type="dxa"/>
+              <w:left w:w="56.69291338582678" w:type="dxa"/>
+              <w:bottom w:w="56.69291338582678" w:type="dxa"/>
+              <w:right w:w="56.69291338582678" w:type="dxa"/>
+            </w:tcMar>
+            <w:vAlign w:val="center"/>
+          </w:tcPr>
+          <w:p>
+            <w:pPr>
+              <w:pStyle w:val="Heading3"/>
+              <w:keepNext w:val="0"/>
+              <w:keepLines w:val="0"/>
+              <w:spacing w:after="0" w:before="0" w:line="240" w:lineRule="auto"/>
+              <w:jc w:val="center"/>
+              <w:rPr>
+                <w:rFonts w:ascii="Malgun Gothic" w:cs="Malgun Gothic" w:eastAsia="Malgun Gothic" w:hAnsi="Malgun Gothic"/>
+                <w:color w:val="0000ff"/>
+                <w:sz w:val="22"/>
+                <w:szCs w:val="22"/>
+              </w:rPr>
+            </w:pPr>
+            <w:bookmarkStart w:colFirst="0" w:colLast="0" w:name="_d6fu8zjuee0s" w:id="1"/>
+            <w:bookmarkEnd w:id="1"/>
+            <w:r>
+              <w:rPr>
+                <w:rFonts w:ascii="Malgun Gothic" w:cs="Malgun Gothic" w:eastAsia="Malgun Gothic" w:hAnsi="Malgun Gothic"/>
+                <w:color w:val="0000ff"/>
+                <w:sz w:val="22"/>
+                <w:szCs w:val="22"/>
+                <w:rtl w:val="0"/>
+              </w:rPr>
+              <w:t xml:space="preserve">10</w:t>
+            </w:r>
+          </w:p>
+        </w:tc>
+        <w:tc>
+          <w:tcPr>
+            <w:tcBorders>
+              <w:top w:color="808080" w:space="0" w:sz="7" w:val="single"/>
+              <w:left w:color="808080" w:space="0" w:sz="7" w:val="single"/>
+              <w:bottom w:color="808080" w:space="0" w:sz="7" w:val="single"/>
+              <w:right w:color="808080" w:space="0" w:sz="7" w:val="single"/>
+            </w:tcBorders>
+            <w:tcMar>
+              <w:top w:w="56.69291338582678" w:type="dxa"/>
+              <w:left w:w="56.69291338582678" w:type="dxa"/>
+              <w:bottom w:w="56.69291338582678" w:type="dxa"/>
+              <w:right w:w="56.69291338582678" w:type="dxa"/>
+            </w:tcMar>
+            <w:vAlign w:val="center"/>
+          </w:tcPr>
+          <w:p>
+            <w:pPr>
+              <w:pStyle w:val="Heading3"/>
+              <w:keepNext w:val="0"/>
+              <w:keepLines w:val="0"/>
+              <w:spacing w:after="0" w:before="0" w:line="240" w:lineRule="auto"/>
+              <w:jc w:val="center"/>
+              <w:rPr>
+                <w:rFonts w:ascii="Malgun Gothic" w:cs="Malgun Gothic" w:eastAsia="Malgun Gothic" w:hAnsi="Malgun Gothic"/>
+                <w:color w:val="0000ff"/>
+                <w:sz w:val="22"/>
+                <w:szCs w:val="22"/>
+              </w:rPr>
+            </w:pPr>
+            <w:bookmarkStart w:colFirst="0" w:colLast="0" w:name="_d6fu8zjuee0s" w:id="1"/>
+            <w:bookmarkEnd w:id="1"/>
+            <w:r>
+              <w:rPr>
+                <w:rFonts w:ascii="Malgun Gothic" w:cs="Malgun Gothic" w:eastAsia="Malgun Gothic" w:hAnsi="Malgun Gothic"/>
+                <w:color w:val="0000ff"/>
+                <w:sz w:val="22"/>
+                <w:szCs w:val="22"/>
+                <w:rtl w:val="0"/>
+              </w:rPr>
+              <w:t xml:space="preserve">6/10</w:t>
+            </w:r>
+          </w:p>
+        </w:tc>
+        <w:tc>
+          <w:tcPr>
+            <w:tcBorders>
+              <w:top w:color="808080" w:space="0" w:sz="7" w:val="single"/>
+              <w:left w:color="808080" w:space="0" w:sz="7" w:val="single"/>
+              <w:bottom w:color="808080" w:space="0" w:sz="7" w:val="single"/>
+              <w:right w:color="808080" w:space="0" w:sz="7" w:val="single"/>
+            </w:tcBorders>
+            <w:tcMar>
+              <w:top w:w="56.69291338582678" w:type="dxa"/>
+              <w:left w:w="56.69291338582678" w:type="dxa"/>
+              <w:bottom w:w="56.69291338582678" w:type="dxa"/>
+              <w:right w:w="56.69291338582678" w:type="dxa"/>
+            </w:tcMar>
+            <w:vAlign w:val="center"/>
+          </w:tcPr>
+          <w:p>
+            <w:pPr>
+              <w:pStyle w:val="Heading3"/>
+              <w:keepNext w:val="0"/>
+              <w:keepLines w:val="0"/>
+              <w:spacing w:after="0" w:before="0" w:line="240" w:lineRule="auto"/>
+              <w:jc w:val="center"/>
+              <w:rPr>
+                <w:rFonts w:ascii="Malgun Gothic" w:cs="Malgun Gothic" w:eastAsia="Malgun Gothic" w:hAnsi="Malgun Gothic"/>
+                <w:color w:val="0000ff"/>
+                <w:sz w:val="22"/>
+                <w:szCs w:val="22"/>
+              </w:rPr>
+            </w:pPr>
+            <w:bookmarkStart w:colFirst="0" w:colLast="0" w:name="_d6fu8zjuee0s" w:id="1"/>
+            <w:bookmarkEnd w:id="1"/>
+            <w:r>
+              <w:rPr>
+                <w:rFonts w:ascii="Malgun Gothic" w:cs="Malgun Gothic" w:eastAsia="Malgun Gothic" w:hAnsi="Malgun Gothic"/>
+                <w:color w:val="0000ff"/>
+                <w:sz w:val="22"/>
+                <w:szCs w:val="22"/>
+                <w:rtl w:val="0"/>
+              </w:rPr>
+              <w:t xml:space="preserve">9/10</w:t>
+            </w:r>
+          </w:p>
+        </w:tc>
+      </w:tr>
+      <w:tr>
+        <w:trPr>
+          <w:cantSplit w:val="0"/>
+          <w:trHeight w:val="566.9291338582677" w:hRule="atLeast"/>
+          <w:tblHeader w:val="0"/>
+        </w:trPr>
+        <w:tc>
+          <w:tcPr>
+            <w:tcBorders>
+              <w:top w:color="808080" w:space="0" w:sz="7" w:val="single"/>
+              <w:left w:color="808080" w:space="0" w:sz="7" w:val="single"/>
+              <w:bottom w:color="808080" w:space="0" w:sz="7" w:val="single"/>
+              <w:right w:color="808080" w:space="0" w:sz="7" w:val="single"/>
+            </w:tcBorders>
+            <w:tcMar>
+              <w:top w:w="56.69291338582678" w:type="dxa"/>
+              <w:left w:w="56.69291338582678" w:type="dxa"/>
+              <w:bottom w:w="56.69291338582678" w:type="dxa"/>
+              <w:right w:w="56.69291338582678" w:type="dxa"/>
+            </w:tcMar>
+            <w:vAlign w:val="center"/>
+          </w:tcPr>
+          <w:p>
+            <w:pPr>
+              <w:pStyle w:val="Heading3"/>
+              <w:keepNext w:val="0"/>
+              <w:keepLines w:val="0"/>
+              <w:spacing w:after="0" w:before="0" w:line="240" w:lineRule="auto"/>
+              <w:jc w:val="center"/>
+              <w:rPr>
+                <w:rFonts w:ascii="Malgun Gothic" w:cs="Malgun Gothic" w:eastAsia="Malgun Gothic" w:hAnsi="Malgun Gothic"/>
+                <w:color w:val="0000ff"/>
+                <w:sz w:val="22"/>
+                <w:szCs w:val="22"/>
+              </w:rPr>
+            </w:pPr>
+            <w:bookmarkStart w:colFirst="0" w:colLast="0" w:name="_d6fu8zjuee0s" w:id="1"/>
+            <w:bookmarkEnd w:id="1"/>
+            <w:r>
+              <w:rPr>
+                <w:rFonts w:ascii="Malgun Gothic" w:cs="Malgun Gothic" w:eastAsia="Malgun Gothic" w:hAnsi="Malgun Gothic"/>
+                <w:color w:val="0000ff"/>
+                <w:sz w:val="22"/>
+                <w:szCs w:val="22"/>
+                <w:rtl w:val="0"/>
+              </w:rPr>
+              <w:t xml:space="preserve">E01~E10</w:t>
+            </w:r>
+          </w:p>
+        </w:tc>
+        <w:tc>
+          <w:tcPr>
+            <w:tcBorders>
+              <w:top w:color="808080" w:space="0" w:sz="7" w:val="single"/>
+              <w:left w:color="808080" w:space="0" w:sz="7" w:val="single"/>
+              <w:bottom w:color="808080" w:space="0" w:sz="7" w:val="single"/>
+              <w:right w:color="808080" w:space="0" w:sz="7" w:val="single"/>
+            </w:tcBorders>
+            <w:tcMar>
+              <w:top w:w="56.69291338582678" w:type="dxa"/>
+              <w:left w:w="56.69291338582678" w:type="dxa"/>
+              <w:bottom w:w="56.69291338582678" w:type="dxa"/>
+              <w:right w:w="56.69291338582678" w:type="dxa"/>
+            </w:tcMar>
+            <w:vAlign w:val="center"/>
+          </w:tcPr>
+          <w:p>
+            <w:pPr>
+              <w:pStyle w:val="Heading3"/>
+              <w:keepNext w:val="0"/>
+              <w:keepLines w:val="0"/>
+              <w:spacing w:after="0" w:before="0" w:line="240" w:lineRule="auto"/>
+              <w:jc w:val="center"/>
+              <w:rPr>
+                <w:rFonts w:ascii="Malgun Gothic" w:cs="Malgun Gothic" w:eastAsia="Malgun Gothic" w:hAnsi="Malgun Gothic"/>
+                <w:color w:val="0000ff"/>
+                <w:sz w:val="22"/>
+                <w:szCs w:val="22"/>
+              </w:rPr>
+            </w:pPr>
+            <w:bookmarkStart w:colFirst="0" w:colLast="0" w:name="_d6fu8zjuee0s" w:id="1"/>
+            <w:bookmarkEnd w:id="1"/>
+            <w:r>
+              <w:rPr>
+                <w:rFonts w:ascii="Malgun Gothic" w:cs="Malgun Gothic" w:eastAsia="Malgun Gothic" w:hAnsi="Malgun Gothic"/>
+                <w:color w:val="0000ff"/>
+                <w:sz w:val="22"/>
+                <w:szCs w:val="22"/>
+                <w:rtl w:val="0"/>
+              </w:rPr>
+              <w:t xml:space="preserve">10</w:t>
+            </w:r>
+          </w:p>
+        </w:tc>
+        <w:tc>
+          <w:tcPr>
+            <w:tcBorders>
+              <w:top w:color="808080" w:space="0" w:sz="7" w:val="single"/>
+              <w:left w:color="808080" w:space="0" w:sz="7" w:val="single"/>
+              <w:bottom w:color="808080" w:space="0" w:sz="7" w:val="single"/>
+              <w:right w:color="808080" w:space="0" w:sz="7" w:val="single"/>
+            </w:tcBorders>
+            <w:tcMar>
+              <w:top w:w="56.69291338582678" w:type="dxa"/>
+              <w:left w:w="56.69291338582678" w:type="dxa"/>
+              <w:bottom w:w="56.69291338582678" w:type="dxa"/>
+              <w:right w:w="56.69291338582678" w:type="dxa"/>
+            </w:tcMar>
+            <w:vAlign w:val="center"/>
+          </w:tcPr>
+          <w:p>
+            <w:pPr>
+              <w:pStyle w:val="Heading3"/>
+              <w:keepNext w:val="0"/>
+              <w:keepLines w:val="0"/>
+              <w:spacing w:after="0" w:before="0" w:line="240" w:lineRule="auto"/>
+              <w:jc w:val="center"/>
+              <w:rPr>
+                <w:rFonts w:ascii="Malgun Gothic" w:cs="Malgun Gothic" w:eastAsia="Malgun Gothic" w:hAnsi="Malgun Gothic"/>
+                <w:color w:val="0000ff"/>
+                <w:sz w:val="22"/>
+                <w:szCs w:val="22"/>
+              </w:rPr>
+            </w:pPr>
+            <w:bookmarkStart w:colFirst="0" w:colLast="0" w:name="_d6fu8zjuee0s" w:id="1"/>
+            <w:bookmarkEnd w:id="1"/>
+            <w:r>
+              <w:rPr>
+                <w:rFonts w:ascii="Malgun Gothic" w:cs="Malgun Gothic" w:eastAsia="Malgun Gothic" w:hAnsi="Malgun Gothic"/>
+                <w:color w:val="0000ff"/>
+                <w:sz w:val="22"/>
+                <w:szCs w:val="22"/>
+                <w:rtl w:val="0"/>
+              </w:rPr>
+              <w:t xml:space="preserve">4/10</w:t>
+            </w:r>
+          </w:p>
+        </w:tc>
+        <w:tc>
+          <w:tcPr>
+            <w:tcBorders>
+              <w:top w:color="808080" w:space="0" w:sz="7" w:val="single"/>
+              <w:left w:color="808080" w:space="0" w:sz="7" w:val="single"/>
+              <w:bottom w:color="808080" w:space="0" w:sz="7" w:val="single"/>
+              <w:right w:color="808080" w:space="0" w:sz="7" w:val="single"/>
+            </w:tcBorders>
+            <w:tcMar>
+              <w:top w:w="56.69291338582678" w:type="dxa"/>
+              <w:left w:w="56.69291338582678" w:type="dxa"/>
+              <w:bottom w:w="56.69291338582678" w:type="dxa"/>
+              <w:right w:w="56.69291338582678" w:type="dxa"/>
+            </w:tcMar>
+            <w:vAlign w:val="center"/>
+          </w:tcPr>
+          <w:p>
+            <w:pPr>
+              <w:pStyle w:val="Heading3"/>
+              <w:keepNext w:val="0"/>
+              <w:keepLines w:val="0"/>
+              <w:spacing w:after="0" w:before="0" w:line="240" w:lineRule="auto"/>
+              <w:jc w:val="center"/>
+              <w:rPr>
+                <w:rFonts w:ascii="Malgun Gothic" w:cs="Malgun Gothic" w:eastAsia="Malgun Gothic" w:hAnsi="Malgun Gothic"/>
+                <w:color w:val="0000ff"/>
+                <w:sz w:val="22"/>
+                <w:szCs w:val="22"/>
+              </w:rPr>
+            </w:pPr>
+            <w:bookmarkStart w:colFirst="0" w:colLast="0" w:name="_d6fu8zjuee0s" w:id="1"/>
+            <w:bookmarkEnd w:id="1"/>
+            <w:r>
+              <w:rPr>
+                <w:rFonts w:ascii="Malgun Gothic" w:cs="Malgun Gothic" w:eastAsia="Malgun Gothic" w:hAnsi="Malgun Gothic"/>
+                <w:color w:val="0000ff"/>
+                <w:sz w:val="22"/>
+                <w:szCs w:val="22"/>
+                <w:rtl w:val="0"/>
+              </w:rPr>
+              <w:t xml:space="preserve">7/10</w:t>
+            </w:r>
+          </w:p>
+        </w:tc>
+      </w:tr>
+    </w:tbl>
+    <w:p>
+      <w:pPr>
         <w:numPr>
           <w:ilvl w:val="0"/>
           <w:numId w:val="6"/>
@@ -24430,7 +25781,7 @@
           <w:rFonts w:ascii="Consolas" w:hAnsi="Consolas"/>
           <w:sz w:val="17"/>
         </w:rPr>
-        <w:t xml:space="preserve">   travel_cancellation    4   26   26</w:t>
+        <w:t xml:space="preserve">   travel_cancellation    4   28   28</w:t>
       </w:r>
     </w:p>
     <w:p>

</xml_diff>

<commit_message>
docs(activity): add stored-vector example and similarity comparison to vectordb report
Co-Authored-By: Claude Sonnet 5.5 <noreply@anthropic.com>
</commit_message>
<xml_diff>
--- a/docs/activity/산출물/벡터DB_GraphDB_구축결과서_활동에이전트_2026-10-14.docx
+++ b/docs/activity/산출물/벡터DB_GraphDB_구축결과서_활동에이전트_2026-10-14.docx
@@ -8076,6 +8076,103 @@
           <w:rtl w:val="0"/>
         </w:rPr>
         <w:t xml:space="preserve">본문: 정기 휴관일은 각 시설이 정해 공지하는 사실이며 우리가 해석할 여지가 없다. 월요일 휴관처럼 널리 알려진 규칙이라도 시설마다 예외가 있어 기억으로 답하지 않고 그 시설의 공지를 확인한다. 공휴일이 월요일과 겹치면 그날 열고 다음 날 쉬는 곳이 많아 달력만으로 판정하면 틀린다. 공지를 확인하지 못하면 휴관 여부를 단정하지 않고 확인되지 않았다고 말한다. 고객이 헛걸음하게 되는 안내가 이 갈래에서 가장 흔한 실패다. 휴관 정보는 일정이 잡힌 날짜 기준으로 보며 오늘…</w:t>
+      </w:r>
+    </w:p>
+    <w:p>
+      <w:pPr>
+        <w:spacing w:after="240" w:before="240" w:lineRule="auto"/>
+        <w:ind w:left="720" w:firstLine="0"/>
+        <w:rPr>
+          <w:rFonts w:ascii="Malgun Gothic" w:cs="Malgun Gothic" w:eastAsia="Malgun Gothic" w:hAnsi="Malgun Gothic"/>
+          <w:b w:val="0"/>
+          <w:bCs w:val="0"/>
+        </w:rPr>
+      </w:pPr>
+      <w:r>
+        <w:rPr>
+          <w:rFonts w:ascii="Malgun Gothic" w:cs="Malgun Gothic" w:eastAsia="Malgun Gothic" w:hAnsi="Malgun Gothic"/>
+          <w:color w:val="0000ff"/>
+          <w:rtl w:val="0"/>
+        </w:rPr>
+        <w:t xml:space="preserve">저장된 벡터(위 청크): 1,536차원 · 크기 1.0000(정규화) · 최소 -0.0923 · 최대 +0.0945 · 평균 -0.00041</w:t>
+      </w:r>
+    </w:p>
+    <w:p>
+      <w:pPr>
+        <w:spacing w:after="240" w:before="240" w:lineRule="auto"/>
+        <w:ind w:left="720" w:firstLine="0"/>
+        <w:rPr>
+          <w:rFonts w:ascii="Malgun Gothic" w:cs="Malgun Gothic" w:eastAsia="Malgun Gothic" w:hAnsi="Malgun Gothic"/>
+          <w:b w:val="0"/>
+          <w:bCs w:val="0"/>
+        </w:rPr>
+      </w:pPr>
+      <w:r>
+        <w:rPr>
+          <w:color w:val="0000ff"/>
+          <w:rtl w:val="0"/>
+          <w:rFonts w:ascii="Consolas" w:hAnsi="Consolas"/>
+          <w:sz w:val="17"/>
+        </w:rPr>
+        <w:t xml:space="preserve">앞 12개: +0.0068 +0.0473 -0.0114 +0.0124 -0.0069 -0.0210 -0.0022 -0.0370 -0.0194 +0.0248 +0.0132 +0.0246</w:t>
+      </w:r>
+    </w:p>
+    <w:p>
+      <w:pPr>
+        <w:spacing w:after="240" w:before="240" w:lineRule="auto"/>
+        <w:ind w:left="720" w:firstLine="0"/>
+        <w:rPr>
+          <w:rFonts w:ascii="Malgun Gothic" w:cs="Malgun Gothic" w:eastAsia="Malgun Gothic" w:hAnsi="Malgun Gothic"/>
+          <w:b w:val="0"/>
+          <w:bCs w:val="0"/>
+        </w:rPr>
+      </w:pPr>
+      <w:r>
+        <w:rPr>
+          <w:color w:val="0000ff"/>
+          <w:rtl w:val="0"/>
+          <w:rFonts w:ascii="Consolas" w:hAnsi="Consolas"/>
+          <w:sz w:val="17"/>
+        </w:rPr>
+        <w:t xml:space="preserve">뒤  4개: -0.0213 +0.0126 -0.0067 +0.0308</w:t>
+      </w:r>
+    </w:p>
+    <w:p>
+      <w:pPr>
+        <w:spacing w:after="240" w:before="240" w:lineRule="auto"/>
+        <w:ind w:left="720" w:firstLine="0"/>
+        <w:rPr>
+          <w:rFonts w:ascii="Malgun Gothic" w:cs="Malgun Gothic" w:eastAsia="Malgun Gothic" w:hAnsi="Malgun Gothic"/>
+          <w:b w:val="0"/>
+          <w:bCs w:val="0"/>
+        </w:rPr>
+      </w:pPr>
+      <w:r>
+        <w:rPr>
+          <w:rFonts w:ascii="Malgun Gothic" w:cs="Malgun Gothic" w:eastAsia="Malgun Gothic" w:hAnsi="Malgun Gothic"/>
+          <w:color w:val="0000ff"/>
+          <w:rtl w:val="0"/>
+        </w:rPr>
+        <w:t xml:space="preserve">숫자 하나하나에는 사람이 읽을 의미가 없고, 전체가 이 글의 의미 좌표를 이룬다. 검색은 질문 벡터와 청크 벡터 사이의 코사인 유사도로 한다. 청크의 원문 텍스트는 같은 행(content)에 함께 저장되어 있다.</w:t>
+      </w:r>
+    </w:p>
+    <w:p>
+      <w:pPr>
+        <w:spacing w:after="240" w:before="240" w:lineRule="auto"/>
+        <w:ind w:left="720" w:firstLine="0"/>
+        <w:rPr>
+          <w:rFonts w:ascii="Malgun Gothic" w:cs="Malgun Gothic" w:eastAsia="Malgun Gothic" w:hAnsi="Malgun Gothic"/>
+          <w:b w:val="0"/>
+          <w:bCs w:val="0"/>
+        </w:rPr>
+      </w:pPr>
+      <w:r>
+        <w:rPr>
+          <w:rFonts w:ascii="Malgun Gothic" w:cs="Malgun Gothic" w:eastAsia="Malgun Gothic" w:hAnsi="Malgun Gothic"/>
+          <w:color w:val="0000ff"/>
+          <w:rtl w:val="0"/>
+        </w:rPr>
+        <w:t xml:space="preserve">의미 거리 예시(코사인 유사도): 개인 사유(가족 사망·질병) ↔ 공통 사유(천재지변·정부 명령) 0.677, 개인 사유(가족 사망·질병) ↔ 공연 관객 환급(다른 주제) 0.401. 같은 주제 안의 절이 더 가깝게 나온다.</w:t>
       </w:r>
     </w:p>
     <w:p>

</xml_diff>

<commit_message>
docs(activity): align vectordb report with merged test report (two embedding paths, evaluation criteria, M-4)
Co-Authored-By: Claude Sonnet 5.5 <noreply@anthropic.com>
</commit_message>
<xml_diff>
--- a/docs/activity/산출물/벡터DB_GraphDB_구축결과서_활동에이전트_2026-10-14.docx
+++ b/docs/activity/산출물/벡터DB_GraphDB_구축결과서_활동에이전트_2026-10-14.docx
@@ -2370,7 +2370,7 @@
                 <w:szCs w:val="22"/>
                 <w:rtl w:val="0"/>
               </w:rPr>
-              <w:t xml:space="preserve">OpenAI text-embedding-3-small</w:t>
+              <w:t xml:space="preserve">두 경로 — openai: text-embedding-3-small(작성자 로컬 실험·공식 자료 적재) / ollama: bge-m3(팀 표준, 팀 RAG 통합 시험 17건)</w:t>
             </w:r>
           </w:p>
         </w:tc>
@@ -2414,7 +2414,7 @@
                 <w:szCs w:val="22"/>
                 <w:rtl w:val="0"/>
               </w:rPr>
-              <w:t xml:space="preserve">한국어 짧은 규정 문장 검색에 충분하고 비용이 가장 낮음(약 $0.02/100만 토큰). 컬럼 vector(1536)·HNSW 인덱스와 정합</w:t>
+              <w:t xml:space="preserve">제공자는 설정(ACOP_EMBEDDING_PROVIDER)이 고르고 두 경로의 벡터는 공존한다. 이 결과서의 적재·검색 실험은 openai 경로이고, openai 경로는 한국어 짧은 규정 문장 검색에 충분하고 비용이 낮다(약 $0.02/100만 토큰). 컬럼 vector(1536)·HNSW 인덱스와 정합</w:t>
             </w:r>
           </w:p>
         </w:tc>
@@ -2509,7 +2509,7 @@
                 <w:szCs w:val="22"/>
                 <w:rtl w:val="0"/>
               </w:rPr>
-              <w:t xml:space="preserve">1,536 (보조 칸 embedding_1024: bge-m3 병행 지원, 이번 구성에서는 미사용)</w:t>
+              <w:t xml:space="preserve">1,536(openai 경로, embedding 칸) / 1,024(ollama 경로, embedding_1024 칸)</w:t>
             </w:r>
           </w:p>
         </w:tc>
@@ -4068,7 +4068,7 @@
                 <w:szCs w:val="22"/>
                 <w:rtl w:val="0"/>
               </w:rPr>
-              <w:t xml:space="preserve">정답 절이 상위 3 안에 있는 질문 비율(Hit@3)</w:t>
+              <w:t xml:space="preserve">정답 절이 상위 3 안에 있는 질문 비율(Hit@3) — 팀 통합 시험(정답 문서가 상위 8 안)과 기준이 다름</w:t>
             </w:r>
           </w:p>
         </w:tc>
@@ -7995,6 +7995,44 @@
           <w:rtl w:val="0"/>
         </w:rPr>
         <w:t xml:space="preserve">총 19개 문서를 154개 청크로 적재했고 모든 청크에 1,536차원 벡터가 채워진 것을 확인했다(154/154). 활동 에이전트가 사용하는 범위는 4개 scope 14문서·102청크이다. 이 중 3문서·20청크는 공정거래위원회 국내여행 표준약관(제10020호)과 소비자분쟁해결기준(고시 제2025-14호)을 판단 단위로 풀어 쓴 것이며(knowledge/travel_ext/), 원문과 대조해 문장 6곳을 고친 뒤 재적재했다. 장소별·업체별 약관은 담지 않았다. 그래프 DB 는 구축하지 않았다. 측정: 2026-10-13~14, 로컬 개발 DB(PostgreSQL + pgvector, Docker), OpenAI 임베딩 호출 기본 코퍼스 3회(입력 43,287 토큰) + 공식 자료 적재 2회(재적재 포함, 각 약 5,000 토큰).</w:t>
+      </w:r>
+    </w:p>
+    <w:p>
+      <w:pPr>
+        <w:spacing w:after="240" w:before="240" w:lineRule="auto"/>
+        <w:ind w:left="720" w:firstLine="0"/>
+        <w:rPr>
+          <w:rFonts w:ascii="Malgun Gothic" w:cs="Malgun Gothic" w:eastAsia="Malgun Gothic" w:hAnsi="Malgun Gothic"/>
+          <w:b w:val="0"/>
+          <w:bCs w:val="0"/>
+        </w:rPr>
+      </w:pPr>
+      <w:r>
+        <w:rPr>
+          <w:rFonts w:ascii="Malgun Gothic" w:cs="Malgun Gothic" w:eastAsia="Malgun Gothic" w:hAnsi="Malgun Gothic"/>
+          <w:color w:val="0000ff"/>
+          <w:rtl w:val="0"/>
+        </w:rPr>
+        <w:t xml:space="preserve">임베딩 제공자: 이 결과서의 적재·검색 실험은 openai 경로(text-embedding-3-small, 1536차원)로 했다. 팀 표준 경로(ollama bge-m3, 1024차원)에서는 공식 자료 3문서·20청크가 embedding_1024 칸에 적재되기 전까지 검색되지 않을 수 있어, 팀 DB에 코어 적재 방식으로 적재한 뒤 재측정이 필요하다(테스트 보고서 5.2 M-4).</w:t>
+      </w:r>
+    </w:p>
+    <w:p>
+      <w:pPr>
+        <w:spacing w:after="240" w:before="240" w:lineRule="auto"/>
+        <w:ind w:left="720" w:firstLine="0"/>
+        <w:rPr>
+          <w:rFonts w:ascii="Malgun Gothic" w:cs="Malgun Gothic" w:eastAsia="Malgun Gothic" w:hAnsi="Malgun Gothic"/>
+          <w:b w:val="0"/>
+          <w:bCs w:val="0"/>
+        </w:rPr>
+      </w:pPr>
+      <w:r>
+        <w:rPr>
+          <w:rFonts w:ascii="Malgun Gothic" w:cs="Malgun Gothic" w:eastAsia="Malgun Gothic" w:hAnsi="Malgun Gothic"/>
+          <w:color w:val="0000ff"/>
+          <w:rtl w:val="0"/>
+        </w:rPr>
+        <w:t xml:space="preserve">평가 기준: 아래 검색 정확도는 정답 절이 상위 3개 안에 드는지로 판정했다. 팀 RAG 통합 시험(tests/integration/rag, 정답 문서가 상위 8개 안, 17/17 통과)은 더 느슨한 기준이라 두 수치를 직접 비교하지 않는다. 시험 항목 상세는 멀티 에이전트 테스트 보고서 2.2를 따른다.</w:t>
       </w:r>
     </w:p>
     <w:p>

</xml_diff>